<commit_message>
Comparativo Comités 2024 vs 2026: incisos emparejados por letra (a con a, b con b)
Co-Authored-By: Claude Opus 5.5 <noreply@anthropic.com>
Claude-Session: https://claude.ai/code/session_01TjsTNehkj163qWYSaVVmAn
</commit_message>
<xml_diff>
--- a/Comparativo_Comites_2024_vs_2026.docx
+++ b/Comparativo_Comites_2024_vs_2026.docx
@@ -6230,27 +6230,28 @@
                 <w:tab w:val="left" w:pos="-2880"/>
               </w:tabs>
               <w:spacing w:line="276" w:lineRule="auto"/>
-              <w:jc w:val="both"/>
-              <w:rPr>
-                <w:rFonts w:eastAsia="Arial" w:cs="Arial"/>
-                <w:b w:val="0"/>
-                <w:i w:val="0"/>
-                <w:color w:val="000000" w:themeColor="text1"/>
-                <w:sz w:val="24"/>
-                <w:szCs w:val="24"/>
-              </w:rPr>
-            </w:pPr>
-            <w:r>
-              <w:rPr>
-                <w:rFonts w:eastAsia="Arial" w:cs="Arial"/>
-                <w:b w:val="0"/>
-                <w:i w:val="0"/>
-                <w:color w:val="000000" w:themeColor="text1"/>
-                <w:sz w:val="24"/>
-                <w:szCs w:val="24"/>
-                <w:u w:val="none"/>
-              </w:rPr>
-              <w:t xml:space="preserve">El Comité se reunirá ordinariamente una vez por semana, a fin de resolver las solicitudes de créditos y </w:t>
+              <w:ind w:left="360" w:hanging="360"/>
+              <w:jc w:val="both"/>
+              <w:rPr>
+                <w:rFonts w:eastAsia="Arial" w:cs="Arial"/>
+                <w:b w:val="0"/>
+                <w:i w:val="0"/>
+                <w:color w:val="000000" w:themeColor="text1"/>
+                <w:sz w:val="24"/>
+                <w:szCs w:val="24"/>
+              </w:rPr>
+            </w:pPr>
+            <w:r>
+              <w:rPr>
+                <w:rFonts w:eastAsia="Arial" w:cs="Arial"/>
+                <w:b w:val="0"/>
+                <w:i w:val="0"/>
+                <w:color w:val="000000" w:themeColor="text1"/>
+                <w:sz w:val="24"/>
+                <w:szCs w:val="24"/>
+                <w:u w:val="none"/>
+              </w:rPr>
+              <w:t xml:space="preserve">a) El Comité se reunirá ordinariamente una vez por semana, a fin de resolver las solicitudes de créditos y </w:t>
             </w:r>
             <w:r>
               <w:rPr>
@@ -8304,6 +8305,7 @@
           <w:p>
             <w:pPr>
               <w:spacing w:line="276" w:lineRule="auto"/>
+              <w:ind w:left="360" w:hanging="360"/>
               <w:jc w:val="both"/>
               <w:rPr>
                 <w:rFonts w:ascii="Arial" w:eastAsia="Arial" w:hAnsi="Arial" w:cs="Arial"/>
@@ -8312,6 +8314,16 @@
                 <w:szCs w:val="24"/>
               </w:rPr>
             </w:pPr>
+            <w:r>
+              <w:rPr>
+                <w:rFonts w:ascii="Arial" w:eastAsia="Arial" w:hAnsi="Arial" w:cs="Arial"/>
+                <w:color w:val="000000" w:themeColor="text1"/>
+                <w:sz w:val="24"/>
+                <w:szCs w:val="24"/>
+                <w:u w:val="none"/>
+              </w:rPr>
+              <w:t xml:space="preserve">a) </w:t>
+            </w:r>
             <w:r>
               <w:rPr>
                 <w:rFonts w:ascii="Arial" w:eastAsia="Arial" w:hAnsi="Arial" w:cs="Arial"/>
@@ -8324,6 +8336,20 @@
               <w:t xml:space="preserve">Las sesiones del Comité de Educación son de dos clases: Ordinarias y Extraordinarias. Las ordinarias se celebran una vez por semana, el día, hora y lugar que se establezca de común acuerdo por los integrantes. Su duración dependerá de la agenda propuesta por el Secretario.</w:t>
             </w:r>
           </w:p>
+        </w:tc>
+        <w:tc>
+          <w:tcPr>
+            <w:tcW w:w="4817" w:type="dxa"/>
+          </w:tcPr>
+          <w:p/>
+        </w:tc>
+      </w:tr>
+      <w:tr>
+        <w:tc>
+          <w:tcPr>
+            <w:tcW w:w="4817" w:type="dxa"/>
+          </w:tcPr>
+          <w:p/>
         </w:tc>
         <w:tc>
           <w:tcPr>
@@ -9636,7 +9662,47 @@
           <w:tcPr>
             <w:tcW w:w="4817" w:type="dxa"/>
           </w:tcPr>
-          <w:p/>
+          <w:p>
+            <w:pPr>
+              <w:pStyle w:val="Prrafodelista"/>
+              <w:autoSpaceDE w:val="0"/>
+              <w:autoSpaceDN w:val="0"/>
+              <w:adjustRightInd w:val="0"/>
+              <w:spacing w:line="276" w:lineRule="auto"/>
+              <w:ind w:left="360" w:hanging="360"/>
+              <w:jc w:val="both"/>
+              <w:rPr>
+                <w:rFonts w:ascii="Arial" w:hAnsi="Arial" w:cs="Arial"/>
+                <w:color w:val="000000" w:themeColor="text1"/>
+                <w:sz w:val="24"/>
+                <w:szCs w:val="24"/>
+                <w:lang w:val="es-SV" w:eastAsia="es-SV"/>
+              </w:rPr>
+            </w:pPr>
+            <w:r>
+              <w:rPr>
+                <w:rFonts w:ascii="Arial" w:hAnsi="Arial" w:cs="Arial"/>
+                <w:color w:val="000000" w:themeColor="text1"/>
+                <w:sz w:val="24"/>
+                <w:szCs w:val="24"/>
+                <w:u w:val="none"/>
+                <w:lang w:val="es-SV" w:eastAsia="es-SV"/>
+              </w:rPr>
+              <w:t xml:space="preserve">c) </w:t>
+            </w:r>
+            <w:r>
+              <w:rPr>
+                <w:rFonts w:ascii="Arial" w:hAnsi="Arial" w:cs="Arial"/>
+                <w:strike/>
+                <w:color w:val="000000" w:themeColor="text1"/>
+                <w:sz w:val="24"/>
+                <w:szCs w:val="24"/>
+                <w:u w:val="none"/>
+                <w:lang w:val="es-SV" w:eastAsia="es-SV"/>
+              </w:rPr>
+              <w:t xml:space="preserve">Aprobar los casos que se trasladarán al cobro extrajudicial</w:t>
+            </w:r>
+          </w:p>
         </w:tc>
         <w:tc>
           <w:tcPr>
@@ -9718,7 +9784,7 @@
                 <w:u w:val="none"/>
                 <w:lang w:val="es-SV" w:eastAsia="es-SV"/>
               </w:rPr>
-              <w:t xml:space="preserve">c) Aprobar los casos que se trasladarán al cobro </w:t>
+              <w:t xml:space="preserve">d) Dar seguimiento a los casos que </w:t>
             </w:r>
             <w:r>
               <w:rPr>
@@ -9730,7 +9796,7 @@
                 <w:u w:val="none"/>
                 <w:lang w:val="es-SV" w:eastAsia="es-SV"/>
               </w:rPr>
-              <w:t xml:space="preserve">extrajudicial</w:t>
+              <w:t xml:space="preserve">han sido aprobados para ser trasladados a recuperación extrajudicial.</w:t>
             </w:r>
           </w:p>
         </w:tc>
@@ -9766,7 +9832,7 @@
                 <w:szCs w:val="24"/>
                 <w:u w:val="none"/>
               </w:rPr>
-              <w:t xml:space="preserve">d) Aprobar </w:t>
+              <w:t xml:space="preserve">d) </w:t>
             </w:r>
             <w:r>
               <w:rPr>
@@ -9778,19 +9844,19 @@
                 <w:szCs w:val="24"/>
                 <w:u w:val="single"/>
               </w:rPr>
-              <w:t xml:space="preserve">y dar seguimiento a</w:t>
-            </w:r>
-            <w:r>
-              <w:rPr>
-                <w:rFonts w:eastAsia="Arial" w:cs="Arial"/>
-                <w:b w:val="0"/>
-                <w:i w:val="0"/>
-                <w:color w:val="000000" w:themeColor="text1"/>
-                <w:sz w:val="24"/>
-                <w:szCs w:val="24"/>
-                <w:u w:val="none"/>
-              </w:rPr>
-              <w:t xml:space="preserve"> los casos que se trasladarán al cobro </w:t>
+              <w:t xml:space="preserve">Aprobar y</w:t>
+            </w:r>
+            <w:r>
+              <w:rPr>
+                <w:rFonts w:eastAsia="Arial" w:cs="Arial"/>
+                <w:b w:val="0"/>
+                <w:i w:val="0"/>
+                <w:color w:val="000000" w:themeColor="text1"/>
+                <w:sz w:val="24"/>
+                <w:szCs w:val="24"/>
+                <w:u w:val="none"/>
+              </w:rPr>
+              <w:t xml:space="preserve"> dar seguimiento a los casos que </w:t>
             </w:r>
             <w:r>
               <w:rPr>
@@ -9802,7 +9868,7 @@
                 <w:szCs w:val="24"/>
                 <w:u w:val="single"/>
               </w:rPr>
-              <w:t xml:space="preserve">prejudicial.</w:t>
+              <w:t xml:space="preserve">se trasladarán al cobro prejudicial.</w:t>
             </w:r>
           </w:p>
         </w:tc>
@@ -9823,7 +9889,7 @@
               <w:jc w:val="both"/>
               <w:rPr>
                 <w:rFonts w:ascii="Arial" w:hAnsi="Arial" w:cs="Arial"/>
-                <w:color w:val="000000" w:themeColor="text1"/>
+                <w:color w:val="FF0000"/>
                 <w:sz w:val="24"/>
                 <w:szCs w:val="24"/>
                 <w:lang w:val="es-SV" w:eastAsia="es-SV"/>
@@ -9832,13 +9898,44 @@
             <w:r>
               <w:rPr>
                 <w:rFonts w:ascii="Arial" w:hAnsi="Arial" w:cs="Arial"/>
-                <w:color w:val="000000" w:themeColor="text1"/>
                 <w:sz w:val="24"/>
                 <w:szCs w:val="24"/>
                 <w:u w:val="none"/>
                 <w:lang w:val="es-SV" w:eastAsia="es-SV"/>
               </w:rPr>
-              <w:t xml:space="preserve">d) Dar seguimiento a los casos que han sido aprobados para ser trasladados a recuperación extrajudicial.</w:t>
+              <w:t xml:space="preserve">e) </w:t>
+            </w:r>
+            <w:r>
+              <w:rPr>
+                <w:rFonts w:ascii="Arial" w:hAnsi="Arial" w:cs="Arial"/>
+                <w:strike/>
+                <w:sz w:val="24"/>
+                <w:szCs w:val="24"/>
+                <w:u w:val="none"/>
+                <w:lang w:val="es-SV" w:eastAsia="es-SV"/>
+              </w:rPr>
+              <w:t xml:space="preserve">Aprobar</w:t>
+            </w:r>
+            <w:r>
+              <w:rPr>
+                <w:rFonts w:ascii="Arial" w:hAnsi="Arial" w:cs="Arial"/>
+                <w:sz w:val="24"/>
+                <w:szCs w:val="24"/>
+                <w:u w:val="none"/>
+                <w:lang w:val="es-SV" w:eastAsia="es-SV"/>
+              </w:rPr>
+              <w:t xml:space="preserve"> los casos que </w:t>
+            </w:r>
+            <w:r>
+              <w:rPr>
+                <w:rFonts w:ascii="Arial" w:hAnsi="Arial" w:cs="Arial"/>
+                <w:strike/>
+                <w:sz w:val="24"/>
+                <w:szCs w:val="24"/>
+                <w:u w:val="none"/>
+                <w:lang w:val="es-SV" w:eastAsia="es-SV"/>
+              </w:rPr>
+              <w:t xml:space="preserve">se trasladarán al cobro por la vía judicial</w:t>
             </w:r>
           </w:p>
         </w:tc>
@@ -9872,7 +9969,40 @@
                 <w:u w:val="none"/>
                 <w:lang w:val="es-SV" w:eastAsia="es-SV"/>
               </w:rPr>
-              <w:t xml:space="preserve">e) Dar seguimiento a los casos que han sido aprobados para ser trasladados a recuperación extrajudicial.</w:t>
+              <w:t xml:space="preserve">e) </w:t>
+            </w:r>
+            <w:r>
+              <w:rPr>
+                <w:rFonts w:ascii="Arial" w:hAnsi="Arial" w:cs="Arial"/>
+                <w:color w:val="000000" w:themeColor="text1"/>
+                <w:sz w:val="24"/>
+                <w:szCs w:val="24"/>
+                <w:u w:val="single"/>
+                <w:lang w:val="es-SV" w:eastAsia="es-SV"/>
+              </w:rPr>
+              <w:t xml:space="preserve">Dar seguimiento a</w:t>
+            </w:r>
+            <w:r>
+              <w:rPr>
+                <w:rFonts w:ascii="Arial" w:hAnsi="Arial" w:cs="Arial"/>
+                <w:color w:val="000000" w:themeColor="text1"/>
+                <w:sz w:val="24"/>
+                <w:szCs w:val="24"/>
+                <w:u w:val="none"/>
+                <w:lang w:val="es-SV" w:eastAsia="es-SV"/>
+              </w:rPr>
+              <w:t xml:space="preserve"> los casos que </w:t>
+            </w:r>
+            <w:r>
+              <w:rPr>
+                <w:rFonts w:ascii="Arial" w:hAnsi="Arial" w:cs="Arial"/>
+                <w:color w:val="000000" w:themeColor="text1"/>
+                <w:sz w:val="24"/>
+                <w:szCs w:val="24"/>
+                <w:u w:val="single"/>
+                <w:lang w:val="es-SV" w:eastAsia="es-SV"/>
+              </w:rPr>
+              <w:t xml:space="preserve">han sido aprobados para ser trasladados a recuperación extrajudicial.</w:t>
             </w:r>
           </w:p>
         </w:tc>
@@ -9893,7 +10023,7 @@
               <w:jc w:val="both"/>
               <w:rPr>
                 <w:rFonts w:ascii="Arial" w:hAnsi="Arial" w:cs="Arial"/>
-                <w:color w:val="FF0000"/>
+                <w:color w:val="000000" w:themeColor="text1"/>
                 <w:sz w:val="24"/>
                 <w:szCs w:val="24"/>
                 <w:lang w:val="es-SV" w:eastAsia="es-SV"/>
@@ -9902,33 +10032,25 @@
             <w:r>
               <w:rPr>
                 <w:rFonts w:ascii="Arial" w:hAnsi="Arial" w:cs="Arial"/>
+                <w:color w:val="000000" w:themeColor="text1"/>
                 <w:sz w:val="24"/>
                 <w:szCs w:val="24"/>
                 <w:u w:val="none"/>
                 <w:lang w:val="es-SV" w:eastAsia="es-SV"/>
               </w:rPr>
-              <w:t xml:space="preserve">e) Aprobar los casos que se trasladarán al cobro </w:t>
+              <w:t xml:space="preserve">f) </w:t>
             </w:r>
             <w:r>
               <w:rPr>
                 <w:rFonts w:ascii="Arial" w:hAnsi="Arial" w:cs="Arial"/>
                 <w:strike/>
+                <w:color w:val="000000" w:themeColor="text1"/>
                 <w:sz w:val="24"/>
                 <w:szCs w:val="24"/>
                 <w:u w:val="none"/>
                 <w:lang w:val="es-SV" w:eastAsia="es-SV"/>
               </w:rPr>
-              <w:t xml:space="preserve">por</w:t>
-            </w:r>
-            <w:r>
-              <w:rPr>
-                <w:rFonts w:ascii="Arial" w:hAnsi="Arial" w:cs="Arial"/>
-                <w:sz w:val="24"/>
-                <w:szCs w:val="24"/>
-                <w:u w:val="none"/>
-                <w:lang w:val="es-SV" w:eastAsia="es-SV"/>
-              </w:rPr>
-              <w:t xml:space="preserve"> la vía judicial</w:t>
+              <w:t xml:space="preserve">Dar seguimiento mensual a los casos que han sido aprobados para ser trasladados a recuperación por la vía judicial en los últimos 30 días.</w:t>
             </w:r>
           </w:p>
         </w:tc>
@@ -9964,7 +10086,7 @@
                 <w:szCs w:val="24"/>
                 <w:u w:val="none"/>
               </w:rPr>
-              <w:t xml:space="preserve">e) Aprobar </w:t>
+              <w:t xml:space="preserve">f) </w:t>
             </w:r>
             <w:r>
               <w:rPr>
@@ -9976,55 +10098,7 @@
                 <w:szCs w:val="24"/>
                 <w:u w:val="single"/>
               </w:rPr>
-              <w:t xml:space="preserve">y dar seguimiento a</w:t>
-            </w:r>
-            <w:r>
-              <w:rPr>
-                <w:rFonts w:eastAsia="Arial" w:cs="Arial"/>
-                <w:b w:val="0"/>
-                <w:i w:val="0"/>
-                <w:color w:val="000000" w:themeColor="text1"/>
-                <w:sz w:val="24"/>
-                <w:szCs w:val="24"/>
-                <w:u w:val="none"/>
-              </w:rPr>
-              <w:t xml:space="preserve"> los casos que se trasladarán al cobro </w:t>
-            </w:r>
-            <w:r>
-              <w:rPr>
-                <w:rFonts w:eastAsia="Arial" w:cs="Arial"/>
-                <w:b w:val="0"/>
-                <w:i w:val="0"/>
-                <w:color w:val="000000" w:themeColor="text1"/>
-                <w:sz w:val="24"/>
-                <w:szCs w:val="24"/>
-                <w:u w:val="single"/>
-              </w:rPr>
-              <w:t xml:space="preserve">prejudicial, notificando por escrito al Consejo de Administración para su ratificación Una vez ratificado el traslado a</w:t>
-            </w:r>
-            <w:r>
-              <w:rPr>
-                <w:rFonts w:eastAsia="Arial" w:cs="Arial"/>
-                <w:b w:val="0"/>
-                <w:i w:val="0"/>
-                <w:color w:val="000000" w:themeColor="text1"/>
-                <w:sz w:val="24"/>
-                <w:szCs w:val="24"/>
-                <w:u w:val="none"/>
-              </w:rPr>
-              <w:t xml:space="preserve"> la vía judicial, </w:t>
-            </w:r>
-            <w:r>
-              <w:rPr>
-                <w:rFonts w:eastAsia="Arial" w:cs="Arial"/>
-                <w:b w:val="0"/>
-                <w:i w:val="0"/>
-                <w:color w:val="000000" w:themeColor="text1"/>
-                <w:sz w:val="24"/>
-                <w:szCs w:val="24"/>
-                <w:u w:val="single"/>
-              </w:rPr>
-              <w:t xml:space="preserve">dará seguimiento a los casos aprobados. Si se logra un arreglo de pago antes de que fuere asignado a un apoderado judicial, el Comité deberá notificar por escrito al Consejo de Administración, solicitando revocar el acuerdo de traslado.</w:t>
+              <w:t xml:space="preserve">Llevar un Libro de Actas de las sesiones ordinarias y extraordinarias. Levantar un acta por cada sesión, la cual se leerá y ratificará en la próxima reunión para hacer los asientos respectivos. El Libro se deberá mantener debidamente actualizado.</w:t>
             </w:r>
           </w:p>
         </w:tc>
@@ -10060,7 +10134,7 @@
                 <w:u w:val="none"/>
                 <w:lang w:val="es-SV" w:eastAsia="es-SV"/>
               </w:rPr>
-              <w:t xml:space="preserve">f) </w:t>
+              <w:t xml:space="preserve">g) </w:t>
             </w:r>
             <w:r>
               <w:rPr>
@@ -10072,15 +10146,57 @@
                 <w:u w:val="none"/>
                 <w:lang w:val="es-SV" w:eastAsia="es-SV"/>
               </w:rPr>
-              <w:t xml:space="preserve">Dar seguimiento mensual a los casos que han sido aprobados para ser trasladados a recuperación por la vía judicial en los últimos 30 días.</w:t>
-            </w:r>
-          </w:p>
-        </w:tc>
-        <w:tc>
-          <w:tcPr>
-            <w:tcW w:w="4817" w:type="dxa"/>
-          </w:tcPr>
-          <w:p/>
+              <w:t xml:space="preserve">Revisar trimestralmente los avances de los casos de la cartera judicial.</w:t>
+            </w:r>
+          </w:p>
+        </w:tc>
+        <w:tc>
+          <w:tcPr>
+            <w:tcW w:w="4817" w:type="dxa"/>
+          </w:tcPr>
+          <w:p>
+            <w:pPr>
+              <w:pStyle w:val="Textoindependiente2"/>
+              <w:tabs>
+                <w:tab w:val="left" w:pos="-2880"/>
+              </w:tabs>
+              <w:spacing w:after="120" w:line="276" w:lineRule="auto"/>
+              <w:ind w:left="360" w:hanging="360"/>
+              <w:jc w:val="both"/>
+              <w:rPr>
+                <w:rFonts w:eastAsia="Arial" w:cs="Arial"/>
+                <w:b w:val="0"/>
+                <w:i w:val="0"/>
+                <w:color w:val="000000" w:themeColor="text1"/>
+                <w:sz w:val="24"/>
+                <w:szCs w:val="24"/>
+              </w:rPr>
+            </w:pPr>
+            <w:r>
+              <w:rPr>
+                <w:rFonts w:eastAsia="Arial" w:cs="Arial"/>
+                <w:b w:val="0"/>
+                <w:i w:val="0"/>
+                <w:color w:val="000000" w:themeColor="text1"/>
+                <w:sz w:val="24"/>
+                <w:szCs w:val="24"/>
+                <w:u w:val="none"/>
+              </w:rPr>
+              <w:t xml:space="preserve">g) </w:t>
+            </w:r>
+            <w:r>
+              <w:rPr>
+                <w:rFonts w:eastAsia="Arial" w:cs="Arial"/>
+                <w:b w:val="0"/>
+                <w:i w:val="0"/>
+                <w:color w:val="000000" w:themeColor="text1"/>
+                <w:sz w:val="24"/>
+                <w:szCs w:val="24"/>
+                <w:u w:val="single"/>
+              </w:rPr>
+              <w:t xml:space="preserve">Presentar al Consejo de Administración un informe mensual de sus actividades y, asimismo presentar un informe anual de labores al Consejo de Administración para que a su vez sea presentado a la Asamblea General de Asociados. De este Informe enviará copia a la Junta de Vigilancia.</w:t>
+            </w:r>
+          </w:p>
         </w:tc>
       </w:tr>
       <w:tr>
@@ -10114,7 +10230,7 @@
                 <w:u w:val="none"/>
                 <w:lang w:val="es-SV" w:eastAsia="es-SV"/>
               </w:rPr>
-              <w:t xml:space="preserve">g) </w:t>
+              <w:t xml:space="preserve">h) </w:t>
             </w:r>
             <w:r>
               <w:rPr>
@@ -10126,15 +10242,57 @@
                 <w:u w:val="none"/>
                 <w:lang w:val="es-SV" w:eastAsia="es-SV"/>
               </w:rPr>
-              <w:t xml:space="preserve">Revisar trimestralmente los avances de los casos de la cartera judicial.</w:t>
-            </w:r>
-          </w:p>
-        </w:tc>
-        <w:tc>
-          <w:tcPr>
-            <w:tcW w:w="4817" w:type="dxa"/>
-          </w:tcPr>
-          <w:p/>
+              <w:t xml:space="preserve">Llevar un Libro de Actas de las sesiones ordinarias y extraordinarias. Levantar un acta por cada sesión, la cual se leerá y ratificará en la próxima reunión para hacer los asientos respectivos. El Libro se deberá mantener debidamente actualizado.</w:t>
+            </w:r>
+          </w:p>
+        </w:tc>
+        <w:tc>
+          <w:tcPr>
+            <w:tcW w:w="4817" w:type="dxa"/>
+          </w:tcPr>
+          <w:p>
+            <w:pPr>
+              <w:pStyle w:val="Textoindependiente2"/>
+              <w:tabs>
+                <w:tab w:val="left" w:pos="-2880"/>
+              </w:tabs>
+              <w:spacing w:after="120" w:line="276" w:lineRule="auto"/>
+              <w:ind w:left="360" w:hanging="360"/>
+              <w:jc w:val="both"/>
+              <w:rPr>
+                <w:rFonts w:eastAsia="Arial" w:cs="Arial"/>
+                <w:b w:val="0"/>
+                <w:i w:val="0"/>
+                <w:color w:val="000000" w:themeColor="text1"/>
+                <w:sz w:val="24"/>
+                <w:szCs w:val="24"/>
+              </w:rPr>
+            </w:pPr>
+            <w:r>
+              <w:rPr>
+                <w:rFonts w:eastAsia="Arial" w:cs="Arial"/>
+                <w:b w:val="0"/>
+                <w:i w:val="0"/>
+                <w:color w:val="000000" w:themeColor="text1"/>
+                <w:sz w:val="24"/>
+                <w:szCs w:val="24"/>
+                <w:u w:val="none"/>
+              </w:rPr>
+              <w:t xml:space="preserve">h) </w:t>
+            </w:r>
+            <w:r>
+              <w:rPr>
+                <w:rFonts w:eastAsia="Arial" w:cs="Arial"/>
+                <w:b w:val="0"/>
+                <w:i w:val="0"/>
+                <w:color w:val="000000" w:themeColor="text1"/>
+                <w:sz w:val="24"/>
+                <w:szCs w:val="24"/>
+                <w:u w:val="single"/>
+              </w:rPr>
+              <w:t xml:space="preserve">Revisar el Reglamento y las Políticas para la recuperación, con el fin de proponer al Consejo de Administración los cambios necesarios.</w:t>
+            </w:r>
+          </w:p>
         </w:tc>
       </w:tr>
       <w:tr>
@@ -10168,7 +10326,42 @@
                 <w:u w:val="none"/>
                 <w:lang w:val="es-SV" w:eastAsia="es-SV"/>
               </w:rPr>
-              <w:t xml:space="preserve">h) Llevar un Libro de Actas de las sesiones ordinarias y extraordinarias. Levantar un acta por cada sesión, la cual se leerá y ratificará en la próxima reunión para hacer los asientos respectivos. El Libro se deberá mantener debidamente actualizado.</w:t>
+              <w:t xml:space="preserve">i) </w:t>
+            </w:r>
+            <w:r>
+              <w:rPr>
+                <w:rFonts w:ascii="Arial" w:hAnsi="Arial" w:cs="Arial"/>
+                <w:strike/>
+                <w:color w:val="000000" w:themeColor="text1"/>
+                <w:sz w:val="24"/>
+                <w:szCs w:val="24"/>
+                <w:u w:val="none"/>
+                <w:lang w:val="es-SV" w:eastAsia="es-SV"/>
+              </w:rPr>
+              <w:t xml:space="preserve">Presentar al</w:t>
+            </w:r>
+            <w:r>
+              <w:rPr>
+                <w:rFonts w:ascii="Arial" w:hAnsi="Arial" w:cs="Arial"/>
+                <w:color w:val="000000" w:themeColor="text1"/>
+                <w:sz w:val="24"/>
+                <w:szCs w:val="24"/>
+                <w:u w:val="none"/>
+                <w:lang w:val="es-SV" w:eastAsia="es-SV"/>
+              </w:rPr>
+              <w:t xml:space="preserve"> Consejo de Administración </w:t>
+            </w:r>
+            <w:r>
+              <w:rPr>
+                <w:rFonts w:ascii="Arial" w:hAnsi="Arial" w:cs="Arial"/>
+                <w:strike/>
+                <w:color w:val="000000" w:themeColor="text1"/>
+                <w:sz w:val="24"/>
+                <w:szCs w:val="24"/>
+                <w:u w:val="none"/>
+                <w:lang w:val="es-SV" w:eastAsia="es-SV"/>
+              </w:rPr>
+              <w:t xml:space="preserve">un informe mensual de sus actividades y, anualmente presentar un informe de labores para ser trasladado por el Consejo de Administración a la Asamblea General de Asociados donde podrá incluir las observaciones y recomendaciones que estime conveniente para el mejoramiento de sus funciones. De este Informe enviará copia a la Junta de Vigilancia.</w:t>
             </w:r>
           </w:p>
         </w:tc>
@@ -10204,7 +10397,43 @@
                 <w:szCs w:val="24"/>
                 <w:u w:val="none"/>
               </w:rPr>
-              <w:t xml:space="preserve">f) Llevar un Libro de Actas de las sesiones ordinarias y extraordinarias. Levantar un acta por cada sesión, la cual se leerá y ratificará en la próxima reunión para hacer los asientos respectivos. El Libro se deberá mantener debidamente actualizado.</w:t>
+              <w:t xml:space="preserve">i) </w:t>
+            </w:r>
+            <w:r>
+              <w:rPr>
+                <w:rFonts w:eastAsia="Arial" w:cs="Arial"/>
+                <w:b w:val="0"/>
+                <w:i w:val="0"/>
+                <w:color w:val="000000" w:themeColor="text1"/>
+                <w:sz w:val="24"/>
+                <w:szCs w:val="24"/>
+                <w:u w:val="single"/>
+              </w:rPr>
+              <w:t xml:space="preserve">Elaborar el Plan de trabajo anual y su respectivo presupuesto, a solicitud del</w:t>
+            </w:r>
+            <w:r>
+              <w:rPr>
+                <w:rFonts w:eastAsia="Arial" w:cs="Arial"/>
+                <w:b w:val="0"/>
+                <w:i w:val="0"/>
+                <w:color w:val="000000" w:themeColor="text1"/>
+                <w:sz w:val="24"/>
+                <w:szCs w:val="24"/>
+                <w:u w:val="none"/>
+              </w:rPr>
+              <w:t xml:space="preserve"> Consejo de Administración </w:t>
+            </w:r>
+            <w:r>
+              <w:rPr>
+                <w:rFonts w:eastAsia="Arial" w:cs="Arial"/>
+                <w:b w:val="0"/>
+                <w:i w:val="0"/>
+                <w:color w:val="000000" w:themeColor="text1"/>
+                <w:sz w:val="24"/>
+                <w:szCs w:val="24"/>
+                <w:u w:val="single"/>
+              </w:rPr>
+              <w:t xml:space="preserve">para su aprobación.</w:t>
             </w:r>
           </w:p>
         </w:tc>
@@ -10240,7 +10469,7 @@
                 <w:u w:val="none"/>
                 <w:lang w:val="es-SV" w:eastAsia="es-SV"/>
               </w:rPr>
-              <w:t xml:space="preserve">i) Presentar al Consejo de Administración un informe mensual de sus actividades y, </w:t>
+              <w:t xml:space="preserve">j) </w:t>
             </w:r>
             <w:r>
               <w:rPr>
@@ -10252,64 +10481,7 @@
                 <w:u w:val="none"/>
                 <w:lang w:val="es-SV" w:eastAsia="es-SV"/>
               </w:rPr>
-              <w:t xml:space="preserve">anualmente</w:t>
-            </w:r>
-            <w:r>
-              <w:rPr>
-                <w:rFonts w:ascii="Arial" w:hAnsi="Arial" w:cs="Arial"/>
-                <w:color w:val="000000" w:themeColor="text1"/>
-                <w:sz w:val="24"/>
-                <w:szCs w:val="24"/>
-                <w:u w:val="none"/>
-                <w:lang w:val="es-SV" w:eastAsia="es-SV"/>
-              </w:rPr>
-              <w:t xml:space="preserve"> presentar un informe </w:t>
-            </w:r>
-            <w:r>
-              <w:rPr>
-                <w:rFonts w:ascii="Arial" w:hAnsi="Arial" w:cs="Arial"/>
-                <w:strike/>
-                <w:color w:val="000000" w:themeColor="text1"/>
-                <w:sz w:val="24"/>
-                <w:szCs w:val="24"/>
-                <w:u w:val="none"/>
-                <w:lang w:val="es-SV" w:eastAsia="es-SV"/>
-              </w:rPr>
-              <w:t xml:space="preserve">de labores para ser trasladado por el</w:t>
-            </w:r>
-            <w:r>
-              <w:rPr>
-                <w:rFonts w:ascii="Arial" w:hAnsi="Arial" w:cs="Arial"/>
-                <w:color w:val="000000" w:themeColor="text1"/>
-                <w:sz w:val="24"/>
-                <w:szCs w:val="24"/>
-                <w:u w:val="none"/>
-                <w:lang w:val="es-SV" w:eastAsia="es-SV"/>
-              </w:rPr>
-              <w:t xml:space="preserve"> Consejo de Administración a la Asamblea General de Asociados </w:t>
-            </w:r>
-            <w:r>
-              <w:rPr>
-                <w:rFonts w:ascii="Arial" w:hAnsi="Arial" w:cs="Arial"/>
-                <w:strike/>
-                <w:color w:val="000000" w:themeColor="text1"/>
-                <w:sz w:val="24"/>
-                <w:szCs w:val="24"/>
-                <w:u w:val="none"/>
-                <w:lang w:val="es-SV" w:eastAsia="es-SV"/>
-              </w:rPr>
-              <w:t xml:space="preserve">donde podrá incluir las observaciones y recomendaciones que estime conveniente para el mejoramiento de sus funciones.</w:t>
-            </w:r>
-            <w:r>
-              <w:rPr>
-                <w:rFonts w:ascii="Arial" w:hAnsi="Arial" w:cs="Arial"/>
-                <w:color w:val="000000" w:themeColor="text1"/>
-                <w:sz w:val="24"/>
-                <w:szCs w:val="24"/>
-                <w:u w:val="none"/>
-                <w:lang w:val="es-SV" w:eastAsia="es-SV"/>
-              </w:rPr>
-              <w:t xml:space="preserve"> De este Informe enviará copia a la Junta de Vigilancia.</w:t>
+              <w:t xml:space="preserve">Revisar el Reglamento y las Políticas para la recuperación, con el fin de proponer al Consejo de Administración los cambios necesarios.</w:t>
             </w:r>
           </w:p>
         </w:tc>
@@ -10345,7 +10517,7 @@
                 <w:szCs w:val="24"/>
                 <w:u w:val="none"/>
               </w:rPr>
-              <w:t xml:space="preserve">g) Presentar al Consejo de Administración un informe mensual de sus actividades y, </w:t>
+              <w:t xml:space="preserve">j) </w:t>
             </w:r>
             <w:r>
               <w:rPr>
@@ -10357,67 +10529,7 @@
                 <w:szCs w:val="24"/>
                 <w:u w:val="single"/>
               </w:rPr>
-              <w:t xml:space="preserve">asimismo</w:t>
-            </w:r>
-            <w:r>
-              <w:rPr>
-                <w:rFonts w:eastAsia="Arial" w:cs="Arial"/>
-                <w:b w:val="0"/>
-                <w:i w:val="0"/>
-                <w:color w:val="000000" w:themeColor="text1"/>
-                <w:sz w:val="24"/>
-                <w:szCs w:val="24"/>
-                <w:u w:val="none"/>
-              </w:rPr>
-              <w:t xml:space="preserve"> presentar un informe </w:t>
-            </w:r>
-            <w:r>
-              <w:rPr>
-                <w:rFonts w:eastAsia="Arial" w:cs="Arial"/>
-                <w:b w:val="0"/>
-                <w:i w:val="0"/>
-                <w:color w:val="000000" w:themeColor="text1"/>
-                <w:sz w:val="24"/>
-                <w:szCs w:val="24"/>
-                <w:u w:val="single"/>
-              </w:rPr>
-              <w:t xml:space="preserve">anual de labores al</w:t>
-            </w:r>
-            <w:r>
-              <w:rPr>
-                <w:rFonts w:eastAsia="Arial" w:cs="Arial"/>
-                <w:b w:val="0"/>
-                <w:i w:val="0"/>
-                <w:color w:val="000000" w:themeColor="text1"/>
-                <w:sz w:val="24"/>
-                <w:szCs w:val="24"/>
-                <w:u w:val="none"/>
-              </w:rPr>
-              <w:t xml:space="preserve"> Consejo de Administración </w:t>
-            </w:r>
-            <w:r>
-              <w:rPr>
-                <w:rFonts w:eastAsia="Arial" w:cs="Arial"/>
-                <w:b w:val="0"/>
-                <w:i w:val="0"/>
-                <w:color w:val="000000" w:themeColor="text1"/>
-                <w:sz w:val="24"/>
-                <w:szCs w:val="24"/>
-                <w:u w:val="single"/>
-              </w:rPr>
-              <w:t xml:space="preserve">para que a su vez sea presentado</w:t>
-            </w:r>
-            <w:r>
-              <w:rPr>
-                <w:rFonts w:eastAsia="Arial" w:cs="Arial"/>
-                <w:b w:val="0"/>
-                <w:i w:val="0"/>
-                <w:color w:val="000000" w:themeColor="text1"/>
-                <w:sz w:val="24"/>
-                <w:szCs w:val="24"/>
-                <w:u w:val="none"/>
-              </w:rPr>
-              <w:t xml:space="preserve"> a la Asamblea General de Asociados. De este Informe enviará copia a la Junta de Vigilancia.</w:t>
+              <w:t xml:space="preserve">Cuando lo considere necesario, podrá programar y participar en reuniones conjuntas con el Comité de Créditos.</w:t>
             </w:r>
           </w:p>
         </w:tc>
@@ -10453,7 +10565,19 @@
                 <w:u w:val="none"/>
                 <w:lang w:val="es-SV" w:eastAsia="es-SV"/>
               </w:rPr>
-              <w:t xml:space="preserve">j) Revisar el Reglamento y las Políticas para la recuperación, con el fin de proponer al Consejo de Administración los cambios necesarios.</w:t>
+              <w:t xml:space="preserve">k) </w:t>
+            </w:r>
+            <w:r>
+              <w:rPr>
+                <w:rFonts w:ascii="Arial" w:hAnsi="Arial" w:cs="Arial"/>
+                <w:strike/>
+                <w:color w:val="000000" w:themeColor="text1"/>
+                <w:sz w:val="24"/>
+                <w:szCs w:val="24"/>
+                <w:u w:val="none"/>
+                <w:lang w:val="es-SV" w:eastAsia="es-SV"/>
+              </w:rPr>
+              <w:t xml:space="preserve">Elaborar el Plan de trabajo anual y su respectivo presupuesto, y presentarlo al Consejo de Administración para su aprobación.</w:t>
             </w:r>
           </w:p>
         </w:tc>
@@ -10489,7 +10613,19 @@
                 <w:szCs w:val="24"/>
                 <w:u w:val="none"/>
               </w:rPr>
-              <w:t xml:space="preserve">h) Revisar el Reglamento y las Políticas para la recuperación, con el fin de proponer al Consejo de Administración los cambios necesarios.</w:t>
+              <w:t xml:space="preserve">k) </w:t>
+            </w:r>
+            <w:r>
+              <w:rPr>
+                <w:rFonts w:eastAsia="Arial" w:cs="Arial"/>
+                <w:b w:val="0"/>
+                <w:i w:val="0"/>
+                <w:color w:val="000000" w:themeColor="text1"/>
+                <w:sz w:val="24"/>
+                <w:szCs w:val="24"/>
+                <w:u w:val="single"/>
+              </w:rPr>
+              <w:t xml:space="preserve">Solicitar al Departamento de Soluciones Financieras, reportes con relación al estado de la cartera, saldos en mora o cualquier otra información que considere necesaria.</w:t>
             </w:r>
           </w:p>
         </w:tc>
@@ -10525,7 +10661,7 @@
                 <w:u w:val="none"/>
                 <w:lang w:val="es-SV" w:eastAsia="es-SV"/>
               </w:rPr>
-              <w:t xml:space="preserve">k) Elaborar el Plan de trabajo anual y su respectivo presupuesto, </w:t>
+              <w:t xml:space="preserve">l) </w:t>
             </w:r>
             <w:r>
               <w:rPr>
@@ -10537,18 +10673,7 @@
                 <w:u w:val="none"/>
                 <w:lang w:val="es-SV" w:eastAsia="es-SV"/>
               </w:rPr>
-              <w:t xml:space="preserve">y presentarlo al</w:t>
-            </w:r>
-            <w:r>
-              <w:rPr>
-                <w:rFonts w:ascii="Arial" w:hAnsi="Arial" w:cs="Arial"/>
-                <w:color w:val="000000" w:themeColor="text1"/>
-                <w:sz w:val="24"/>
-                <w:szCs w:val="24"/>
-                <w:u w:val="none"/>
-                <w:lang w:val="es-SV" w:eastAsia="es-SV"/>
-              </w:rPr>
-              <w:t xml:space="preserve"> Consejo de Administración para su aprobación.</w:t>
+              <w:t xml:space="preserve">Programar y participar en reuniones conjuntas, semestralmente con el Comité de Créditos y cuando lo considere necesario podrá invitar a miembros de otros departamentos.</w:t>
             </w:r>
           </w:p>
         </w:tc>
@@ -10584,7 +10709,7 @@
                 <w:szCs w:val="24"/>
                 <w:u w:val="none"/>
               </w:rPr>
-              <w:t xml:space="preserve">i) Elaborar el Plan de trabajo anual y su respectivo presupuesto, </w:t>
+              <w:t xml:space="preserve">l) </w:t>
             </w:r>
             <w:r>
               <w:rPr>
@@ -10596,19 +10721,7 @@
                 <w:szCs w:val="24"/>
                 <w:u w:val="single"/>
               </w:rPr>
-              <w:t xml:space="preserve">a solicitud del</w:t>
-            </w:r>
-            <w:r>
-              <w:rPr>
-                <w:rFonts w:eastAsia="Arial" w:cs="Arial"/>
-                <w:b w:val="0"/>
-                <w:i w:val="0"/>
-                <w:color w:val="000000" w:themeColor="text1"/>
-                <w:sz w:val="24"/>
-                <w:szCs w:val="24"/>
-                <w:u w:val="none"/>
-              </w:rPr>
-              <w:t xml:space="preserve"> Consejo de Administración para su aprobación.</w:t>
+              <w:t xml:space="preserve">Dar seguimiento a los casos presentados por el Departamento de Soluciones Financieras al Comité, cuando así se ha programado en sesiones previas del Comité.</w:t>
             </w:r>
           </w:p>
         </w:tc>
@@ -10644,7 +10757,7 @@
                 <w:u w:val="none"/>
                 <w:lang w:val="es-SV" w:eastAsia="es-SV"/>
               </w:rPr>
-              <w:t xml:space="preserve">l) Programar y participar en reuniones conjuntas, </w:t>
+              <w:t xml:space="preserve">m) </w:t>
             </w:r>
             <w:r>
               <w:rPr>
@@ -10656,92 +10769,15 @@
                 <w:u w:val="none"/>
                 <w:lang w:val="es-SV" w:eastAsia="es-SV"/>
               </w:rPr>
-              <w:t xml:space="preserve">semestralmente</w:t>
-            </w:r>
-            <w:r>
-              <w:rPr>
-                <w:rFonts w:ascii="Arial" w:hAnsi="Arial" w:cs="Arial"/>
-                <w:color w:val="000000" w:themeColor="text1"/>
-                <w:sz w:val="24"/>
-                <w:szCs w:val="24"/>
-                <w:u w:val="none"/>
-                <w:lang w:val="es-SV" w:eastAsia="es-SV"/>
-              </w:rPr>
-              <w:t xml:space="preserve"> con el Comité de Créditos </w:t>
-            </w:r>
-            <w:r>
-              <w:rPr>
-                <w:rFonts w:ascii="Arial" w:hAnsi="Arial" w:cs="Arial"/>
-                <w:strike/>
-                <w:color w:val="000000" w:themeColor="text1"/>
-                <w:sz w:val="24"/>
-                <w:szCs w:val="24"/>
-                <w:u w:val="none"/>
-                <w:lang w:val="es-SV" w:eastAsia="es-SV"/>
-              </w:rPr>
-              <w:t xml:space="preserve">y cuando lo considere necesario podrá invitar a miembros de otros departamentos.</w:t>
-            </w:r>
-          </w:p>
-        </w:tc>
-        <w:tc>
-          <w:tcPr>
-            <w:tcW w:w="4817" w:type="dxa"/>
-          </w:tcPr>
-          <w:p>
-            <w:pPr>
-              <w:pStyle w:val="Textoindependiente2"/>
-              <w:tabs>
-                <w:tab w:val="left" w:pos="-2880"/>
-              </w:tabs>
-              <w:spacing w:after="120" w:line="276" w:lineRule="auto"/>
-              <w:ind w:left="360" w:hanging="360"/>
-              <w:jc w:val="both"/>
-              <w:rPr>
-                <w:rFonts w:eastAsia="Arial" w:cs="Arial"/>
-                <w:b w:val="0"/>
-                <w:i w:val="0"/>
-                <w:color w:val="000000" w:themeColor="text1"/>
-                <w:sz w:val="24"/>
-                <w:szCs w:val="24"/>
-              </w:rPr>
-            </w:pPr>
-            <w:r>
-              <w:rPr>
-                <w:rFonts w:eastAsia="Arial" w:cs="Arial"/>
-                <w:b w:val="0"/>
-                <w:i w:val="0"/>
-                <w:color w:val="000000" w:themeColor="text1"/>
-                <w:sz w:val="24"/>
-                <w:szCs w:val="24"/>
-                <w:u w:val="none"/>
-              </w:rPr>
-              <w:t xml:space="preserve">j) </w:t>
-            </w:r>
-            <w:r>
-              <w:rPr>
-                <w:rFonts w:eastAsia="Arial" w:cs="Arial"/>
-                <w:b w:val="0"/>
-                <w:i w:val="0"/>
-                <w:color w:val="000000" w:themeColor="text1"/>
-                <w:sz w:val="24"/>
-                <w:szCs w:val="24"/>
-                <w:u w:val="single"/>
-              </w:rPr>
-              <w:t xml:space="preserve">Cuando lo considere necesario, podrá</w:t>
-            </w:r>
-            <w:r>
-              <w:rPr>
-                <w:rFonts w:eastAsia="Arial" w:cs="Arial"/>
-                <w:b w:val="0"/>
-                <w:i w:val="0"/>
-                <w:color w:val="000000" w:themeColor="text1"/>
-                <w:sz w:val="24"/>
-                <w:szCs w:val="24"/>
-                <w:u w:val="none"/>
-              </w:rPr>
-              <w:t xml:space="preserve"> programar y participar en reuniones conjuntas con el Comité de Créditos.</w:t>
-            </w:r>
-          </w:p>
+              <w:t xml:space="preserve">Conocer mensualmente o cuando lo considere necesario, los Reportes de mora, en la cual se detallará la antigüedad de la mora (ver políticas.)</w:t>
+            </w:r>
+          </w:p>
+        </w:tc>
+        <w:tc>
+          <w:tcPr>
+            <w:tcW w:w="4817" w:type="dxa"/>
+          </w:tcPr>
+          <w:p/>
         </w:tc>
       </w:tr>
       <w:tr>
@@ -10775,7 +10811,7 @@
                 <w:u w:val="none"/>
                 <w:lang w:val="es-SV" w:eastAsia="es-SV"/>
               </w:rPr>
-              <w:t xml:space="preserve">m) </w:t>
+              <w:t xml:space="preserve">n) </w:t>
             </w:r>
             <w:r>
               <w:rPr>
@@ -10787,176 +10823,15 @@
                 <w:u w:val="none"/>
                 <w:lang w:val="es-SV" w:eastAsia="es-SV"/>
               </w:rPr>
-              <w:t xml:space="preserve">Conocer mensualmente o cuando lo considere necesario, los Reportes de mora, en la cual se detallará la antigüedad de la mora (ver políticas.)</w:t>
-            </w:r>
-          </w:p>
-        </w:tc>
-        <w:tc>
-          <w:tcPr>
-            <w:tcW w:w="4817" w:type="dxa"/>
-          </w:tcPr>
-          <w:p>
-            <w:pPr>
-              <w:pStyle w:val="Textoindependiente2"/>
-              <w:tabs>
-                <w:tab w:val="left" w:pos="-2880"/>
-              </w:tabs>
-              <w:spacing w:after="120" w:line="276" w:lineRule="auto"/>
-              <w:ind w:left="360" w:hanging="360"/>
-              <w:jc w:val="both"/>
-              <w:rPr>
-                <w:rFonts w:eastAsia="Arial" w:cs="Arial"/>
-                <w:b w:val="0"/>
-                <w:i w:val="0"/>
-                <w:color w:val="000000" w:themeColor="text1"/>
-                <w:sz w:val="24"/>
-                <w:szCs w:val="24"/>
-              </w:rPr>
-            </w:pPr>
-            <w:r>
-              <w:rPr>
-                <w:rFonts w:eastAsia="Arial" w:cs="Arial"/>
-                <w:b w:val="0"/>
-                <w:i w:val="0"/>
-                <w:color w:val="000000" w:themeColor="text1"/>
-                <w:sz w:val="24"/>
-                <w:szCs w:val="24"/>
-                <w:u w:val="none"/>
-              </w:rPr>
-              <w:t xml:space="preserve">k) </w:t>
-            </w:r>
-            <w:r>
-              <w:rPr>
-                <w:rFonts w:eastAsia="Arial" w:cs="Arial"/>
-                <w:b w:val="0"/>
-                <w:i w:val="0"/>
-                <w:color w:val="000000" w:themeColor="text1"/>
-                <w:sz w:val="24"/>
-                <w:szCs w:val="24"/>
-                <w:u w:val="single"/>
-              </w:rPr>
-              <w:t xml:space="preserve">Solicitar al Departamento de Soluciones Financieras, reportes con relación al estado de la cartera, saldos en mora o cualquier otra información que considere necesaria.</w:t>
-            </w:r>
-          </w:p>
-        </w:tc>
-      </w:tr>
-      <w:tr>
-        <w:tc>
-          <w:tcPr>
-            <w:tcW w:w="4817" w:type="dxa"/>
-          </w:tcPr>
-          <w:p>
-            <w:pPr>
-              <w:pStyle w:val="Prrafodelista"/>
-              <w:autoSpaceDE w:val="0"/>
-              <w:autoSpaceDN w:val="0"/>
-              <w:adjustRightInd w:val="0"/>
-              <w:spacing w:line="276" w:lineRule="auto"/>
-              <w:ind w:left="360" w:hanging="360"/>
-              <w:jc w:val="both"/>
-              <w:rPr>
-                <w:rFonts w:ascii="Arial" w:hAnsi="Arial" w:cs="Arial"/>
-                <w:color w:val="000000" w:themeColor="text1"/>
-                <w:sz w:val="24"/>
-                <w:szCs w:val="24"/>
-                <w:lang w:val="es-SV" w:eastAsia="es-SV"/>
-              </w:rPr>
-            </w:pPr>
-            <w:r>
-              <w:rPr>
-                <w:rFonts w:ascii="Arial" w:hAnsi="Arial" w:cs="Arial"/>
-                <w:color w:val="000000" w:themeColor="text1"/>
-                <w:sz w:val="24"/>
-                <w:szCs w:val="24"/>
-                <w:u w:val="none"/>
-                <w:lang w:val="es-SV" w:eastAsia="es-SV"/>
-              </w:rPr>
-              <w:t xml:space="preserve">n) Dar seguimiento </w:t>
-            </w:r>
-            <w:r>
-              <w:rPr>
-                <w:rFonts w:ascii="Arial" w:hAnsi="Arial" w:cs="Arial"/>
-                <w:strike/>
-                <w:color w:val="000000" w:themeColor="text1"/>
-                <w:sz w:val="24"/>
-                <w:szCs w:val="24"/>
-                <w:u w:val="none"/>
-                <w:lang w:val="es-SV" w:eastAsia="es-SV"/>
-              </w:rPr>
-              <w:t xml:space="preserve">calendarizado</w:t>
-            </w:r>
-            <w:r>
-              <w:rPr>
-                <w:rFonts w:ascii="Arial" w:hAnsi="Arial" w:cs="Arial"/>
-                <w:color w:val="000000" w:themeColor="text1"/>
-                <w:sz w:val="24"/>
-                <w:szCs w:val="24"/>
-                <w:u w:val="none"/>
-                <w:lang w:val="es-SV" w:eastAsia="es-SV"/>
-              </w:rPr>
-              <w:t xml:space="preserve"> a los casos presentados por el Departamento de </w:t>
-            </w:r>
-            <w:r>
-              <w:rPr>
-                <w:rFonts w:ascii="Arial" w:hAnsi="Arial" w:cs="Arial"/>
-                <w:strike/>
-                <w:color w:val="000000" w:themeColor="text1"/>
-                <w:sz w:val="24"/>
-                <w:szCs w:val="24"/>
-                <w:u w:val="none"/>
-                <w:lang w:val="es-SV" w:eastAsia="es-SV"/>
-              </w:rPr>
-              <w:t xml:space="preserve">Cobros al Comité.</w:t>
-            </w:r>
-          </w:p>
-        </w:tc>
-        <w:tc>
-          <w:tcPr>
-            <w:tcW w:w="4817" w:type="dxa"/>
-          </w:tcPr>
-          <w:p>
-            <w:pPr>
-              <w:pStyle w:val="Textoindependiente2"/>
-              <w:tabs>
-                <w:tab w:val="left" w:pos="-2880"/>
-              </w:tabs>
-              <w:spacing w:after="120" w:line="276" w:lineRule="auto"/>
-              <w:ind w:left="360" w:hanging="360"/>
-              <w:jc w:val="both"/>
-              <w:rPr>
-                <w:rFonts w:eastAsia="Arial" w:cs="Arial"/>
-                <w:b w:val="0"/>
-                <w:i w:val="0"/>
-                <w:color w:val="000000" w:themeColor="text1"/>
-                <w:sz w:val="24"/>
-                <w:szCs w:val="24"/>
-              </w:rPr>
-            </w:pPr>
-            <w:r>
-              <w:rPr>
-                <w:rFonts w:eastAsia="Arial" w:cs="Arial"/>
-                <w:b w:val="0"/>
-                <w:i w:val="0"/>
-                <w:color w:val="000000" w:themeColor="text1"/>
-                <w:sz w:val="24"/>
-                <w:szCs w:val="24"/>
-                <w:u w:val="none"/>
-              </w:rPr>
-              <w:t xml:space="preserve">l) Dar seguimiento a los casos presentados por el Departamento de </w:t>
-            </w:r>
-            <w:r>
-              <w:rPr>
-                <w:rFonts w:eastAsia="Arial" w:cs="Arial"/>
-                <w:b w:val="0"/>
-                <w:i w:val="0"/>
-                <w:color w:val="000000" w:themeColor="text1"/>
-                <w:sz w:val="24"/>
-                <w:szCs w:val="24"/>
-                <w:u w:val="single"/>
-              </w:rPr>
-              <w:t xml:space="preserve">Soluciones Financieras al Comité, cuando así se ha programado en sesiones previas del Comité.</w:t>
-            </w:r>
-          </w:p>
+              <w:t xml:space="preserve">Dar seguimiento calendarizado a los casos presentados por el Departamento de Cobros al Comité.</w:t>
+            </w:r>
+          </w:p>
+        </w:tc>
+        <w:tc>
+          <w:tcPr>
+            <w:tcW w:w="4817" w:type="dxa"/>
+          </w:tcPr>
+          <w:p/>
         </w:tc>
       </w:tr>
       <w:tr>
@@ -11228,6 +11103,7 @@
               <w:autoSpaceDN w:val="0"/>
               <w:adjustRightInd w:val="0"/>
               <w:spacing w:line="276" w:lineRule="auto"/>
+              <w:ind w:left="360" w:hanging="360"/>
               <w:jc w:val="both"/>
               <w:rPr>
                 <w:rFonts w:ascii="Arial" w:hAnsi="Arial" w:cs="Arial"/>
@@ -11246,7 +11122,7 @@
                 <w:u w:val="none"/>
                 <w:lang w:val="es-SV" w:eastAsia="es-SV"/>
               </w:rPr>
-              <w:t xml:space="preserve">El Comité se reunirá ordinariamente una vez por semana a fin de analizar los casos presentados por el Departamento de </w:t>
+              <w:t xml:space="preserve">a) El Comité se reunirá ordinariamente una vez por semana a fin de analizar los casos presentados por el Departamento de </w:t>
             </w:r>
             <w:r>
               <w:rPr>
@@ -12862,96 +12738,6 @@
           <w:tcPr>
             <w:tcW w:w="4817" w:type="dxa"/>
           </w:tcPr>
-          <w:p/>
-        </w:tc>
-      </w:tr>
-      <w:tr>
-        <w:tc>
-          <w:tcPr>
-            <w:tcW w:w="4817" w:type="dxa"/>
-          </w:tcPr>
-          <w:p>
-            <w:pPr>
-              <w:spacing w:line="276" w:lineRule="auto"/>
-              <w:ind w:left="360" w:hanging="360"/>
-              <w:jc w:val="both"/>
-              <w:rPr>
-                <w:rFonts w:ascii="Arial" w:hAnsi="Arial" w:cs="Arial"/>
-                <w:noProof/>
-                <w:color w:val="000000" w:themeColor="text1"/>
-                <w:sz w:val="24"/>
-                <w:szCs w:val="24"/>
-              </w:rPr>
-            </w:pPr>
-            <w:r>
-              <w:rPr>
-                <w:rFonts w:ascii="Arial" w:hAnsi="Arial" w:cs="Arial"/>
-                <w:noProof/>
-                <w:color w:val="000000" w:themeColor="text1"/>
-                <w:sz w:val="24"/>
-                <w:szCs w:val="24"/>
-                <w:u w:val="none"/>
-              </w:rPr>
-              <w:t xml:space="preserve">k) </w:t>
-            </w:r>
-            <w:r>
-              <w:rPr>
-                <w:rFonts w:ascii="Arial" w:hAnsi="Arial" w:cs="Arial"/>
-                <w:strike/>
-                <w:noProof/>
-                <w:color w:val="000000" w:themeColor="text1"/>
-                <w:sz w:val="24"/>
-                <w:szCs w:val="24"/>
-                <w:u w:val="none"/>
-              </w:rPr>
-              <w:t xml:space="preserve">Analizar ofertas, negociar precios, términos y condiciones de Pólizas de Seguros Institucionales y de Asociados, y hacer recomendaciones al Consejo de Administración.</w:t>
-            </w:r>
-          </w:p>
-        </w:tc>
-        <w:tc>
-          <w:tcPr>
-            <w:tcW w:w="4817" w:type="dxa"/>
-          </w:tcPr>
-          <w:p/>
-        </w:tc>
-      </w:tr>
-      <w:tr>
-        <w:tc>
-          <w:tcPr>
-            <w:tcW w:w="4817" w:type="dxa"/>
-          </w:tcPr>
-          <w:p>
-            <w:pPr>
-              <w:pStyle w:val="Prrafodelista"/>
-              <w:spacing w:after="200" w:line="276" w:lineRule="auto"/>
-              <w:ind w:left="360" w:hanging="360"/>
-              <w:contextualSpacing/>
-              <w:jc w:val="both"/>
-              <w:rPr>
-                <w:rFonts w:ascii="Arial" w:hAnsi="Arial" w:cs="Arial"/>
-                <w:noProof/>
-                <w:color w:val="000000" w:themeColor="text1"/>
-                <w:sz w:val="24"/>
-                <w:szCs w:val="24"/>
-              </w:rPr>
-            </w:pPr>
-            <w:r>
-              <w:rPr>
-                <w:rFonts w:ascii="Arial" w:hAnsi="Arial" w:cs="Arial"/>
-                <w:noProof/>
-                <w:color w:val="000000" w:themeColor="text1"/>
-                <w:sz w:val="24"/>
-                <w:szCs w:val="24"/>
-                <w:u w:val="none"/>
-              </w:rPr>
-              <w:t xml:space="preserve">l) Recomendar Líneas específicas de Crédito, para Saneamiento y Salvatajes.</w:t>
-            </w:r>
-          </w:p>
-        </w:tc>
-        <w:tc>
-          <w:tcPr>
-            <w:tcW w:w="4817" w:type="dxa"/>
-          </w:tcPr>
           <w:p>
             <w:pPr>
               <w:pStyle w:val="Textoindependiente2"/>
@@ -12980,7 +12766,19 @@
                 <w:szCs w:val="24"/>
                 <w:u w:val="none"/>
               </w:rPr>
-              <w:t xml:space="preserve">j) Recomendar Líneas específicas de Crédito, para Saneamiento y Salvatajes.</w:t>
+              <w:t xml:space="preserve">j) </w:t>
+            </w:r>
+            <w:r>
+              <w:rPr>
+                <w:rFonts w:eastAsia="Arial" w:cs="Arial"/>
+                <w:b w:val="0"/>
+                <w:i w:val="0"/>
+                <w:color w:val="000000" w:themeColor="text1"/>
+                <w:sz w:val="24"/>
+                <w:szCs w:val="24"/>
+                <w:u w:val="single"/>
+              </w:rPr>
+              <w:t xml:space="preserve">Recomendar Líneas específicas de Crédito, para Saneamiento y Salvatajes.</w:t>
             </w:r>
           </w:p>
         </w:tc>
@@ -13012,7 +12810,19 @@
                 <w:szCs w:val="24"/>
                 <w:u w:val="none"/>
               </w:rPr>
-              <w:t xml:space="preserve">m) Definir políticas para el cumplimiento de las reservas de Liquidez.</w:t>
+              <w:t xml:space="preserve">k) </w:t>
+            </w:r>
+            <w:r>
+              <w:rPr>
+                <w:rFonts w:ascii="Arial" w:hAnsi="Arial" w:cs="Arial"/>
+                <w:strike/>
+                <w:noProof/>
+                <w:color w:val="000000" w:themeColor="text1"/>
+                <w:sz w:val="24"/>
+                <w:szCs w:val="24"/>
+                <w:u w:val="none"/>
+              </w:rPr>
+              <w:t xml:space="preserve">Analizar ofertas, negociar precios, términos y condiciones de Pólizas de Seguros Institucionales y de Asociados, y hacer recomendaciones al Consejo de Administración.</w:t>
             </w:r>
           </w:p>
         </w:tc>
@@ -13048,7 +12858,19 @@
                 <w:szCs w:val="24"/>
                 <w:u w:val="none"/>
               </w:rPr>
-              <w:t xml:space="preserve">k) Definir políticas para el cumplimiento de las reservas de Liquidez.</w:t>
+              <w:t xml:space="preserve">k) </w:t>
+            </w:r>
+            <w:r>
+              <w:rPr>
+                <w:rFonts w:eastAsia="Arial" w:cs="Arial"/>
+                <w:b w:val="0"/>
+                <w:i w:val="0"/>
+                <w:color w:val="000000" w:themeColor="text1"/>
+                <w:sz w:val="24"/>
+                <w:szCs w:val="24"/>
+                <w:u w:val="single"/>
+              </w:rPr>
+              <w:t xml:space="preserve">Definir políticas para el cumplimiento de las reservas de Liquidez.</w:t>
             </w:r>
           </w:p>
         </w:tc>
@@ -13060,8 +12882,10 @@
           </w:tcPr>
           <w:p>
             <w:pPr>
-              <w:spacing w:line="276" w:lineRule="auto"/>
-              <w:ind w:left="360" w:hanging="360"/>
+              <w:pStyle w:val="Prrafodelista"/>
+              <w:spacing w:after="200" w:line="276" w:lineRule="auto"/>
+              <w:ind w:left="360" w:hanging="360"/>
+              <w:contextualSpacing/>
               <w:jc w:val="both"/>
               <w:rPr>
                 <w:rFonts w:ascii="Arial" w:hAnsi="Arial" w:cs="Arial"/>
@@ -13080,7 +12904,19 @@
                 <w:szCs w:val="24"/>
                 <w:u w:val="none"/>
               </w:rPr>
-              <w:t xml:space="preserve">n) Evaluar Estudios de Factibilidad para crear Agencias, ampliar servicios financieros o de inversiones.</w:t>
+              <w:t xml:space="preserve">l) </w:t>
+            </w:r>
+            <w:r>
+              <w:rPr>
+                <w:rFonts w:ascii="Arial" w:hAnsi="Arial" w:cs="Arial"/>
+                <w:strike/>
+                <w:noProof/>
+                <w:color w:val="000000" w:themeColor="text1"/>
+                <w:sz w:val="24"/>
+                <w:szCs w:val="24"/>
+                <w:u w:val="none"/>
+              </w:rPr>
+              <w:t xml:space="preserve">Recomendar Líneas específicas de Crédito, para Saneamiento y Salvatajes.</w:t>
             </w:r>
           </w:p>
         </w:tc>
@@ -13116,7 +12952,19 @@
                 <w:szCs w:val="24"/>
                 <w:u w:val="none"/>
               </w:rPr>
-              <w:t xml:space="preserve">l) Evaluar Estudios de Factibilidad para crear Agencias, ampliar servicios financieros o de inversiones.</w:t>
+              <w:t xml:space="preserve">l) </w:t>
+            </w:r>
+            <w:r>
+              <w:rPr>
+                <w:rFonts w:eastAsia="Arial" w:cs="Arial"/>
+                <w:b w:val="0"/>
+                <w:i w:val="0"/>
+                <w:color w:val="000000" w:themeColor="text1"/>
+                <w:sz w:val="24"/>
+                <w:szCs w:val="24"/>
+                <w:u w:val="single"/>
+              </w:rPr>
+              <w:t xml:space="preserve">Evaluar Estudios de Factibilidad para crear Agencias, ampliar servicios financieros o de inversiones.</w:t>
             </w:r>
           </w:p>
         </w:tc>
@@ -13148,7 +12996,19 @@
                 <w:szCs w:val="24"/>
                 <w:u w:val="none"/>
               </w:rPr>
-              <w:t xml:space="preserve">o) Proponer planes contingentes por liquidez o rentabilidad.</w:t>
+              <w:t xml:space="preserve">m) </w:t>
+            </w:r>
+            <w:r>
+              <w:rPr>
+                <w:rFonts w:ascii="Arial" w:hAnsi="Arial" w:cs="Arial"/>
+                <w:strike/>
+                <w:noProof/>
+                <w:color w:val="000000" w:themeColor="text1"/>
+                <w:sz w:val="24"/>
+                <w:szCs w:val="24"/>
+                <w:u w:val="none"/>
+              </w:rPr>
+              <w:t xml:space="preserve">Definir políticas para el cumplimiento de las reservas de Liquidez.</w:t>
             </w:r>
           </w:p>
         </w:tc>
@@ -13184,7 +13044,19 @@
                 <w:szCs w:val="24"/>
                 <w:u w:val="none"/>
               </w:rPr>
-              <w:t xml:space="preserve">m) Proponer planes contingentes por liquidez o rentabilidad.</w:t>
+              <w:t xml:space="preserve">m) </w:t>
+            </w:r>
+            <w:r>
+              <w:rPr>
+                <w:rFonts w:eastAsia="Arial" w:cs="Arial"/>
+                <w:b w:val="0"/>
+                <w:i w:val="0"/>
+                <w:color w:val="000000" w:themeColor="text1"/>
+                <w:sz w:val="24"/>
+                <w:szCs w:val="24"/>
+                <w:u w:val="single"/>
+              </w:rPr>
+              <w:t xml:space="preserve">Proponer planes contingentes por liquidez o rentabilidad.</w:t>
             </w:r>
           </w:p>
         </w:tc>
@@ -13216,7 +13088,19 @@
                 <w:szCs w:val="24"/>
                 <w:u w:val="none"/>
               </w:rPr>
-              <w:t xml:space="preserve">p) Evaluar Planes Contingentes para prevenir Fraudes en la Cooperativa.</w:t>
+              <w:t xml:space="preserve">n) Evaluar </w:t>
+            </w:r>
+            <w:r>
+              <w:rPr>
+                <w:rFonts w:ascii="Arial" w:hAnsi="Arial" w:cs="Arial"/>
+                <w:strike/>
+                <w:noProof/>
+                <w:color w:val="000000" w:themeColor="text1"/>
+                <w:sz w:val="24"/>
+                <w:szCs w:val="24"/>
+                <w:u w:val="none"/>
+              </w:rPr>
+              <w:t xml:space="preserve">Estudios de Factibilidad para crear Agencias, ampliar servicios financieros o de inversiones.</w:t>
             </w:r>
           </w:p>
         </w:tc>
@@ -13252,7 +13136,19 @@
                 <w:szCs w:val="24"/>
                 <w:u w:val="none"/>
               </w:rPr>
-              <w:t xml:space="preserve">n) Evaluar Planes Contingentes para prevenir Fraudes en la Cooperativa.</w:t>
+              <w:t xml:space="preserve">n) Evaluar </w:t>
+            </w:r>
+            <w:r>
+              <w:rPr>
+                <w:rFonts w:eastAsia="Arial" w:cs="Arial"/>
+                <w:b w:val="0"/>
+                <w:i w:val="0"/>
+                <w:color w:val="000000" w:themeColor="text1"/>
+                <w:sz w:val="24"/>
+                <w:szCs w:val="24"/>
+                <w:u w:val="single"/>
+              </w:rPr>
+              <w:t xml:space="preserve">Planes Contingentes para prevenir Fraudes en la Cooperativa.</w:t>
             </w:r>
           </w:p>
         </w:tc>
@@ -13284,7 +13180,19 @@
                 <w:szCs w:val="24"/>
                 <w:u w:val="none"/>
               </w:rPr>
-              <w:t xml:space="preserve">q) Verificar cumplimiento de límites de los niveles de concentración por tipos de fondeo y/o proveedores individuales.</w:t>
+              <w:t xml:space="preserve">o) </w:t>
+            </w:r>
+            <w:r>
+              <w:rPr>
+                <w:rFonts w:ascii="Arial" w:hAnsi="Arial" w:cs="Arial"/>
+                <w:strike/>
+                <w:noProof/>
+                <w:color w:val="000000" w:themeColor="text1"/>
+                <w:sz w:val="24"/>
+                <w:szCs w:val="24"/>
+                <w:u w:val="none"/>
+              </w:rPr>
+              <w:t xml:space="preserve">Proponer planes contingentes por liquidez o rentabilidad.</w:t>
             </w:r>
           </w:p>
         </w:tc>
@@ -13320,7 +13228,19 @@
                 <w:szCs w:val="24"/>
                 <w:u w:val="none"/>
               </w:rPr>
-              <w:t xml:space="preserve">o) Verificar cumplimiento de límites de los niveles de concentración por tipos de fondeo y/o proveedores individuales.</w:t>
+              <w:t xml:space="preserve">o) </w:t>
+            </w:r>
+            <w:r>
+              <w:rPr>
+                <w:rFonts w:eastAsia="Arial" w:cs="Arial"/>
+                <w:b w:val="0"/>
+                <w:i w:val="0"/>
+                <w:color w:val="000000" w:themeColor="text1"/>
+                <w:sz w:val="24"/>
+                <w:szCs w:val="24"/>
+                <w:u w:val="single"/>
+              </w:rPr>
+              <w:t xml:space="preserve">Verificar cumplimiento de límites de los niveles de concentración por tipos de fondeo y/o proveedores individuales.</w:t>
             </w:r>
           </w:p>
         </w:tc>
@@ -13352,7 +13272,30 @@
                 <w:szCs w:val="24"/>
                 <w:u w:val="none"/>
               </w:rPr>
-              <w:t xml:space="preserve">r) Evaluar políticas para minimizar los riesgos de la Cooperativa.</w:t>
+              <w:t xml:space="preserve">p) Evaluar </w:t>
+            </w:r>
+            <w:r>
+              <w:rPr>
+                <w:rFonts w:ascii="Arial" w:hAnsi="Arial" w:cs="Arial"/>
+                <w:strike/>
+                <w:noProof/>
+                <w:color w:val="000000" w:themeColor="text1"/>
+                <w:sz w:val="24"/>
+                <w:szCs w:val="24"/>
+                <w:u w:val="none"/>
+              </w:rPr>
+              <w:t xml:space="preserve">Planes Contingentes para prevenir Fraudes en</w:t>
+            </w:r>
+            <w:r>
+              <w:rPr>
+                <w:rFonts w:ascii="Arial" w:hAnsi="Arial" w:cs="Arial"/>
+                <w:noProof/>
+                <w:color w:val="000000" w:themeColor="text1"/>
+                <w:sz w:val="24"/>
+                <w:szCs w:val="24"/>
+                <w:u w:val="none"/>
+              </w:rPr>
+              <w:t xml:space="preserve"> la Cooperativa.</w:t>
             </w:r>
           </w:p>
         </w:tc>
@@ -13388,7 +13331,31 @@
                 <w:szCs w:val="24"/>
                 <w:u w:val="none"/>
               </w:rPr>
-              <w:t xml:space="preserve">p) Evaluar políticas para minimizar los riesgos de la Cooperativa.</w:t>
+              <w:t xml:space="preserve">p) Evaluar </w:t>
+            </w:r>
+            <w:r>
+              <w:rPr>
+                <w:rFonts w:eastAsia="Arial" w:cs="Arial"/>
+                <w:b w:val="0"/>
+                <w:i w:val="0"/>
+                <w:color w:val="000000" w:themeColor="text1"/>
+                <w:sz w:val="24"/>
+                <w:szCs w:val="24"/>
+                <w:u w:val="single"/>
+              </w:rPr>
+              <w:t xml:space="preserve">políticas para minimizar los riesgos de</w:t>
+            </w:r>
+            <w:r>
+              <w:rPr>
+                <w:rFonts w:eastAsia="Arial" w:cs="Arial"/>
+                <w:b w:val="0"/>
+                <w:i w:val="0"/>
+                <w:color w:val="000000" w:themeColor="text1"/>
+                <w:sz w:val="24"/>
+                <w:szCs w:val="24"/>
+                <w:u w:val="none"/>
+              </w:rPr>
+              <w:t xml:space="preserve"> la Cooperativa.</w:t>
             </w:r>
           </w:p>
         </w:tc>
@@ -13420,7 +13387,7 @@
                 <w:szCs w:val="24"/>
                 <w:u w:val="none"/>
               </w:rPr>
-              <w:t xml:space="preserve">s) </w:t>
+              <w:t xml:space="preserve">q) </w:t>
             </w:r>
             <w:r>
               <w:rPr>
@@ -13432,23 +13399,9 @@
                 <w:szCs w:val="24"/>
                 <w:u w:val="none"/>
               </w:rPr>
-              <w:t xml:space="preserve">Informar al Consejo de Administración de los puntos tratados y Acuerdos en cada reunión.</w:t>
-            </w:r>
-          </w:p>
-        </w:tc>
-        <w:tc>
-          <w:tcPr>
-            <w:tcW w:w="4817" w:type="dxa"/>
-          </w:tcPr>
-          <w:p/>
-        </w:tc>
-      </w:tr>
-      <w:tr>
-        <w:tc>
-          <w:tcPr>
-            <w:tcW w:w="4817" w:type="dxa"/>
-          </w:tcPr>
-          <w:p/>
+              <w:t xml:space="preserve">Verificar cumplimiento de límites de los niveles de concentración por tipos de fondeo y/o proveedores individuales.</w:t>
+            </w:r>
+          </w:p>
         </w:tc>
         <w:tc>
           <w:tcPr>
@@ -13504,7 +13457,54 @@
           <w:tcPr>
             <w:tcW w:w="4817" w:type="dxa"/>
           </w:tcPr>
-          <w:p/>
+          <w:p>
+            <w:pPr>
+              <w:spacing w:line="276" w:lineRule="auto"/>
+              <w:ind w:left="360" w:hanging="360"/>
+              <w:jc w:val="both"/>
+              <w:rPr>
+                <w:rFonts w:ascii="Arial" w:hAnsi="Arial" w:cs="Arial"/>
+                <w:noProof/>
+                <w:color w:val="000000" w:themeColor="text1"/>
+                <w:sz w:val="24"/>
+                <w:szCs w:val="24"/>
+              </w:rPr>
+            </w:pPr>
+            <w:r>
+              <w:rPr>
+                <w:rFonts w:ascii="Arial" w:hAnsi="Arial" w:cs="Arial"/>
+                <w:noProof/>
+                <w:color w:val="000000" w:themeColor="text1"/>
+                <w:sz w:val="24"/>
+                <w:szCs w:val="24"/>
+                <w:u w:val="none"/>
+              </w:rPr>
+              <w:t xml:space="preserve">r) </w:t>
+            </w:r>
+            <w:r>
+              <w:rPr>
+                <w:rFonts w:ascii="Arial" w:hAnsi="Arial" w:cs="Arial"/>
+                <w:strike/>
+                <w:noProof/>
+                <w:color w:val="000000" w:themeColor="text1"/>
+                <w:sz w:val="24"/>
+                <w:szCs w:val="24"/>
+                <w:u w:val="none"/>
+              </w:rPr>
+              <w:t xml:space="preserve">Evaluar políticas para minimizar los</w:t>
+            </w:r>
+            <w:r>
+              <w:rPr>
+                <w:rFonts w:ascii="Arial" w:hAnsi="Arial" w:cs="Arial"/>
+                <w:noProof/>
+                <w:color w:val="000000" w:themeColor="text1"/>
+                <w:sz w:val="24"/>
+                <w:szCs w:val="24"/>
+                <w:u w:val="none"/>
+              </w:rPr>
+              <w:t xml:space="preserve"> riesgos de la Cooperativa.</w:t>
+            </w:r>
+          </w:p>
         </w:tc>
         <w:tc>
           <w:tcPr>
@@ -13550,7 +13550,19 @@
                 <w:szCs w:val="24"/>
                 <w:u w:val="single"/>
               </w:rPr>
-              <w:t xml:space="preserve">Proponer con fundamento razonado los ajustes necesarios al Plan de Recuperación o a los planes estratégicos y de negocio, según corresponda, a efecto de adecuarlos a la real situación económica y financiera y al perfil de riesgos de la Cooperativa;</w:t>
+              <w:t xml:space="preserve">Proponer con fundamento razonado los ajustes necesarios al Plan de Recuperación o a los planes estratégicos y de negocio, según corresponda, a efecto de adecuarlos a la real situación económica y financiera y al perfil de</w:t>
+            </w:r>
+            <w:r>
+              <w:rPr>
+                <w:rFonts w:eastAsia="Arial" w:cs="Arial"/>
+                <w:b w:val="0"/>
+                <w:i w:val="0"/>
+                <w:color w:val="000000" w:themeColor="text1"/>
+                <w:sz w:val="24"/>
+                <w:szCs w:val="24"/>
+                <w:u w:val="none"/>
+              </w:rPr>
+              <w:t xml:space="preserve"> riesgos de la Cooperativa;</w:t>
             </w:r>
           </w:p>
         </w:tc>
@@ -13560,7 +13572,43 @@
           <w:tcPr>
             <w:tcW w:w="4817" w:type="dxa"/>
           </w:tcPr>
-          <w:p/>
+          <w:p>
+            <w:pPr>
+              <w:spacing w:line="276" w:lineRule="auto"/>
+              <w:ind w:left="360" w:hanging="360"/>
+              <w:jc w:val="both"/>
+              <w:rPr>
+                <w:rFonts w:ascii="Arial" w:hAnsi="Arial" w:cs="Arial"/>
+                <w:noProof/>
+                <w:color w:val="000000" w:themeColor="text1"/>
+                <w:sz w:val="24"/>
+                <w:szCs w:val="24"/>
+              </w:rPr>
+            </w:pPr>
+            <w:r>
+              <w:rPr>
+                <w:rFonts w:ascii="Arial" w:hAnsi="Arial" w:cs="Arial"/>
+                <w:noProof/>
+                <w:color w:val="000000" w:themeColor="text1"/>
+                <w:sz w:val="24"/>
+                <w:szCs w:val="24"/>
+                <w:u w:val="none"/>
+              </w:rPr>
+              <w:t xml:space="preserve">s) </w:t>
+            </w:r>
+            <w:r>
+              <w:rPr>
+                <w:rFonts w:ascii="Arial" w:hAnsi="Arial" w:cs="Arial"/>
+                <w:strike/>
+                <w:noProof/>
+                <w:color w:val="000000" w:themeColor="text1"/>
+                <w:sz w:val="24"/>
+                <w:szCs w:val="24"/>
+                <w:u w:val="none"/>
+              </w:rPr>
+              <w:t xml:space="preserve">Informar al Consejo de Administración de los puntos tratados y Acuerdos en cada reunión.</w:t>
+            </w:r>
+          </w:p>
         </w:tc>
         <w:tc>
           <w:tcPr>
@@ -13616,7 +13664,43 @@
           <w:tcPr>
             <w:tcW w:w="4817" w:type="dxa"/>
           </w:tcPr>
-          <w:p/>
+          <w:p>
+            <w:pPr>
+              <w:spacing w:line="276" w:lineRule="auto"/>
+              <w:ind w:left="360" w:hanging="360"/>
+              <w:jc w:val="both"/>
+              <w:rPr>
+                <w:rFonts w:ascii="Arial" w:hAnsi="Arial" w:cs="Arial"/>
+                <w:noProof/>
+                <w:color w:val="000000" w:themeColor="text1"/>
+                <w:sz w:val="24"/>
+                <w:szCs w:val="24"/>
+              </w:rPr>
+            </w:pPr>
+            <w:r>
+              <w:rPr>
+                <w:rFonts w:ascii="Arial" w:hAnsi="Arial" w:cs="Arial"/>
+                <w:noProof/>
+                <w:color w:val="000000" w:themeColor="text1"/>
+                <w:sz w:val="24"/>
+                <w:szCs w:val="24"/>
+                <w:u w:val="none"/>
+              </w:rPr>
+              <w:t xml:space="preserve">t) </w:t>
+            </w:r>
+            <w:r>
+              <w:rPr>
+                <w:rFonts w:ascii="Arial" w:hAnsi="Arial" w:cs="Arial"/>
+                <w:strike/>
+                <w:noProof/>
+                <w:color w:val="000000" w:themeColor="text1"/>
+                <w:sz w:val="24"/>
+                <w:szCs w:val="24"/>
+                <w:u w:val="none"/>
+              </w:rPr>
+              <w:t xml:space="preserve">Otras funciones y responsabilidad que le sean delegadas por el Consejo de Administración.</w:t>
+            </w:r>
+          </w:p>
         </w:tc>
         <w:tc>
           <w:tcPr>
@@ -13952,31 +14036,7 @@
           <w:tcPr>
             <w:tcW w:w="4817" w:type="dxa"/>
           </w:tcPr>
-          <w:p>
-            <w:pPr>
-              <w:spacing w:line="276" w:lineRule="auto"/>
-              <w:ind w:left="360" w:hanging="360"/>
-              <w:jc w:val="both"/>
-              <w:rPr>
-                <w:rFonts w:ascii="Arial" w:hAnsi="Arial" w:cs="Arial"/>
-                <w:noProof/>
-                <w:color w:val="000000" w:themeColor="text1"/>
-                <w:sz w:val="24"/>
-                <w:szCs w:val="24"/>
-              </w:rPr>
-            </w:pPr>
-            <w:r>
-              <w:rPr>
-                <w:rFonts w:ascii="Arial" w:hAnsi="Arial" w:cs="Arial"/>
-                <w:noProof/>
-                <w:color w:val="000000" w:themeColor="text1"/>
-                <w:sz w:val="24"/>
-                <w:szCs w:val="24"/>
-                <w:u w:val="none"/>
-              </w:rPr>
-              <w:t xml:space="preserve">t) Otras funciones y responsabilidad que le sean delegadas por el Consejo de Administración.</w:t>
-            </w:r>
-          </w:p>
+          <w:p/>
         </w:tc>
         <w:tc>
           <w:tcPr>
@@ -14010,7 +14070,19 @@
                 <w:szCs w:val="24"/>
                 <w:u w:val="none"/>
               </w:rPr>
-              <w:t xml:space="preserve">z) Otras funciones y responsabilidad que le sean delegadas por el Consejo de Administración.</w:t>
+              <w:t xml:space="preserve">z) </w:t>
+            </w:r>
+            <w:r>
+              <w:rPr>
+                <w:rFonts w:eastAsia="Arial" w:cs="Arial"/>
+                <w:b w:val="0"/>
+                <w:i w:val="0"/>
+                <w:color w:val="000000" w:themeColor="text1"/>
+                <w:sz w:val="24"/>
+                <w:szCs w:val="24"/>
+                <w:u w:val="single"/>
+              </w:rPr>
+              <w:t xml:space="preserve">Otras funciones y responsabilidad que le sean delegadas por el Consejo de Administración.</w:t>
             </w:r>
           </w:p>
         </w:tc>
@@ -14291,6 +14363,7 @@
           <w:p>
             <w:pPr>
               <w:spacing w:line="276" w:lineRule="auto"/>
+              <w:ind w:left="360" w:hanging="360"/>
               <w:jc w:val="both"/>
               <w:rPr>
                 <w:rFonts w:ascii="Arial" w:hAnsi="Arial" w:cs="Arial"/>
@@ -14309,7 +14382,7 @@
                 <w:szCs w:val="24"/>
                 <w:u w:val="none"/>
               </w:rPr>
-              <w:t xml:space="preserve">El Comité de Finanzas, </w:t>
+              <w:t xml:space="preserve">a) El Comité de Finanzas, </w:t>
             </w:r>
             <w:r>
               <w:rPr>
@@ -15965,7 +16038,7 @@
               <w:autoSpaceDN w:val="0"/>
               <w:adjustRightInd w:val="0"/>
               <w:spacing w:line="276" w:lineRule="auto"/>
-              <w:ind w:left="360" w:hanging="360"/>
+              <w:ind w:left="720" w:hanging="360"/>
               <w:jc w:val="both"/>
               <w:rPr>
                 <w:rFonts w:ascii="Arial" w:hAnsi="Arial" w:cs="Arial"/>
@@ -15984,7 +16057,7 @@
                 <w:u w:val="none"/>
                 <w:lang w:val="es-SV" w:eastAsia="es-SV"/>
               </w:rPr>
-              <w:t xml:space="preserve">a) Cualquier diferencia de criterio entre la gerencia y los Auditores Externos, respecto a políticas y prácticas contables;</w:t>
+              <w:t xml:space="preserve">i. Cualquier diferencia de criterio entre la gerencia y los Auditores Externos, respecto a políticas y prácticas contables;</w:t>
             </w:r>
           </w:p>
         </w:tc>
@@ -15999,7 +16072,7 @@
               <w:autoSpaceDN w:val="0"/>
               <w:adjustRightInd w:val="0"/>
               <w:spacing w:line="276" w:lineRule="auto"/>
-              <w:ind w:left="360" w:hanging="360"/>
+              <w:ind w:left="720" w:hanging="360"/>
               <w:jc w:val="both"/>
               <w:rPr>
                 <w:rFonts w:ascii="Arial" w:hAnsi="Arial" w:cs="Arial"/>
@@ -16018,7 +16091,7 @@
                 <w:u w:val="none"/>
                 <w:lang w:val="es-SV" w:eastAsia="es-SV"/>
               </w:rPr>
-              <w:t xml:space="preserve">l) Cualquier diferencia de criterio entre la gerencia y los Auditores Externos, respecto a políticas y prácticas contables;</w:t>
+              <w:t xml:space="preserve">i. Cualquier diferencia de criterio entre la gerencia y los Auditores Externos, respecto a políticas y prácticas contables;</w:t>
             </w:r>
           </w:p>
         </w:tc>
@@ -16035,7 +16108,7 @@
               <w:autoSpaceDN w:val="0"/>
               <w:adjustRightInd w:val="0"/>
               <w:spacing w:line="276" w:lineRule="auto"/>
-              <w:ind w:left="360" w:hanging="360"/>
+              <w:ind w:left="720" w:hanging="360"/>
               <w:jc w:val="both"/>
               <w:rPr>
                 <w:rFonts w:ascii="Arial" w:hAnsi="Arial" w:cs="Arial"/>
@@ -16054,7 +16127,7 @@
                 <w:u w:val="none"/>
                 <w:lang w:val="es-SV" w:eastAsia="es-SV"/>
               </w:rPr>
-              <w:t xml:space="preserve">b) El informe final de los Auditores Externos, especialmente en lo referente a las salvedades o cualquier calificación de la opinión; y</w:t>
+              <w:t xml:space="preserve">ii. El informe final de los Auditores Externos, especialmente en lo referente a las salvedades o cualquier calificación de la opinión; y</w:t>
             </w:r>
           </w:p>
         </w:tc>
@@ -16069,7 +16142,7 @@
               <w:autoSpaceDN w:val="0"/>
               <w:adjustRightInd w:val="0"/>
               <w:spacing w:line="276" w:lineRule="auto"/>
-              <w:ind w:left="360" w:hanging="360"/>
+              <w:ind w:left="720" w:hanging="360"/>
               <w:jc w:val="both"/>
               <w:rPr>
                 <w:rFonts w:ascii="Arial" w:hAnsi="Arial" w:cs="Arial"/>
@@ -16088,7 +16161,7 @@
                 <w:u w:val="none"/>
                 <w:lang w:val="es-SV" w:eastAsia="es-SV"/>
               </w:rPr>
-              <w:t xml:space="preserve">m) El informe final de los Auditores Externos, especialmente en lo referente a las salvedades o cualquier calificación de la opinión; y</w:t>
+              <w:t xml:space="preserve">ii. El informe final de los Auditores Externos, especialmente en lo referente a las salvedades o cualquier calificación de la opinión; y</w:t>
             </w:r>
           </w:p>
         </w:tc>
@@ -16105,7 +16178,7 @@
               <w:autoSpaceDN w:val="0"/>
               <w:adjustRightInd w:val="0"/>
               <w:spacing w:line="276" w:lineRule="auto"/>
-              <w:ind w:left="360" w:hanging="360"/>
+              <w:ind w:left="720" w:hanging="360"/>
               <w:jc w:val="both"/>
               <w:rPr>
                 <w:rFonts w:ascii="Arial" w:hAnsi="Arial" w:cs="Arial"/>
@@ -16124,7 +16197,7 @@
                 <w:u w:val="none"/>
                 <w:lang w:val="es-SV" w:eastAsia="es-SV"/>
               </w:rPr>
-              <w:t xml:space="preserve">c) El análisis realizado desde el punto de vista técnico para contratar al mismo auditor externo para el período siguiente o de sustituirlo en su caso.</w:t>
+              <w:t xml:space="preserve">iii. El análisis realizado desde el punto de vista técnico para contratar al mismo auditor externo para el período siguiente o de sustituirlo en su caso.</w:t>
             </w:r>
           </w:p>
         </w:tc>
@@ -16139,7 +16212,7 @@
               <w:autoSpaceDN w:val="0"/>
               <w:adjustRightInd w:val="0"/>
               <w:spacing w:line="276" w:lineRule="auto"/>
-              <w:ind w:left="360" w:hanging="360"/>
+              <w:ind w:left="720" w:hanging="360"/>
               <w:jc w:val="both"/>
               <w:rPr>
                 <w:rFonts w:ascii="Arial" w:hAnsi="Arial" w:cs="Arial"/>
@@ -16158,7 +16231,7 @@
                 <w:u w:val="none"/>
                 <w:lang w:val="es-SV" w:eastAsia="es-SV"/>
               </w:rPr>
-              <w:t xml:space="preserve">n) El análisis realizado desde el punto de vista técnico para contratar al mismo auditor externo para el período siguiente o de sustituirlo en su caso.</w:t>
+              <w:t xml:space="preserve">iii. El análisis realizado desde el punto de vista técnico para contratar al mismo auditor externo para el período siguiente o de sustituirlo en su caso.</w:t>
             </w:r>
           </w:p>
         </w:tc>
@@ -16228,7 +16301,7 @@
                 <w:u w:val="none"/>
                 <w:lang w:val="es-SV" w:eastAsia="es-SV"/>
               </w:rPr>
-              <w:t xml:space="preserve">o) Proponer al Consejo de Administración y ésta a su vez a la Asamblea General de Asociados el nombramiento de los Auditores Externos y del Auditor Fiscal. En la contratación de los Auditores Externos deberá considerarse su independencia respecto de otros servicios profesionales proporcionados, tal como lo establece el artículo relativo a la incompatibilidad con otros servicios profesionales establecido en las “Normas Técnicas para la Prestación de Servicios de Auditoría Externa”.</w:t>
+              <w:t xml:space="preserve">l) Proponer al Consejo de Administración y ésta a su vez a la Asamblea General de Asociados el nombramiento de los Auditores Externos y del Auditor Fiscal. En la contratación de los Auditores Externos deberá considerarse su independencia respecto de otros servicios profesionales proporcionados, tal como lo establece el artículo relativo a la incompatibilidad con otros servicios profesionales establecido en las “Normas Técnicas para la Prestación de Servicios de Auditoría Externa”.</w:t>
             </w:r>
           </w:p>
         </w:tc>
@@ -16264,21 +16337,51 @@
                 <w:u w:val="none"/>
                 <w:lang w:val="es-SV" w:eastAsia="es-SV"/>
               </w:rPr>
-              <w:t xml:space="preserve">m) </w:t>
-            </w:r>
-            <w:r>
-              <w:rPr>
-                <w:rFonts w:ascii="Arial" w:hAnsi="Arial" w:cs="Arial"/>
-                <w:strike/>
-                <w:color w:val="000000" w:themeColor="text1"/>
-                <w:sz w:val="24"/>
-                <w:szCs w:val="24"/>
-                <w:u w:val="none"/>
+              <w:t xml:space="preserve">m) Supervisar el cumplimiento del contrato de auditoría externa, monitorear el proceso de respuesta a las observaciones incluidas por el Auditor Externo en su Carta de Gerencia.</w:t>
+            </w:r>
+          </w:p>
+        </w:tc>
+        <w:tc>
+          <w:tcPr>
+            <w:tcW w:w="4817" w:type="dxa"/>
+          </w:tcPr>
+          <w:p>
+            <w:pPr>
+              <w:pStyle w:val="Prrafodelista"/>
+              <w:autoSpaceDE w:val="0"/>
+              <w:autoSpaceDN w:val="0"/>
+              <w:adjustRightInd w:val="0"/>
+              <w:spacing w:line="276" w:lineRule="auto"/>
+              <w:ind w:left="360" w:hanging="360"/>
+              <w:jc w:val="both"/>
+              <w:rPr>
+                <w:rFonts w:ascii="Arial" w:hAnsi="Arial" w:cs="Arial"/>
+                <w:color w:val="000000" w:themeColor="text1"/>
+                <w:sz w:val="24"/>
+                <w:szCs w:val="24"/>
                 <w:lang w:val="es-SV" w:eastAsia="es-SV"/>
               </w:rPr>
-              <w:t xml:space="preserve">Supervisar el cumplimiento del contrato de auditoría externa, monitorear el proceso de respuesta a las observaciones incluidas por el Auditor Externo en su Carta de Gerencia.</w:t>
-            </w:r>
-          </w:p>
+            </w:pPr>
+            <w:r>
+              <w:rPr>
+                <w:rFonts w:ascii="Arial" w:hAnsi="Arial" w:cs="Arial"/>
+                <w:color w:val="000000" w:themeColor="text1"/>
+                <w:sz w:val="24"/>
+                <w:szCs w:val="24"/>
+                <w:u w:val="none"/>
+                <w:lang w:val="es-SV" w:eastAsia="es-SV"/>
+              </w:rPr>
+              <w:t xml:space="preserve">m) Supervisar el cumplimiento del contrato de auditoría externa, monitorear el proceso de respuesta a las observaciones incluidas por el Auditor Externo en su Carta de Gerencia.</w:t>
+            </w:r>
+          </w:p>
+        </w:tc>
+      </w:tr>
+      <w:tr>
+        <w:tc>
+          <w:tcPr>
+            <w:tcW w:w="4817" w:type="dxa"/>
+          </w:tcPr>
+          <w:p/>
         </w:tc>
         <w:tc>
           <w:tcPr>
@@ -16651,6 +16754,7 @@
               <w:autoSpaceDN w:val="0"/>
               <w:adjustRightInd w:val="0"/>
               <w:spacing w:line="276" w:lineRule="auto"/>
+              <w:ind w:left="360" w:hanging="360"/>
               <w:jc w:val="both"/>
               <w:rPr>
                 <w:rFonts w:ascii="Arial" w:hAnsi="Arial" w:cs="Arial"/>
@@ -16669,7 +16773,7 @@
                 <w:u w:val="none"/>
                 <w:lang w:val="es-SV" w:eastAsia="es-SV"/>
               </w:rPr>
-              <w:t xml:space="preserve">El </w:t>
+              <w:t xml:space="preserve">a) </w:t>
             </w:r>
             <w:r>
               <w:rPr>
@@ -16681,9 +16785,23 @@
                 <w:u w:val="none"/>
                 <w:lang w:val="es-SV" w:eastAsia="es-SV"/>
               </w:rPr>
-              <w:t xml:space="preserve">Comité se reúne como mínimo una vez al mes y los acuerdos, recomendaciones e informes que se produzcan deberán quedar consignados en sus actas.</w:t>
-            </w:r>
-          </w:p>
+              <w:t xml:space="preserve">El Comité se reúne como mínimo una vez al mes y los acuerdos, recomendaciones e informes que se produzcan deberán quedar consignados en sus actas.</w:t>
+            </w:r>
+          </w:p>
+        </w:tc>
+        <w:tc>
+          <w:tcPr>
+            <w:tcW w:w="4817" w:type="dxa"/>
+          </w:tcPr>
+          <w:p/>
+        </w:tc>
+      </w:tr>
+      <w:tr>
+        <w:tc>
+          <w:tcPr>
+            <w:tcW w:w="4817" w:type="dxa"/>
+          </w:tcPr>
+          <w:p/>
         </w:tc>
         <w:tc>
           <w:tcPr>
@@ -16717,7 +16835,7 @@
                 <w:szCs w:val="24"/>
                 <w:u w:val="none"/>
               </w:rPr>
-              <w:t xml:space="preserve">b) El </w:t>
+              <w:t xml:space="preserve">b) </w:t>
             </w:r>
             <w:r>
               <w:rPr>
@@ -16729,7 +16847,7 @@
                 <w:szCs w:val="24"/>
                 <w:u w:val="single"/>
               </w:rPr>
-              <w:t xml:space="preserve">Auditor Interno será el secretario del Comité, y levantará el acta de cada una de las sesiones mantenidas, que será aprobada en la sesión inmediatamente posterior. Las actas del Comité deberán estar a disposición de todos los directores del Consejo de Administración.</w:t>
+              <w:t xml:space="preserve">El Auditor Interno será el secretario del Comité, y levantará el acta de cada una de las sesiones mantenidas, que será aprobada en la sesión inmediatamente posterior. Las actas del Comité deberán estar a disposición de todos los directores del Consejo de Administración.</w:t>
             </w:r>
           </w:p>
         </w:tc>
@@ -17636,12 +17754,6 @@
           <w:tcPr>
             <w:tcW w:w="4817" w:type="dxa"/>
           </w:tcPr>
-          <w:p/>
-        </w:tc>
-        <w:tc>
-          <w:tcPr>
-            <w:tcW w:w="4817" w:type="dxa"/>
-          </w:tcPr>
           <w:p>
             <w:pPr>
               <w:pStyle w:val="Prrafodelista"/>
@@ -17673,18 +17785,17 @@
             <w:r>
               <w:rPr>
                 <w:rFonts w:ascii="Arial" w:hAnsi="Arial" w:cs="Arial"/>
-                <w:color w:val="000000" w:themeColor="text1"/>
-                <w:sz w:val="24"/>
-                <w:szCs w:val="24"/>
-                <w:u w:val="single"/>
+                <w:strike/>
+                <w:color w:val="000000" w:themeColor="text1"/>
+                <w:sz w:val="24"/>
+                <w:szCs w:val="24"/>
+                <w:u w:val="none"/>
                 <w:lang w:val="es-SV" w:eastAsia="es-SV"/>
               </w:rPr>
-              <w:t xml:space="preserve">Informar al Consejo de Administración sobre las exposiciones, desviaciones y excepciones de los riesgos que son gestionados en la Cooperativa.</w:t>
-            </w:r>
-          </w:p>
-        </w:tc>
-      </w:tr>
-      <w:tr>
+              <w:t xml:space="preserve">Velar por que la Cooperativa cuente con la adecuada estructura organizacional, estrategias, políticas y recursos para la gestión integral de riesgos.</w:t>
+            </w:r>
+          </w:p>
+        </w:tc>
         <w:tc>
           <w:tcPr>
             <w:tcW w:w="4817" w:type="dxa"/>
@@ -17715,7 +17826,66 @@
                 <w:u w:val="none"/>
                 <w:lang w:val="es-SV" w:eastAsia="es-SV"/>
               </w:rPr>
-              <w:t xml:space="preserve">c) Velar por que la Cooperativa cuente con la adecuada estructura organizacional, estrategias, políticas y recursos para la gestión integral de riesgos.</w:t>
+              <w:t xml:space="preserve">c) </w:t>
+            </w:r>
+            <w:r>
+              <w:rPr>
+                <w:rFonts w:ascii="Arial" w:hAnsi="Arial" w:cs="Arial"/>
+                <w:color w:val="000000" w:themeColor="text1"/>
+                <w:sz w:val="24"/>
+                <w:szCs w:val="24"/>
+                <w:u w:val="single"/>
+                <w:lang w:val="es-SV" w:eastAsia="es-SV"/>
+              </w:rPr>
+              <w:t xml:space="preserve">Informar al Consejo de Administración sobre las exposiciones, desviaciones y excepciones de los riesgos que son gestionados en la Cooperativa.</w:t>
+            </w:r>
+          </w:p>
+        </w:tc>
+      </w:tr>
+      <w:tr>
+        <w:tc>
+          <w:tcPr>
+            <w:tcW w:w="4817" w:type="dxa"/>
+          </w:tcPr>
+          <w:p>
+            <w:pPr>
+              <w:pStyle w:val="Prrafodelista"/>
+              <w:autoSpaceDE w:val="0"/>
+              <w:autoSpaceDN w:val="0"/>
+              <w:adjustRightInd w:val="0"/>
+              <w:spacing w:line="276" w:lineRule="auto"/>
+              <w:ind w:left="360" w:hanging="360"/>
+              <w:jc w:val="both"/>
+              <w:rPr>
+                <w:rFonts w:ascii="Arial" w:hAnsi="Arial" w:cs="Arial"/>
+                <w:color w:val="000000" w:themeColor="text1"/>
+                <w:sz w:val="24"/>
+                <w:szCs w:val="24"/>
+                <w:lang w:val="es-SV" w:eastAsia="es-SV"/>
+              </w:rPr>
+            </w:pPr>
+            <w:r>
+              <w:rPr>
+                <w:rFonts w:ascii="Arial" w:hAnsi="Arial" w:cs="Arial"/>
+                <w:color w:val="000000" w:themeColor="text1"/>
+                <w:sz w:val="24"/>
+                <w:szCs w:val="24"/>
+                <w:u w:val="none"/>
+                <w:lang w:val="es-SV" w:eastAsia="es-SV"/>
+              </w:rPr>
+              <w:t xml:space="preserve">d) </w:t>
+            </w:r>
+            <w:r>
+              <w:rPr>
+                <w:rFonts w:ascii="Arial" w:hAnsi="Arial" w:cs="Arial"/>
+                <w:strike/>
+                <w:color w:val="000000" w:themeColor="text1"/>
+                <w:sz w:val="24"/>
+                <w:szCs w:val="24"/>
+                <w:u w:val="none"/>
+                <w:lang w:val="es-SV" w:eastAsia="es-SV"/>
+              </w:rPr>
+              <w:t xml:space="preserve">Asegurar e informar al Consejo de Administración la correcta ejecución de las estrategias y políticas aprobadas.</w:t>
             </w:r>
           </w:p>
         </w:tc>
@@ -17749,7 +17919,18 @@
                 <w:u w:val="none"/>
                 <w:lang w:val="es-SV" w:eastAsia="es-SV"/>
               </w:rPr>
-              <w:t xml:space="preserve">d) Velar por que la Cooperativa cuente con la adecuada estructura organizacional, estrategias, políticas y recursos para la gestión integral de riesgos.</w:t>
+              <w:t xml:space="preserve">d) </w:t>
+            </w:r>
+            <w:r>
+              <w:rPr>
+                <w:rFonts w:ascii="Arial" w:hAnsi="Arial" w:cs="Arial"/>
+                <w:color w:val="000000" w:themeColor="text1"/>
+                <w:sz w:val="24"/>
+                <w:szCs w:val="24"/>
+                <w:u w:val="single"/>
+                <w:lang w:val="es-SV" w:eastAsia="es-SV"/>
+              </w:rPr>
+              <w:t xml:space="preserve">Velar por que la Cooperativa cuente con la adecuada estructura organizacional, estrategias, políticas y recursos para la gestión integral de riesgos.</w:t>
             </w:r>
           </w:p>
         </w:tc>
@@ -17785,7 +17966,7 @@
                 <w:u w:val="none"/>
                 <w:lang w:val="es-SV" w:eastAsia="es-SV"/>
               </w:rPr>
-              <w:t xml:space="preserve">d) Asegurar e informar al Consejo de Administración la </w:t>
+              <w:t xml:space="preserve">e) </w:t>
             </w:r>
             <w:r>
               <w:rPr>
@@ -17797,7 +17978,7 @@
                 <w:u w:val="none"/>
                 <w:lang w:val="es-SV" w:eastAsia="es-SV"/>
               </w:rPr>
-              <w:t xml:space="preserve">correcta</w:t>
+              <w:t xml:space="preserve">Proponer</w:t>
             </w:r>
             <w:r>
               <w:rPr>
@@ -17808,7 +17989,19 @@
                 <w:u w:val="none"/>
                 <w:lang w:val="es-SV" w:eastAsia="es-SV"/>
               </w:rPr>
-              <w:t xml:space="preserve"> ejecución de las estrategias y políticas aprobadas.</w:t>
+              <w:t xml:space="preserve"> al Consejo de Administración </w:t>
+            </w:r>
+            <w:r>
+              <w:rPr>
+                <w:rFonts w:ascii="Arial" w:hAnsi="Arial" w:cs="Arial"/>
+                <w:strike/>
+                <w:color w:val="000000" w:themeColor="text1"/>
+                <w:sz w:val="24"/>
+                <w:szCs w:val="24"/>
+                <w:u w:val="none"/>
+                <w:lang w:val="es-SV" w:eastAsia="es-SV"/>
+              </w:rPr>
+              <w:t xml:space="preserve">los límites de tolerancia a la exposición para cada tipo de riesgo</w:t>
             </w:r>
           </w:p>
         </w:tc>
@@ -17842,7 +18035,40 @@
                 <w:u w:val="none"/>
                 <w:lang w:val="es-SV" w:eastAsia="es-SV"/>
               </w:rPr>
-              <w:t xml:space="preserve">e) Asegurar e informar al Consejo de Administración la ejecución de las estrategias y políticas aprobadas.</w:t>
+              <w:t xml:space="preserve">e) </w:t>
+            </w:r>
+            <w:r>
+              <w:rPr>
+                <w:rFonts w:ascii="Arial" w:hAnsi="Arial" w:cs="Arial"/>
+                <w:color w:val="000000" w:themeColor="text1"/>
+                <w:sz w:val="24"/>
+                <w:szCs w:val="24"/>
+                <w:u w:val="single"/>
+                <w:lang w:val="es-SV" w:eastAsia="es-SV"/>
+              </w:rPr>
+              <w:t xml:space="preserve">Asegurar e informar</w:t>
+            </w:r>
+            <w:r>
+              <w:rPr>
+                <w:rFonts w:ascii="Arial" w:hAnsi="Arial" w:cs="Arial"/>
+                <w:color w:val="000000" w:themeColor="text1"/>
+                <w:sz w:val="24"/>
+                <w:szCs w:val="24"/>
+                <w:u w:val="none"/>
+                <w:lang w:val="es-SV" w:eastAsia="es-SV"/>
+              </w:rPr>
+              <w:t xml:space="preserve"> al Consejo de Administración </w:t>
+            </w:r>
+            <w:r>
+              <w:rPr>
+                <w:rFonts w:ascii="Arial" w:hAnsi="Arial" w:cs="Arial"/>
+                <w:color w:val="000000" w:themeColor="text1"/>
+                <w:sz w:val="24"/>
+                <w:szCs w:val="24"/>
+                <w:u w:val="single"/>
+                <w:lang w:val="es-SV" w:eastAsia="es-SV"/>
+              </w:rPr>
+              <w:t xml:space="preserve">la ejecución de las estrategias y políticas aprobadas.</w:t>
             </w:r>
           </w:p>
         </w:tc>
@@ -17878,7 +18104,42 @@
                 <w:u w:val="none"/>
                 <w:lang w:val="es-SV" w:eastAsia="es-SV"/>
               </w:rPr>
-              <w:t xml:space="preserve">e) Proponer al Consejo de Administración los límites de tolerancia a la exposición para cada tipo de riesgo</w:t>
+              <w:t xml:space="preserve">f) </w:t>
+            </w:r>
+            <w:r>
+              <w:rPr>
+                <w:rFonts w:ascii="Arial" w:hAnsi="Arial" w:cs="Arial"/>
+                <w:strike/>
+                <w:color w:val="000000" w:themeColor="text1"/>
+                <w:sz w:val="24"/>
+                <w:szCs w:val="24"/>
+                <w:u w:val="none"/>
+                <w:lang w:val="es-SV" w:eastAsia="es-SV"/>
+              </w:rPr>
+              <w:t xml:space="preserve">Requerir y dar seguimiento a los planes correctivos para normalizar incumplimientos a</w:t>
+            </w:r>
+            <w:r>
+              <w:rPr>
+                <w:rFonts w:ascii="Arial" w:hAnsi="Arial" w:cs="Arial"/>
+                <w:color w:val="000000" w:themeColor="text1"/>
+                <w:sz w:val="24"/>
+                <w:szCs w:val="24"/>
+                <w:u w:val="none"/>
+                <w:lang w:val="es-SV" w:eastAsia="es-SV"/>
+              </w:rPr>
+              <w:t xml:space="preserve"> los límites de exposición </w:t>
+            </w:r>
+            <w:r>
+              <w:rPr>
+                <w:rFonts w:ascii="Arial" w:hAnsi="Arial" w:cs="Arial"/>
+                <w:strike/>
+                <w:color w:val="000000" w:themeColor="text1"/>
+                <w:sz w:val="24"/>
+                <w:szCs w:val="24"/>
+                <w:u w:val="none"/>
+                <w:lang w:val="es-SV" w:eastAsia="es-SV"/>
+              </w:rPr>
+              <w:t xml:space="preserve">o deficiencias reportadas.</w:t>
             </w:r>
           </w:p>
         </w:tc>
@@ -17912,7 +18173,7 @@
                 <w:u w:val="none"/>
                 <w:lang w:val="es-SV" w:eastAsia="es-SV"/>
               </w:rPr>
-              <w:t xml:space="preserve">f) Proponer al Consejo de Administración los límites de tolerancia a la exposición para cada tipo de riesgo, </w:t>
+              <w:t xml:space="preserve">f) </w:t>
             </w:r>
             <w:r>
               <w:rPr>
@@ -17923,18 +18184,34 @@
                 <w:u w:val="single"/>
                 <w:lang w:val="es-SV" w:eastAsia="es-SV"/>
               </w:rPr>
-              <w:t xml:space="preserve">los casos o circunstancias especiales en los cuales se puedan exceder los límites de exposición, así como los controles especiales sobre dichas circunstancias.</w:t>
+              <w:t xml:space="preserve">Proponer al Consejo de Administración los límites de tolerancia a la exposición para cada tipo de riesgo, los casos o circunstancias especiales en los cuales se puedan exceder</w:t>
+            </w:r>
+            <w:r>
+              <w:rPr>
+                <w:rFonts w:ascii="Arial" w:hAnsi="Arial" w:cs="Arial"/>
+                <w:color w:val="000000" w:themeColor="text1"/>
+                <w:sz w:val="24"/>
+                <w:szCs w:val="24"/>
+                <w:u w:val="none"/>
+                <w:lang w:val="es-SV" w:eastAsia="es-SV"/>
+              </w:rPr>
+              <w:t xml:space="preserve"> los límites de exposición, </w:t>
+            </w:r>
+            <w:r>
+              <w:rPr>
+                <w:rFonts w:ascii="Arial" w:hAnsi="Arial" w:cs="Arial"/>
+                <w:color w:val="000000" w:themeColor="text1"/>
+                <w:sz w:val="24"/>
+                <w:szCs w:val="24"/>
+                <w:u w:val="single"/>
+                <w:lang w:val="es-SV" w:eastAsia="es-SV"/>
+              </w:rPr>
+              <w:t xml:space="preserve">así como los controles especiales sobre dichas circunstancias.</w:t>
             </w:r>
           </w:p>
         </w:tc>
       </w:tr>
       <w:tr>
-        <w:tc>
-          <w:tcPr>
-            <w:tcW w:w="4817" w:type="dxa"/>
-          </w:tcPr>
-          <w:p/>
-        </w:tc>
         <w:tc>
           <w:tcPr>
             <w:tcW w:w="4817" w:type="dxa"/>
@@ -17970,18 +18247,17 @@
             <w:r>
               <w:rPr>
                 <w:rFonts w:ascii="Arial" w:hAnsi="Arial" w:cs="Arial"/>
-                <w:color w:val="000000" w:themeColor="text1"/>
-                <w:sz w:val="24"/>
-                <w:szCs w:val="24"/>
-                <w:u w:val="single"/>
+                <w:strike/>
+                <w:color w:val="000000" w:themeColor="text1"/>
+                <w:sz w:val="24"/>
+                <w:szCs w:val="24"/>
+                <w:u w:val="none"/>
                 <w:lang w:val="es-SV" w:eastAsia="es-SV"/>
               </w:rPr>
-              <w:t xml:space="preserve">Aprobar las acciones correctivas propuestas por el Departamento de Administración de Riesgos y las áreas involucradas, así como los mecanismos para la implementación de las mismas, en el caso que exista desviación con respecto a los niveles o límites de exposición asumidos.</w:t>
-            </w:r>
-          </w:p>
-        </w:tc>
-      </w:tr>
-      <w:tr>
+              <w:t xml:space="preserve">Dar seguimiento a los informes emitidos por la Superintendencia del Sistema Financiero, Auditoría Interna y Externa, para atender las observaciones y recomendaciones que formulen sobre la gestión de riesgos.</w:t>
+            </w:r>
+          </w:p>
+        </w:tc>
         <w:tc>
           <w:tcPr>
             <w:tcW w:w="4817" w:type="dxa"/>
@@ -18012,10 +18288,23 @@
                 <w:u w:val="none"/>
                 <w:lang w:val="es-SV" w:eastAsia="es-SV"/>
               </w:rPr>
-              <w:t xml:space="preserve">f) Requerir y dar seguimiento a los planes correctivos para normalizar incumplimientos a los límites de exposición o deficiencias reportadas.</w:t>
-            </w:r>
-          </w:p>
-        </w:tc>
+              <w:t xml:space="preserve">g) </w:t>
+            </w:r>
+            <w:r>
+              <w:rPr>
+                <w:rFonts w:ascii="Arial" w:hAnsi="Arial" w:cs="Arial"/>
+                <w:color w:val="000000" w:themeColor="text1"/>
+                <w:sz w:val="24"/>
+                <w:szCs w:val="24"/>
+                <w:u w:val="single"/>
+                <w:lang w:val="es-SV" w:eastAsia="es-SV"/>
+              </w:rPr>
+              <w:t xml:space="preserve">Aprobar las acciones correctivas propuestas por el Departamento de Administración de Riesgos y las áreas involucradas, así como los mecanismos para la implementación de las mismas, en el caso que exista desviación con respecto a los niveles o límites de exposición asumidos.</w:t>
+            </w:r>
+          </w:p>
+        </w:tc>
+      </w:tr>
+      <w:tr>
         <w:tc>
           <w:tcPr>
             <w:tcW w:w="4817" w:type="dxa"/>
@@ -18046,12 +18335,22 @@
                 <w:u w:val="none"/>
                 <w:lang w:val="es-SV" w:eastAsia="es-SV"/>
               </w:rPr>
-              <w:t xml:space="preserve">h) Requerir y dar seguimiento a los planes correctivos para normalizar incumplimientos a los límites de exposición o deficiencias reportadas.</w:t>
-            </w:r>
-          </w:p>
-        </w:tc>
-      </w:tr>
-      <w:tr>
+              <w:t xml:space="preserve">h) </w:t>
+            </w:r>
+            <w:r>
+              <w:rPr>
+                <w:rFonts w:ascii="Arial" w:hAnsi="Arial" w:cs="Arial"/>
+                <w:strike/>
+                <w:color w:val="000000" w:themeColor="text1"/>
+                <w:sz w:val="24"/>
+                <w:szCs w:val="24"/>
+                <w:u w:val="none"/>
+                <w:lang w:val="es-SV" w:eastAsia="es-SV"/>
+              </w:rPr>
+              <w:t xml:space="preserve">Trabajar coordinadamente con los otros comités de la Cooperativa para fortalecer el funcionamiento de un sistema de control interno adecuado a la complejidad y riesgos inherentes a las actividades de la Cooperativa.</w:t>
+            </w:r>
+          </w:p>
+        </w:tc>
         <w:tc>
           <w:tcPr>
             <w:tcW w:w="4817" w:type="dxa"/>
@@ -18082,10 +18381,23 @@
                 <w:u w:val="none"/>
                 <w:lang w:val="es-SV" w:eastAsia="es-SV"/>
               </w:rPr>
-              <w:t xml:space="preserve">g) Dar seguimiento a los informes emitidos por la Superintendencia del Sistema Financiero, Auditoría Interna y Externa, para atender las observaciones y recomendaciones que formulen sobre la gestión de riesgos.</w:t>
-            </w:r>
-          </w:p>
-        </w:tc>
+              <w:t xml:space="preserve">h) </w:t>
+            </w:r>
+            <w:r>
+              <w:rPr>
+                <w:rFonts w:ascii="Arial" w:hAnsi="Arial" w:cs="Arial"/>
+                <w:color w:val="000000" w:themeColor="text1"/>
+                <w:sz w:val="24"/>
+                <w:szCs w:val="24"/>
+                <w:u w:val="single"/>
+                <w:lang w:val="es-SV" w:eastAsia="es-SV"/>
+              </w:rPr>
+              <w:t xml:space="preserve">Requerir y dar seguimiento a los planes correctivos para normalizar incumplimientos a los límites de exposición o deficiencias reportadas.</w:t>
+            </w:r>
+          </w:p>
+        </w:tc>
+      </w:tr>
+      <w:tr>
         <w:tc>
           <w:tcPr>
             <w:tcW w:w="4817" w:type="dxa"/>
@@ -18116,12 +18428,22 @@
                 <w:u w:val="none"/>
                 <w:lang w:val="es-SV" w:eastAsia="es-SV"/>
               </w:rPr>
-              <w:t xml:space="preserve">i) Dar seguimiento a los informes emitidos por la Superintendencia del Sistema Financiero, Auditoría Interna y Externa, para atender las observaciones y recomendaciones que formulen sobre la gestión de riesgos.</w:t>
-            </w:r>
-          </w:p>
-        </w:tc>
-      </w:tr>
-      <w:tr>
+              <w:t xml:space="preserve">i) </w:t>
+            </w:r>
+            <w:r>
+              <w:rPr>
+                <w:rFonts w:ascii="Arial" w:hAnsi="Arial" w:cs="Arial"/>
+                <w:strike/>
+                <w:color w:val="000000" w:themeColor="text1"/>
+                <w:sz w:val="24"/>
+                <w:szCs w:val="24"/>
+                <w:u w:val="none"/>
+                <w:lang w:val="es-SV" w:eastAsia="es-SV"/>
+              </w:rPr>
+              <w:t xml:space="preserve">Validar el Plan anual de capacitaciones de Riesgo, para aprobación del Consejo de Administración.</w:t>
+            </w:r>
+          </w:p>
+        </w:tc>
         <w:tc>
           <w:tcPr>
             <w:tcW w:w="4817" w:type="dxa"/>
@@ -18152,10 +18474,23 @@
                 <w:u w:val="none"/>
                 <w:lang w:val="es-SV" w:eastAsia="es-SV"/>
               </w:rPr>
-              <w:t xml:space="preserve">h) Trabajar coordinadamente con los otros comités de la Cooperativa para fortalecer el funcionamiento de un sistema de control interno adecuado a la complejidad y riesgos inherentes a las actividades de la Cooperativa.</w:t>
-            </w:r>
-          </w:p>
-        </w:tc>
+              <w:t xml:space="preserve">i) </w:t>
+            </w:r>
+            <w:r>
+              <w:rPr>
+                <w:rFonts w:ascii="Arial" w:hAnsi="Arial" w:cs="Arial"/>
+                <w:color w:val="000000" w:themeColor="text1"/>
+                <w:sz w:val="24"/>
+                <w:szCs w:val="24"/>
+                <w:u w:val="single"/>
+                <w:lang w:val="es-SV" w:eastAsia="es-SV"/>
+              </w:rPr>
+              <w:t xml:space="preserve">Dar seguimiento a los informes emitidos por la Superintendencia del Sistema Financiero, Auditoría Interna y Externa, para atender las observaciones y recomendaciones que formulen sobre la gestión de riesgos.</w:t>
+            </w:r>
+          </w:p>
+        </w:tc>
+      </w:tr>
+      <w:tr>
         <w:tc>
           <w:tcPr>
             <w:tcW w:w="4817" w:type="dxa"/>
@@ -18186,17 +18521,21 @@
                 <w:u w:val="none"/>
                 <w:lang w:val="es-SV" w:eastAsia="es-SV"/>
               </w:rPr>
-              <w:t xml:space="preserve">j) Trabajar coordinadamente con los otros comités de la Cooperativa para fortalecer el funcionamiento de un sistema de control interno adecuado a la complejidad y riesgos inherentes a las actividades de la Cooperativa.</w:t>
-            </w:r>
-          </w:p>
-        </w:tc>
-      </w:tr>
-      <w:tr>
-        <w:tc>
-          <w:tcPr>
-            <w:tcW w:w="4817" w:type="dxa"/>
-          </w:tcPr>
-          <w:p/>
+              <w:t xml:space="preserve">j) </w:t>
+            </w:r>
+            <w:r>
+              <w:rPr>
+                <w:rFonts w:ascii="Arial" w:hAnsi="Arial" w:cs="Arial"/>
+                <w:strike/>
+                <w:color w:val="000000" w:themeColor="text1"/>
+                <w:sz w:val="24"/>
+                <w:szCs w:val="24"/>
+                <w:u w:val="none"/>
+                <w:lang w:val="es-SV" w:eastAsia="es-SV"/>
+              </w:rPr>
+              <w:t xml:space="preserve">Desempeñar otras funciones que la Normativa Legal le atribuyan a este Comité.</w:t>
+            </w:r>
+          </w:p>
         </w:tc>
         <w:tc>
           <w:tcPr>
@@ -18228,7 +18567,7 @@
                 <w:u w:val="none"/>
                 <w:lang w:val="es-SV" w:eastAsia="es-SV"/>
               </w:rPr>
-              <w:t xml:space="preserve">k) </w:t>
+              <w:t xml:space="preserve">j) </w:t>
             </w:r>
             <w:r>
               <w:rPr>
@@ -18239,12 +18578,18 @@
                 <w:u w:val="single"/>
                 <w:lang w:val="es-SV" w:eastAsia="es-SV"/>
               </w:rPr>
-              <w:t xml:space="preserve">Informar al Consejo de Administración sobre el resultado de los informes elaborados por el Departamento de Administración de Riesgos</w:t>
+              <w:t xml:space="preserve">Trabajar coordinadamente con los otros comités de la Cooperativa para fortalecer el funcionamiento de un sistema de control interno adecuado a la complejidad y riesgos inherentes a las actividades de la Cooperativa.</w:t>
             </w:r>
           </w:p>
         </w:tc>
       </w:tr>
       <w:tr>
+        <w:tc>
+          <w:tcPr>
+            <w:tcW w:w="4817" w:type="dxa"/>
+          </w:tcPr>
+          <w:p/>
+        </w:tc>
         <w:tc>
           <w:tcPr>
             <w:tcW w:w="4817" w:type="dxa"/>
@@ -18275,32 +18620,28 @@
                 <w:u w:val="none"/>
                 <w:lang w:val="es-SV" w:eastAsia="es-SV"/>
               </w:rPr>
-              <w:t xml:space="preserve">i) Validar el Plan anual de capacitaciones </w:t>
-            </w:r>
-            <w:r>
-              <w:rPr>
-                <w:rFonts w:ascii="Arial" w:hAnsi="Arial" w:cs="Arial"/>
-                <w:strike/>
-                <w:color w:val="000000" w:themeColor="text1"/>
-                <w:sz w:val="24"/>
-                <w:szCs w:val="24"/>
-                <w:u w:val="none"/>
+              <w:t xml:space="preserve">k) </w:t>
+            </w:r>
+            <w:r>
+              <w:rPr>
+                <w:rFonts w:ascii="Arial" w:hAnsi="Arial" w:cs="Arial"/>
+                <w:color w:val="000000" w:themeColor="text1"/>
+                <w:sz w:val="24"/>
+                <w:szCs w:val="24"/>
+                <w:u w:val="single"/>
                 <w:lang w:val="es-SV" w:eastAsia="es-SV"/>
               </w:rPr>
-              <w:t xml:space="preserve">de Riesgo,</w:t>
-            </w:r>
-            <w:r>
-              <w:rPr>
-                <w:rFonts w:ascii="Arial" w:hAnsi="Arial" w:cs="Arial"/>
-                <w:color w:val="000000" w:themeColor="text1"/>
-                <w:sz w:val="24"/>
-                <w:szCs w:val="24"/>
-                <w:u w:val="none"/>
-                <w:lang w:val="es-SV" w:eastAsia="es-SV"/>
-              </w:rPr>
-              <w:t xml:space="preserve"> para aprobación del Consejo de Administración.</w:t>
-            </w:r>
-          </w:p>
+              <w:t xml:space="preserve">Informar al Consejo de Administración sobre el resultado de los informes elaborados por el Departamento de Administración de Riesgos</w:t>
+            </w:r>
+          </w:p>
+        </w:tc>
+      </w:tr>
+      <w:tr>
+        <w:tc>
+          <w:tcPr>
+            <w:tcW w:w="4817" w:type="dxa"/>
+          </w:tcPr>
+          <w:p/>
         </w:tc>
         <w:tc>
           <w:tcPr>
@@ -18332,7 +18673,7 @@
                 <w:u w:val="none"/>
                 <w:lang w:val="es-SV" w:eastAsia="es-SV"/>
               </w:rPr>
-              <w:t xml:space="preserve">l) Validar el Plan anual de capacitaciones </w:t>
+              <w:t xml:space="preserve">l) </w:t>
             </w:r>
             <w:r>
               <w:rPr>
@@ -18343,18 +18684,7 @@
                 <w:u w:val="single"/>
                 <w:lang w:val="es-SV" w:eastAsia="es-SV"/>
               </w:rPr>
-              <w:t xml:space="preserve">relacionadas a la Gestión Integral de Riesgos, Continuidad del Negocio y Seguridad de la Información</w:t>
-            </w:r>
-            <w:r>
-              <w:rPr>
-                <w:rFonts w:ascii="Arial" w:hAnsi="Arial" w:cs="Arial"/>
-                <w:color w:val="000000" w:themeColor="text1"/>
-                <w:sz w:val="24"/>
-                <w:szCs w:val="24"/>
-                <w:u w:val="none"/>
-                <w:lang w:val="es-SV" w:eastAsia="es-SV"/>
-              </w:rPr>
-              <w:t xml:space="preserve"> para aprobación del Consejo de Administración.</w:t>
+              <w:t xml:space="preserve">Validar el Plan anual de capacitaciones relacionadas a la Gestión Integral de Riesgos, Continuidad del Negocio y Seguridad de la Información para aprobación del Consejo de Administración.</w:t>
             </w:r>
           </w:p>
         </w:tc>
@@ -18788,47 +19118,7 @@
           <w:tcPr>
             <w:tcW w:w="4817" w:type="dxa"/>
           </w:tcPr>
-          <w:p>
-            <w:pPr>
-              <w:pStyle w:val="Prrafodelista"/>
-              <w:autoSpaceDE w:val="0"/>
-              <w:autoSpaceDN w:val="0"/>
-              <w:adjustRightInd w:val="0"/>
-              <w:spacing w:line="276" w:lineRule="auto"/>
-              <w:ind w:left="360" w:hanging="360"/>
-              <w:jc w:val="both"/>
-              <w:rPr>
-                <w:rFonts w:ascii="Arial" w:hAnsi="Arial" w:cs="Arial"/>
-                <w:color w:val="000000" w:themeColor="text1"/>
-                <w:sz w:val="24"/>
-                <w:szCs w:val="24"/>
-                <w:lang w:val="es-SV" w:eastAsia="es-SV"/>
-              </w:rPr>
-            </w:pPr>
-            <w:r>
-              <w:rPr>
-                <w:rFonts w:ascii="Arial" w:hAnsi="Arial" w:cs="Arial"/>
-                <w:color w:val="000000" w:themeColor="text1"/>
-                <w:sz w:val="24"/>
-                <w:szCs w:val="24"/>
-                <w:u w:val="none"/>
-                <w:lang w:val="es-SV" w:eastAsia="es-SV"/>
-              </w:rPr>
-              <w:t xml:space="preserve">j) </w:t>
-            </w:r>
-            <w:r>
-              <w:rPr>
-                <w:rFonts w:ascii="Arial" w:hAnsi="Arial" w:cs="Arial"/>
-                <w:strike/>
-                <w:color w:val="000000" w:themeColor="text1"/>
-                <w:sz w:val="24"/>
-                <w:szCs w:val="24"/>
-                <w:u w:val="none"/>
-                <w:lang w:val="es-SV" w:eastAsia="es-SV"/>
-              </w:rPr>
-              <w:t xml:space="preserve">Desempeñar otras funciones que la Normativa Legal le atribuyan a este Comité.</w:t>
-            </w:r>
-          </w:p>
+          <w:p/>
         </w:tc>
         <w:tc>
           <w:tcPr>
@@ -21240,47 +21530,17 @@
                 <w:szCs w:val="24"/>
                 <w:u w:val="none"/>
               </w:rPr>
-              <w:t xml:space="preserve">Revisar y recomendar la aprobación del plan de trabajo anual de Oficialía de Cumplimiento ante Junta Directiva u Órgano equivalente.</w:t>
-            </w:r>
-          </w:p>
-        </w:tc>
-        <w:tc>
-          <w:tcPr>
-            <w:tcW w:w="4817" w:type="dxa"/>
-          </w:tcPr>
-          <w:p/>
-        </w:tc>
-      </w:tr>
-      <w:tr>
-        <w:tc>
-          <w:tcPr>
-            <w:tcW w:w="4817" w:type="dxa"/>
-          </w:tcPr>
-          <w:p>
-            <w:pPr>
-              <w:autoSpaceDE w:val="0"/>
-              <w:autoSpaceDN w:val="0"/>
-              <w:adjustRightInd w:val="0"/>
-              <w:spacing w:line="276" w:lineRule="auto"/>
-              <w:ind w:left="360" w:hanging="360"/>
-              <w:contextualSpacing/>
-              <w:jc w:val="both"/>
-              <w:rPr>
-                <w:rFonts w:ascii="Arial" w:hAnsi="Arial" w:cs="Arial"/>
-                <w:color w:val="000000" w:themeColor="text1"/>
-                <w:sz w:val="24"/>
-                <w:szCs w:val="24"/>
-              </w:rPr>
-            </w:pPr>
-            <w:r>
-              <w:rPr>
-                <w:rFonts w:ascii="Arial" w:hAnsi="Arial" w:cs="Arial"/>
-                <w:color w:val="000000" w:themeColor="text1"/>
-                <w:sz w:val="24"/>
-                <w:szCs w:val="24"/>
-                <w:u w:val="none"/>
-              </w:rPr>
-              <w:t xml:space="preserve">c) </w:t>
+              <w:t xml:space="preserve">Revisar y recomendar la aprobación del plan de trabajo anual</w:t>
+            </w:r>
+            <w:r>
+              <w:rPr>
+                <w:rFonts w:ascii="Arial" w:hAnsi="Arial" w:cs="Arial"/>
+                <w:color w:val="000000" w:themeColor="text1"/>
+                <w:sz w:val="24"/>
+                <w:szCs w:val="24"/>
+                <w:u w:val="none"/>
+              </w:rPr>
+              <w:t xml:space="preserve"> de Oficialía de Cumplimiento </w:t>
             </w:r>
             <w:r>
               <w:rPr>
@@ -21291,17 +21551,7 @@
                 <w:szCs w:val="24"/>
                 <w:u w:val="none"/>
               </w:rPr>
-              <w:t xml:space="preserve">Analizar y recomendar la aprobación del presupuesto de funcionamiento de la</w:t>
-            </w:r>
-            <w:r>
-              <w:rPr>
-                <w:rFonts w:ascii="Arial" w:hAnsi="Arial" w:cs="Arial"/>
-                <w:color w:val="000000" w:themeColor="text1"/>
-                <w:sz w:val="24"/>
-                <w:szCs w:val="24"/>
-                <w:u w:val="none"/>
-              </w:rPr>
-              <w:t xml:space="preserve"> Oficialía de Cumplimiento.</w:t>
+              <w:t xml:space="preserve">ante Junta Directiva u Órgano equivalente.</w:t>
             </w:r>
           </w:p>
         </w:tc>
@@ -21349,19 +21599,19 @@
                 <w:szCs w:val="24"/>
                 <w:u w:val="single"/>
               </w:rPr>
-              <w:t xml:space="preserve">Dar seguimiento a la gestión que realiza la Gerencia de</w:t>
-            </w:r>
-            <w:r>
-              <w:rPr>
-                <w:rFonts w:eastAsia="Arial" w:cs="Arial"/>
-                <w:b w:val="0"/>
-                <w:i w:val="0"/>
-                <w:color w:val="000000" w:themeColor="text1"/>
-                <w:sz w:val="24"/>
-                <w:szCs w:val="24"/>
-                <w:u w:val="none"/>
-              </w:rPr>
-              <w:t xml:space="preserve"> Oficialía de Cumplimiento.</w:t>
+              <w:t xml:space="preserve">Dar seguimiento a la gestión que realiza la Gerencia</w:t>
+            </w:r>
+            <w:r>
+              <w:rPr>
+                <w:rFonts w:eastAsia="Arial" w:cs="Arial"/>
+                <w:b w:val="0"/>
+                <w:i w:val="0"/>
+                <w:color w:val="000000" w:themeColor="text1"/>
+                <w:sz w:val="24"/>
+                <w:szCs w:val="24"/>
+                <w:u w:val="none"/>
+              </w:rPr>
+              <w:t xml:space="preserve"> de Oficialía de Cumplimiento.</w:t>
             </w:r>
           </w:p>
         </w:tc>
@@ -21371,7 +21621,54 @@
           <w:tcPr>
             <w:tcW w:w="4817" w:type="dxa"/>
           </w:tcPr>
-          <w:p/>
+          <w:p>
+            <w:pPr>
+              <w:autoSpaceDE w:val="0"/>
+              <w:autoSpaceDN w:val="0"/>
+              <w:adjustRightInd w:val="0"/>
+              <w:spacing w:line="276" w:lineRule="auto"/>
+              <w:ind w:left="360" w:hanging="360"/>
+              <w:contextualSpacing/>
+              <w:jc w:val="both"/>
+              <w:rPr>
+                <w:rFonts w:ascii="Arial" w:hAnsi="Arial" w:cs="Arial"/>
+                <w:color w:val="000000" w:themeColor="text1"/>
+                <w:sz w:val="24"/>
+                <w:szCs w:val="24"/>
+              </w:rPr>
+            </w:pPr>
+            <w:r>
+              <w:rPr>
+                <w:rFonts w:ascii="Arial" w:hAnsi="Arial" w:cs="Arial"/>
+                <w:color w:val="000000" w:themeColor="text1"/>
+                <w:sz w:val="24"/>
+                <w:szCs w:val="24"/>
+                <w:u w:val="none"/>
+              </w:rPr>
+              <w:t xml:space="preserve">c) </w:t>
+            </w:r>
+            <w:r>
+              <w:rPr>
+                <w:rFonts w:ascii="Arial" w:hAnsi="Arial" w:cs="Arial"/>
+                <w:strike/>
+                <w:color w:val="000000" w:themeColor="text1"/>
+                <w:sz w:val="24"/>
+                <w:szCs w:val="24"/>
+                <w:u w:val="none"/>
+              </w:rPr>
+              <w:t xml:space="preserve">Analizar y recomendar la aprobación del presupuesto de funcionamiento de la</w:t>
+            </w:r>
+            <w:r>
+              <w:rPr>
+                <w:rFonts w:ascii="Arial" w:hAnsi="Arial" w:cs="Arial"/>
+                <w:color w:val="000000" w:themeColor="text1"/>
+                <w:sz w:val="24"/>
+                <w:szCs w:val="24"/>
+                <w:u w:val="none"/>
+              </w:rPr>
+              <w:t xml:space="preserve"> Oficialía de Cumplimiento.</w:t>
+            </w:r>
+          </w:p>
         </w:tc>
         <w:tc>
           <w:tcPr>
@@ -21417,7 +21714,31 @@
                 <w:szCs w:val="24"/>
                 <w:u w:val="single"/>
               </w:rPr>
-              <w:t xml:space="preserve">Conocer las deficiencias al programa de prevención, detectadas por la Gerencia de Oficialía de Cumplimiento; así como las acciones o medidas correctivas que se hayan implementado para tales efectos.</w:t>
+              <w:t xml:space="preserve">Conocer las deficiencias al programa de prevención, detectadas por la Gerencia de</w:t>
+            </w:r>
+            <w:r>
+              <w:rPr>
+                <w:rFonts w:eastAsia="Arial" w:cs="Arial"/>
+                <w:b w:val="0"/>
+                <w:i w:val="0"/>
+                <w:color w:val="000000" w:themeColor="text1"/>
+                <w:sz w:val="24"/>
+                <w:szCs w:val="24"/>
+                <w:u w:val="none"/>
+              </w:rPr>
+              <w:t xml:space="preserve"> Oficialía de Cumplimiento; </w:t>
+            </w:r>
+            <w:r>
+              <w:rPr>
+                <w:rFonts w:eastAsia="Arial" w:cs="Arial"/>
+                <w:b w:val="0"/>
+                <w:i w:val="0"/>
+                <w:color w:val="000000" w:themeColor="text1"/>
+                <w:sz w:val="24"/>
+                <w:szCs w:val="24"/>
+                <w:u w:val="single"/>
+              </w:rPr>
+              <w:t xml:space="preserve">así como las acciones o medidas correctivas que se hayan implementado para tales efectos.</w:t>
             </w:r>
           </w:p>
         </w:tc>
@@ -21427,7 +21748,65 @@
           <w:tcPr>
             <w:tcW w:w="4817" w:type="dxa"/>
           </w:tcPr>
-          <w:p/>
+          <w:p>
+            <w:pPr>
+              <w:autoSpaceDE w:val="0"/>
+              <w:autoSpaceDN w:val="0"/>
+              <w:adjustRightInd w:val="0"/>
+              <w:spacing w:line="276" w:lineRule="auto"/>
+              <w:ind w:left="360" w:hanging="360"/>
+              <w:contextualSpacing/>
+              <w:jc w:val="both"/>
+              <w:rPr>
+                <w:rFonts w:ascii="Arial" w:hAnsi="Arial" w:cs="Arial"/>
+                <w:color w:val="000000" w:themeColor="text1"/>
+                <w:sz w:val="24"/>
+                <w:szCs w:val="24"/>
+              </w:rPr>
+            </w:pPr>
+            <w:r>
+              <w:rPr>
+                <w:rFonts w:ascii="Arial" w:hAnsi="Arial" w:cs="Arial"/>
+                <w:color w:val="000000" w:themeColor="text1"/>
+                <w:sz w:val="24"/>
+                <w:szCs w:val="24"/>
+                <w:u w:val="none"/>
+              </w:rPr>
+              <w:t xml:space="preserve">d) </w:t>
+            </w:r>
+            <w:r>
+              <w:rPr>
+                <w:rFonts w:ascii="Arial" w:hAnsi="Arial" w:cs="Arial"/>
+                <w:strike/>
+                <w:color w:val="000000" w:themeColor="text1"/>
+                <w:sz w:val="24"/>
+                <w:szCs w:val="24"/>
+                <w:u w:val="none"/>
+              </w:rPr>
+              <w:t xml:space="preserve">Seguimiento de la gestión</w:t>
+            </w:r>
+            <w:r>
+              <w:rPr>
+                <w:rFonts w:ascii="Arial" w:hAnsi="Arial" w:cs="Arial"/>
+                <w:color w:val="000000" w:themeColor="text1"/>
+                <w:sz w:val="24"/>
+                <w:szCs w:val="24"/>
+                <w:u w:val="none"/>
+              </w:rPr>
+              <w:t xml:space="preserve"> de la Oficialía de cumplimiento </w:t>
+            </w:r>
+            <w:r>
+              <w:rPr>
+                <w:rFonts w:ascii="Arial" w:hAnsi="Arial" w:cs="Arial"/>
+                <w:strike/>
+                <w:color w:val="000000" w:themeColor="text1"/>
+                <w:sz w:val="24"/>
+                <w:szCs w:val="24"/>
+                <w:u w:val="none"/>
+              </w:rPr>
+              <w:t xml:space="preserve">conforme al Plan Anual de Trabajo.</w:t>
+            </w:r>
+          </w:p>
         </w:tc>
         <w:tc>
           <w:tcPr>
@@ -21473,7 +21852,31 @@
                 <w:szCs w:val="24"/>
                 <w:u w:val="single"/>
               </w:rPr>
-              <w:t xml:space="preserve">Revisar la ejecución del Plan Anual de Capacitación, que involucre a todo el personal de la Cooperativa y que, además, incluya la capacitación especializada para el personal de la Oficialía de Cumplimiento en temas de LDA/FT/FPADM.</w:t>
+              <w:t xml:space="preserve">Revisar la ejecución del Plan Anual de Capacitación, que involucre a todo el personal de la Cooperativa y que, además, incluya la capacitación especializada para el personal</w:t>
+            </w:r>
+            <w:r>
+              <w:rPr>
+                <w:rFonts w:eastAsia="Arial" w:cs="Arial"/>
+                <w:b w:val="0"/>
+                <w:i w:val="0"/>
+                <w:color w:val="000000" w:themeColor="text1"/>
+                <w:sz w:val="24"/>
+                <w:szCs w:val="24"/>
+                <w:u w:val="none"/>
+              </w:rPr>
+              <w:t xml:space="preserve"> de la Oficialía de Cumplimiento </w:t>
+            </w:r>
+            <w:r>
+              <w:rPr>
+                <w:rFonts w:eastAsia="Arial" w:cs="Arial"/>
+                <w:b w:val="0"/>
+                <w:i w:val="0"/>
+                <w:color w:val="000000" w:themeColor="text1"/>
+                <w:sz w:val="24"/>
+                <w:szCs w:val="24"/>
+                <w:u w:val="single"/>
+              </w:rPr>
+              <w:t xml:space="preserve">en temas de LDA/FT/FPADM.</w:t>
             </w:r>
           </w:p>
         </w:tc>
@@ -21483,7 +21886,44 @@
           <w:tcPr>
             <w:tcW w:w="4817" w:type="dxa"/>
           </w:tcPr>
-          <w:p/>
+          <w:p>
+            <w:pPr>
+              <w:autoSpaceDE w:val="0"/>
+              <w:autoSpaceDN w:val="0"/>
+              <w:adjustRightInd w:val="0"/>
+              <w:spacing w:line="276" w:lineRule="auto"/>
+              <w:ind w:left="360" w:hanging="360"/>
+              <w:contextualSpacing/>
+              <w:jc w:val="both"/>
+              <w:rPr>
+                <w:rFonts w:ascii="Arial" w:hAnsi="Arial" w:cs="Arial"/>
+                <w:color w:val="000000" w:themeColor="text1"/>
+                <w:sz w:val="24"/>
+                <w:szCs w:val="24"/>
+              </w:rPr>
+            </w:pPr>
+            <w:r>
+              <w:rPr>
+                <w:rFonts w:ascii="Arial" w:hAnsi="Arial" w:cs="Arial"/>
+                <w:color w:val="000000" w:themeColor="text1"/>
+                <w:sz w:val="24"/>
+                <w:szCs w:val="24"/>
+                <w:u w:val="none"/>
+              </w:rPr>
+              <w:t xml:space="preserve">e) </w:t>
+            </w:r>
+            <w:r>
+              <w:rPr>
+                <w:rFonts w:ascii="Arial" w:hAnsi="Arial" w:cs="Arial"/>
+                <w:strike/>
+                <w:color w:val="000000" w:themeColor="text1"/>
+                <w:sz w:val="24"/>
+                <w:szCs w:val="24"/>
+                <w:u w:val="none"/>
+              </w:rPr>
+              <w:t xml:space="preserve">Asegurarse que la Oficialía tenga acceso irrestricto a toda la información y documentación que maneja la Institución relacionada con el lavado de dinero y de activos.</w:t>
+            </w:r>
+          </w:p>
         </w:tc>
         <w:tc>
           <w:tcPr>
@@ -21552,29 +21992,16 @@
                 <w:tab w:val="left" w:pos="-2880"/>
               </w:tabs>
               <w:spacing w:after="120" w:line="276" w:lineRule="auto"/>
-              <w:ind w:left="360" w:hanging="360"/>
-              <w:jc w:val="both"/>
-              <w:rPr>
-                <w:rFonts w:eastAsia="Arial" w:cs="Arial"/>
-                <w:b w:val="0"/>
-                <w:i w:val="0"/>
-                <w:color w:val="000000" w:themeColor="text1"/>
-                <w:sz w:val="24"/>
-                <w:szCs w:val="24"/>
-              </w:rPr>
-            </w:pPr>
-            <w:r>
-              <w:rPr>
-                <w:rFonts w:eastAsia="Arial" w:cs="Arial"/>
-                <w:b w:val="0"/>
-                <w:i w:val="0"/>
-                <w:color w:val="000000" w:themeColor="text1"/>
-                <w:sz w:val="24"/>
-                <w:szCs w:val="24"/>
-                <w:u w:val="none"/>
-              </w:rPr>
-              <w:t xml:space="preserve">f) </w:t>
-            </w:r>
+              <w:jc w:val="both"/>
+              <w:rPr>
+                <w:rFonts w:eastAsia="Arial" w:cs="Arial"/>
+                <w:b w:val="0"/>
+                <w:i w:val="0"/>
+                <w:color w:val="000000" w:themeColor="text1"/>
+                <w:sz w:val="24"/>
+                <w:szCs w:val="24"/>
+              </w:rPr>
+            </w:pPr>
             <w:r>
               <w:rPr>
                 <w:rFonts w:eastAsia="Arial" w:cs="Arial"/>
@@ -21585,7 +22012,7 @@
                 <w:szCs w:val="24"/>
                 <w:u w:val="single"/>
               </w:rPr>
-              <w:t xml:space="preserve">Revisar por lo menos cada tres años, la estructura organizativa de la Gerencia de Oficialía de Cumplimiento, en cuanto a recurso humano, en relación proporcional al tamaño de la Cooperativa, cantidad de clientes, productos y servicios, así como la operatividad que tenga la misma, para determinar la necesidad de mayores recursos a fin de mitigar los riesgos derivados de LDA/FT/FPADM.</w:t>
+              <w:t xml:space="preserve">Las funciones del presidente podrán ser ampliadas a solicitud del Consejo de Administración.</w:t>
             </w:r>
           </w:p>
         </w:tc>
@@ -21595,65 +22022,7 @@
           <w:tcPr>
             <w:tcW w:w="4817" w:type="dxa"/>
           </w:tcPr>
-          <w:p>
-            <w:pPr>
-              <w:autoSpaceDE w:val="0"/>
-              <w:autoSpaceDN w:val="0"/>
-              <w:adjustRightInd w:val="0"/>
-              <w:spacing w:line="276" w:lineRule="auto"/>
-              <w:ind w:left="360" w:hanging="360"/>
-              <w:contextualSpacing/>
-              <w:jc w:val="both"/>
-              <w:rPr>
-                <w:rFonts w:ascii="Arial" w:hAnsi="Arial" w:cs="Arial"/>
-                <w:color w:val="000000" w:themeColor="text1"/>
-                <w:sz w:val="24"/>
-                <w:szCs w:val="24"/>
-              </w:rPr>
-            </w:pPr>
-            <w:r>
-              <w:rPr>
-                <w:rFonts w:ascii="Arial" w:hAnsi="Arial" w:cs="Arial"/>
-                <w:color w:val="000000" w:themeColor="text1"/>
-                <w:sz w:val="24"/>
-                <w:szCs w:val="24"/>
-                <w:u w:val="none"/>
-              </w:rPr>
-              <w:t xml:space="preserve">d) </w:t>
-            </w:r>
-            <w:r>
-              <w:rPr>
-                <w:rFonts w:ascii="Arial" w:hAnsi="Arial" w:cs="Arial"/>
-                <w:strike/>
-                <w:color w:val="000000" w:themeColor="text1"/>
-                <w:sz w:val="24"/>
-                <w:szCs w:val="24"/>
-                <w:u w:val="none"/>
-              </w:rPr>
-              <w:t xml:space="preserve">Seguimiento de la gestión de la</w:t>
-            </w:r>
-            <w:r>
-              <w:rPr>
-                <w:rFonts w:ascii="Arial" w:hAnsi="Arial" w:cs="Arial"/>
-                <w:color w:val="000000" w:themeColor="text1"/>
-                <w:sz w:val="24"/>
-                <w:szCs w:val="24"/>
-                <w:u w:val="none"/>
-              </w:rPr>
-              <w:t xml:space="preserve"> Oficialía de cumplimiento </w:t>
-            </w:r>
-            <w:r>
-              <w:rPr>
-                <w:rFonts w:ascii="Arial" w:hAnsi="Arial" w:cs="Arial"/>
-                <w:strike/>
-                <w:color w:val="000000" w:themeColor="text1"/>
-                <w:sz w:val="24"/>
-                <w:szCs w:val="24"/>
-                <w:u w:val="none"/>
-              </w:rPr>
-              <w:t xml:space="preserve">conforme al Plan Anual de Trabajo.</w:t>
-            </w:r>
-          </w:p>
+          <w:p/>
         </w:tc>
         <w:tc>
           <w:tcPr>
@@ -21666,29 +22035,16 @@
                 <w:tab w:val="left" w:pos="-2880"/>
               </w:tabs>
               <w:spacing w:after="120" w:line="276" w:lineRule="auto"/>
-              <w:ind w:left="360" w:hanging="360"/>
-              <w:jc w:val="both"/>
-              <w:rPr>
-                <w:rFonts w:eastAsia="Arial" w:cs="Arial"/>
-                <w:b w:val="0"/>
-                <w:i w:val="0"/>
-                <w:color w:val="000000" w:themeColor="text1"/>
-                <w:sz w:val="24"/>
-                <w:szCs w:val="24"/>
-              </w:rPr>
-            </w:pPr>
-            <w:r>
-              <w:rPr>
-                <w:rFonts w:eastAsia="Arial" w:cs="Arial"/>
-                <w:b w:val="0"/>
-                <w:i w:val="0"/>
-                <w:color w:val="000000" w:themeColor="text1"/>
-                <w:sz w:val="24"/>
-                <w:szCs w:val="24"/>
-                <w:u w:val="none"/>
-              </w:rPr>
-              <w:t xml:space="preserve">g) </w:t>
-            </w:r>
+              <w:jc w:val="both"/>
+              <w:rPr>
+                <w:rFonts w:eastAsia="Arial" w:cs="Arial"/>
+                <w:b w:val="0"/>
+                <w:i w:val="0"/>
+                <w:color w:val="000000" w:themeColor="text1"/>
+                <w:sz w:val="24"/>
+                <w:szCs w:val="24"/>
+              </w:rPr>
+            </w:pPr>
             <w:r>
               <w:rPr>
                 <w:rFonts w:eastAsia="Arial" w:cs="Arial"/>
@@ -21699,31 +22055,7 @@
                 <w:szCs w:val="24"/>
                 <w:u w:val="single"/>
               </w:rPr>
-              <w:t xml:space="preserve">Promover y garantizar la independencia y autonomía de la Gerencia de</w:t>
-            </w:r>
-            <w:r>
-              <w:rPr>
-                <w:rFonts w:eastAsia="Arial" w:cs="Arial"/>
-                <w:b w:val="0"/>
-                <w:i w:val="0"/>
-                <w:color w:val="000000" w:themeColor="text1"/>
-                <w:sz w:val="24"/>
-                <w:szCs w:val="24"/>
-                <w:u w:val="none"/>
-              </w:rPr>
-              <w:t xml:space="preserve"> Oficialía de Cumplimiento </w:t>
-            </w:r>
-            <w:r>
-              <w:rPr>
-                <w:rFonts w:eastAsia="Arial" w:cs="Arial"/>
-                <w:b w:val="0"/>
-                <w:i w:val="0"/>
-                <w:color w:val="000000" w:themeColor="text1"/>
-                <w:sz w:val="24"/>
-                <w:szCs w:val="24"/>
-                <w:u w:val="single"/>
-              </w:rPr>
-              <w:t xml:space="preserve">dentro de la Cooperativa.</w:t>
+              <w:t xml:space="preserve">El Gerente de Oficialía de Cumplimiento será el secretario del Comité de PLDA/FT/FPADM, y tendrá al menos las siguientes funciones:</w:t>
             </w:r>
           </w:p>
         </w:tc>
@@ -21757,7 +22089,7 @@
                 <w:szCs w:val="24"/>
                 <w:u w:val="none"/>
               </w:rPr>
-              <w:t xml:space="preserve">e) Asegurarse que la </w:t>
+              <w:t xml:space="preserve">f) </w:t>
             </w:r>
             <w:r>
               <w:rPr>
@@ -21768,49 +22100,7 @@
                 <w:szCs w:val="24"/>
                 <w:u w:val="none"/>
               </w:rPr>
-              <w:t xml:space="preserve">Oficialía</w:t>
-            </w:r>
-            <w:r>
-              <w:rPr>
-                <w:rFonts w:ascii="Arial" w:hAnsi="Arial" w:cs="Arial"/>
-                <w:color w:val="000000" w:themeColor="text1"/>
-                <w:sz w:val="24"/>
-                <w:szCs w:val="24"/>
-                <w:u w:val="none"/>
-              </w:rPr>
-              <w:t xml:space="preserve"> tenga acceso irrestricto a toda la información y documentación que maneja la </w:t>
-            </w:r>
-            <w:r>
-              <w:rPr>
-                <w:rFonts w:ascii="Arial" w:hAnsi="Arial" w:cs="Arial"/>
-                <w:strike/>
-                <w:color w:val="000000" w:themeColor="text1"/>
-                <w:sz w:val="24"/>
-                <w:szCs w:val="24"/>
-                <w:u w:val="none"/>
-              </w:rPr>
-              <w:t xml:space="preserve">Institución</w:t>
-            </w:r>
-            <w:r>
-              <w:rPr>
-                <w:rFonts w:ascii="Arial" w:hAnsi="Arial" w:cs="Arial"/>
-                <w:color w:val="000000" w:themeColor="text1"/>
-                <w:sz w:val="24"/>
-                <w:szCs w:val="24"/>
-                <w:u w:val="none"/>
-              </w:rPr>
-              <w:t xml:space="preserve"> relacionada con el </w:t>
-            </w:r>
-            <w:r>
-              <w:rPr>
-                <w:rFonts w:ascii="Arial" w:hAnsi="Arial" w:cs="Arial"/>
-                <w:strike/>
-                <w:color w:val="000000" w:themeColor="text1"/>
-                <w:sz w:val="24"/>
-                <w:szCs w:val="24"/>
-                <w:u w:val="none"/>
-              </w:rPr>
-              <w:t xml:space="preserve">lavado de dinero y de activos.</w:t>
+              <w:t xml:space="preserve">Promover y garantizar la independencia de la Oficialía de forma institucional</w:t>
             </w:r>
           </w:p>
         </w:tc>
@@ -21846,7 +22136,7 @@
                 <w:szCs w:val="24"/>
                 <w:u w:val="none"/>
               </w:rPr>
-              <w:t xml:space="preserve">h) Asegurarse que la </w:t>
+              <w:t xml:space="preserve">f) </w:t>
             </w:r>
             <w:r>
               <w:rPr>
@@ -21858,55 +22148,7 @@
                 <w:szCs w:val="24"/>
                 <w:u w:val="single"/>
               </w:rPr>
-              <w:t xml:space="preserve">Gerencia de Oficialía de Cumplimiento</w:t>
-            </w:r>
-            <w:r>
-              <w:rPr>
-                <w:rFonts w:eastAsia="Arial" w:cs="Arial"/>
-                <w:b w:val="0"/>
-                <w:i w:val="0"/>
-                <w:color w:val="000000" w:themeColor="text1"/>
-                <w:sz w:val="24"/>
-                <w:szCs w:val="24"/>
-                <w:u w:val="none"/>
-              </w:rPr>
-              <w:t xml:space="preserve"> tenga acceso irrestricto a toda la información y documentación que maneja la </w:t>
-            </w:r>
-            <w:r>
-              <w:rPr>
-                <w:rFonts w:eastAsia="Arial" w:cs="Arial"/>
-                <w:b w:val="0"/>
-                <w:i w:val="0"/>
-                <w:color w:val="000000" w:themeColor="text1"/>
-                <w:sz w:val="24"/>
-                <w:szCs w:val="24"/>
-                <w:u w:val="single"/>
-              </w:rPr>
-              <w:t xml:space="preserve">Cooperativa</w:t>
-            </w:r>
-            <w:r>
-              <w:rPr>
-                <w:rFonts w:eastAsia="Arial" w:cs="Arial"/>
-                <w:b w:val="0"/>
-                <w:i w:val="0"/>
-                <w:color w:val="000000" w:themeColor="text1"/>
-                <w:sz w:val="24"/>
-                <w:szCs w:val="24"/>
-                <w:u w:val="none"/>
-              </w:rPr>
-              <w:t xml:space="preserve"> relacionada con el </w:t>
-            </w:r>
-            <w:r>
-              <w:rPr>
-                <w:rFonts w:eastAsia="Arial" w:cs="Arial"/>
-                <w:b w:val="0"/>
-                <w:i w:val="0"/>
-                <w:color w:val="000000" w:themeColor="text1"/>
-                <w:sz w:val="24"/>
-                <w:szCs w:val="24"/>
-                <w:u w:val="single"/>
-              </w:rPr>
-              <w:t xml:space="preserve">LDA/FT/FPADM.</w:t>
+              <w:t xml:space="preserve">Revisar por lo menos cada tres años, la estructura organizativa de la Gerencia de Oficialía de Cumplimiento, en cuanto a recurso humano, en relación proporcional al tamaño de la Cooperativa, cantidad de clientes, productos y servicios, así como la operatividad que tenga la misma, para determinar la necesidad de mayores recursos a fin de mitigar los riesgos derivados de LDA/FT/FPADM.</w:t>
             </w:r>
           </w:p>
         </w:tc>
@@ -21916,44 +22158,7 @@
           <w:tcPr>
             <w:tcW w:w="4817" w:type="dxa"/>
           </w:tcPr>
-          <w:p>
-            <w:pPr>
-              <w:autoSpaceDE w:val="0"/>
-              <w:autoSpaceDN w:val="0"/>
-              <w:adjustRightInd w:val="0"/>
-              <w:spacing w:line="276" w:lineRule="auto"/>
-              <w:ind w:left="360" w:hanging="360"/>
-              <w:contextualSpacing/>
-              <w:jc w:val="both"/>
-              <w:rPr>
-                <w:rFonts w:ascii="Arial" w:hAnsi="Arial" w:cs="Arial"/>
-                <w:color w:val="000000" w:themeColor="text1"/>
-                <w:sz w:val="24"/>
-                <w:szCs w:val="24"/>
-              </w:rPr>
-            </w:pPr>
-            <w:r>
-              <w:rPr>
-                <w:rFonts w:ascii="Arial" w:hAnsi="Arial" w:cs="Arial"/>
-                <w:color w:val="000000" w:themeColor="text1"/>
-                <w:sz w:val="24"/>
-                <w:szCs w:val="24"/>
-                <w:u w:val="none"/>
-              </w:rPr>
-              <w:t xml:space="preserve">f) </w:t>
-            </w:r>
-            <w:r>
-              <w:rPr>
-                <w:rFonts w:ascii="Arial" w:hAnsi="Arial" w:cs="Arial"/>
-                <w:strike/>
-                <w:color w:val="000000" w:themeColor="text1"/>
-                <w:sz w:val="24"/>
-                <w:szCs w:val="24"/>
-                <w:u w:val="none"/>
-              </w:rPr>
-              <w:t xml:space="preserve">Promover y garantizar la independencia de la Oficialía de forma institucional</w:t>
-            </w:r>
-          </w:p>
+          <w:p/>
         </w:tc>
         <w:tc>
           <w:tcPr>
@@ -21966,29 +22171,16 @@
                 <w:tab w:val="left" w:pos="-2880"/>
               </w:tabs>
               <w:spacing w:after="120" w:line="276" w:lineRule="auto"/>
-              <w:ind w:left="360" w:hanging="360"/>
-              <w:jc w:val="both"/>
-              <w:rPr>
-                <w:rFonts w:eastAsia="Arial" w:cs="Arial"/>
-                <w:b w:val="0"/>
-                <w:i w:val="0"/>
-                <w:color w:val="000000" w:themeColor="text1"/>
-                <w:sz w:val="24"/>
-                <w:szCs w:val="24"/>
-              </w:rPr>
-            </w:pPr>
-            <w:r>
-              <w:rPr>
-                <w:rFonts w:eastAsia="Arial" w:cs="Arial"/>
-                <w:b w:val="0"/>
-                <w:i w:val="0"/>
-                <w:color w:val="000000" w:themeColor="text1"/>
-                <w:sz w:val="24"/>
-                <w:szCs w:val="24"/>
-                <w:u w:val="none"/>
-              </w:rPr>
-              <w:t xml:space="preserve">i) </w:t>
-            </w:r>
+              <w:jc w:val="both"/>
+              <w:rPr>
+                <w:rFonts w:eastAsia="Arial" w:cs="Arial"/>
+                <w:b w:val="0"/>
+                <w:i w:val="0"/>
+                <w:color w:val="000000" w:themeColor="text1"/>
+                <w:sz w:val="24"/>
+                <w:szCs w:val="24"/>
+              </w:rPr>
+            </w:pPr>
             <w:r>
               <w:rPr>
                 <w:rFonts w:eastAsia="Arial" w:cs="Arial"/>
@@ -21999,7 +22191,7 @@
                 <w:szCs w:val="24"/>
                 <w:u w:val="single"/>
               </w:rPr>
-              <w:t xml:space="preserve">Conocer las revisiones de auditoría interna, externa y entes reguladores realizadas a la Gerencia de Oficialía de Cumplimiento, así como de los hallazgos señalados para su debida atención y seguimiento hasta su finalización.</w:t>
+              <w:t xml:space="preserve">Cada miembro del Comité de PLDA/FT/FPADM, tendrá los siguientes deberes y obligaciones:</w:t>
             </w:r>
           </w:p>
         </w:tc>
@@ -22022,16 +22214,29 @@
                 <w:tab w:val="left" w:pos="-2880"/>
               </w:tabs>
               <w:spacing w:after="120" w:line="276" w:lineRule="auto"/>
-              <w:jc w:val="both"/>
-              <w:rPr>
-                <w:rFonts w:eastAsia="Arial" w:cs="Arial"/>
-                <w:b w:val="0"/>
-                <w:i w:val="0"/>
-                <w:color w:val="000000" w:themeColor="text1"/>
-                <w:sz w:val="24"/>
-                <w:szCs w:val="24"/>
-              </w:rPr>
-            </w:pPr>
+              <w:ind w:left="360" w:hanging="360"/>
+              <w:jc w:val="both"/>
+              <w:rPr>
+                <w:rFonts w:eastAsia="Arial" w:cs="Arial"/>
+                <w:b w:val="0"/>
+                <w:i w:val="0"/>
+                <w:color w:val="000000" w:themeColor="text1"/>
+                <w:sz w:val="24"/>
+                <w:szCs w:val="24"/>
+              </w:rPr>
+            </w:pPr>
+            <w:r>
+              <w:rPr>
+                <w:rFonts w:eastAsia="Arial" w:cs="Arial"/>
+                <w:b w:val="0"/>
+                <w:i w:val="0"/>
+                <w:color w:val="000000" w:themeColor="text1"/>
+                <w:sz w:val="24"/>
+                <w:szCs w:val="24"/>
+                <w:u w:val="none"/>
+              </w:rPr>
+              <w:t xml:space="preserve">g) </w:t>
+            </w:r>
             <w:r>
               <w:rPr>
                 <w:rFonts w:eastAsia="Arial" w:cs="Arial"/>
@@ -22042,7 +22247,7 @@
                 <w:szCs w:val="24"/>
                 <w:u w:val="single"/>
               </w:rPr>
-              <w:t xml:space="preserve">El presidente del Comité de PLDA/FT/FPADM tendrá las siguientes funciones:</w:t>
+              <w:t xml:space="preserve">Promover y garantizar la independencia y autonomía de la Gerencia de Oficialía de Cumplimiento dentro de la Cooperativa.</w:t>
             </w:r>
           </w:p>
         </w:tc>
@@ -22086,7 +22291,7 @@
                 <w:szCs w:val="24"/>
                 <w:u w:val="none"/>
               </w:rPr>
-              <w:t xml:space="preserve">a) </w:t>
+              <w:t xml:space="preserve">h) </w:t>
             </w:r>
             <w:r>
               <w:rPr>
@@ -22098,7 +22303,7 @@
                 <w:szCs w:val="24"/>
                 <w:u w:val="single"/>
               </w:rPr>
-              <w:t xml:space="preserve">Dar por abierta la sesión y dirigir las presentaciones y deliberaciones.</w:t>
+              <w:t xml:space="preserve">Asegurarse que la Gerencia de Oficialía de Cumplimiento tenga acceso irrestricto a toda la información y documentación que maneja la Cooperativa relacionada con el LDA/FT/FPADM.</w:t>
             </w:r>
           </w:p>
         </w:tc>
@@ -22142,7 +22347,7 @@
                 <w:szCs w:val="24"/>
                 <w:u w:val="none"/>
               </w:rPr>
-              <w:t xml:space="preserve">b) </w:t>
+              <w:t xml:space="preserve">i) </w:t>
             </w:r>
             <w:r>
               <w:rPr>
@@ -22154,7 +22359,7 @@
                 <w:szCs w:val="24"/>
                 <w:u w:val="single"/>
               </w:rPr>
-              <w:t xml:space="preserve">Solicitar cambiar el orden de la agenda cuando sea requerido.</w:t>
+              <w:t xml:space="preserve">Conocer las revisiones de auditoría interna, externa y entes reguladores realizadas a la Gerencia de Oficialía de Cumplimiento, así como de los hallazgos señalados para su debida atención y seguimiento hasta su finalización.</w:t>
             </w:r>
           </w:p>
         </w:tc>
@@ -22177,29 +22382,16 @@
                 <w:tab w:val="left" w:pos="-2880"/>
               </w:tabs>
               <w:spacing w:after="120" w:line="276" w:lineRule="auto"/>
-              <w:ind w:left="360" w:hanging="360"/>
-              <w:jc w:val="both"/>
-              <w:rPr>
-                <w:rFonts w:eastAsia="Arial" w:cs="Arial"/>
-                <w:b w:val="0"/>
-                <w:i w:val="0"/>
-                <w:color w:val="000000" w:themeColor="text1"/>
-                <w:sz w:val="24"/>
-                <w:szCs w:val="24"/>
-              </w:rPr>
-            </w:pPr>
-            <w:r>
-              <w:rPr>
-                <w:rFonts w:eastAsia="Arial" w:cs="Arial"/>
-                <w:b w:val="0"/>
-                <w:i w:val="0"/>
-                <w:color w:val="000000" w:themeColor="text1"/>
-                <w:sz w:val="24"/>
-                <w:szCs w:val="24"/>
-                <w:u w:val="none"/>
-              </w:rPr>
-              <w:t xml:space="preserve">c) </w:t>
-            </w:r>
+              <w:jc w:val="both"/>
+              <w:rPr>
+                <w:rFonts w:eastAsia="Arial" w:cs="Arial"/>
+                <w:b w:val="0"/>
+                <w:i w:val="0"/>
+                <w:color w:val="000000" w:themeColor="text1"/>
+                <w:sz w:val="24"/>
+                <w:szCs w:val="24"/>
+              </w:rPr>
+            </w:pPr>
             <w:r>
               <w:rPr>
                 <w:rFonts w:eastAsia="Arial" w:cs="Arial"/>
@@ -22210,864 +22402,7 @@
                 <w:szCs w:val="24"/>
                 <w:u w:val="single"/>
               </w:rPr>
-              <w:t xml:space="preserve">Coordinar el Comité para desarrollar sus actividades de una manera armónica con la participación de los miembros.</w:t>
-            </w:r>
-          </w:p>
-        </w:tc>
-      </w:tr>
-      <w:tr>
-        <w:tc>
-          <w:tcPr>
-            <w:tcW w:w="4817" w:type="dxa"/>
-          </w:tcPr>
-          <w:p/>
-        </w:tc>
-        <w:tc>
-          <w:tcPr>
-            <w:tcW w:w="4817" w:type="dxa"/>
-          </w:tcPr>
-          <w:p>
-            <w:pPr>
-              <w:pStyle w:val="Textoindependiente2"/>
-              <w:tabs>
-                <w:tab w:val="left" w:pos="-2880"/>
-              </w:tabs>
-              <w:spacing w:after="120" w:line="276" w:lineRule="auto"/>
-              <w:ind w:left="360" w:hanging="360"/>
-              <w:jc w:val="both"/>
-              <w:rPr>
-                <w:rFonts w:eastAsia="Arial" w:cs="Arial"/>
-                <w:b w:val="0"/>
-                <w:i w:val="0"/>
-                <w:color w:val="000000" w:themeColor="text1"/>
-                <w:sz w:val="24"/>
-                <w:szCs w:val="24"/>
-              </w:rPr>
-            </w:pPr>
-            <w:r>
-              <w:rPr>
-                <w:rFonts w:eastAsia="Arial" w:cs="Arial"/>
-                <w:b w:val="0"/>
-                <w:i w:val="0"/>
-                <w:color w:val="000000" w:themeColor="text1"/>
-                <w:sz w:val="24"/>
-                <w:szCs w:val="24"/>
-                <w:u w:val="none"/>
-              </w:rPr>
-              <w:t xml:space="preserve">d) </w:t>
-            </w:r>
-            <w:r>
-              <w:rPr>
-                <w:rFonts w:eastAsia="Arial" w:cs="Arial"/>
-                <w:b w:val="0"/>
-                <w:i w:val="0"/>
-                <w:color w:val="000000" w:themeColor="text1"/>
-                <w:sz w:val="24"/>
-                <w:szCs w:val="24"/>
-                <w:u w:val="single"/>
-              </w:rPr>
-              <w:t xml:space="preserve">Procurar que los miembros cuenten con la información y los elementos necesarios para el mejor desempeño de sus funciones.</w:t>
-            </w:r>
-          </w:p>
-        </w:tc>
-      </w:tr>
-      <w:tr>
-        <w:tc>
-          <w:tcPr>
-            <w:tcW w:w="4817" w:type="dxa"/>
-          </w:tcPr>
-          <w:p/>
-        </w:tc>
-        <w:tc>
-          <w:tcPr>
-            <w:tcW w:w="4817" w:type="dxa"/>
-          </w:tcPr>
-          <w:p>
-            <w:pPr>
-              <w:pStyle w:val="Textoindependiente2"/>
-              <w:tabs>
-                <w:tab w:val="left" w:pos="-2880"/>
-              </w:tabs>
-              <w:spacing w:after="120" w:line="276" w:lineRule="auto"/>
-              <w:ind w:left="360" w:hanging="360"/>
-              <w:jc w:val="both"/>
-              <w:rPr>
-                <w:rFonts w:eastAsia="Arial" w:cs="Arial"/>
-                <w:b w:val="0"/>
-                <w:i w:val="0"/>
-                <w:color w:val="000000" w:themeColor="text1"/>
-                <w:sz w:val="24"/>
-                <w:szCs w:val="24"/>
-              </w:rPr>
-            </w:pPr>
-            <w:r>
-              <w:rPr>
-                <w:rFonts w:eastAsia="Arial" w:cs="Arial"/>
-                <w:b w:val="0"/>
-                <w:i w:val="0"/>
-                <w:color w:val="000000" w:themeColor="text1"/>
-                <w:sz w:val="24"/>
-                <w:szCs w:val="24"/>
-                <w:u w:val="none"/>
-              </w:rPr>
-              <w:t xml:space="preserve">e) </w:t>
-            </w:r>
-            <w:r>
-              <w:rPr>
-                <w:rFonts w:eastAsia="Arial" w:cs="Arial"/>
-                <w:b w:val="0"/>
-                <w:i w:val="0"/>
-                <w:color w:val="000000" w:themeColor="text1"/>
-                <w:sz w:val="24"/>
-                <w:szCs w:val="24"/>
-                <w:u w:val="single"/>
-              </w:rPr>
-              <w:t xml:space="preserve">Velar por que, en el desarrollo de cada punto, se destine el tiempo suficiente para el análisis detallado de cada uno de ellos.</w:t>
-            </w:r>
-          </w:p>
-        </w:tc>
-      </w:tr>
-      <w:tr>
-        <w:tc>
-          <w:tcPr>
-            <w:tcW w:w="4817" w:type="dxa"/>
-          </w:tcPr>
-          <w:p/>
-        </w:tc>
-        <w:tc>
-          <w:tcPr>
-            <w:tcW w:w="4817" w:type="dxa"/>
-          </w:tcPr>
-          <w:p>
-            <w:pPr>
-              <w:pStyle w:val="Textoindependiente2"/>
-              <w:tabs>
-                <w:tab w:val="left" w:pos="-2880"/>
-              </w:tabs>
-              <w:spacing w:after="120" w:line="276" w:lineRule="auto"/>
-              <w:jc w:val="both"/>
-              <w:rPr>
-                <w:rFonts w:eastAsia="Arial" w:cs="Arial"/>
-                <w:b w:val="0"/>
-                <w:i w:val="0"/>
-                <w:color w:val="000000" w:themeColor="text1"/>
-                <w:sz w:val="24"/>
-                <w:szCs w:val="24"/>
-              </w:rPr>
-            </w:pPr>
-            <w:r>
-              <w:rPr>
-                <w:rFonts w:eastAsia="Arial" w:cs="Arial"/>
-                <w:b w:val="0"/>
-                <w:i w:val="0"/>
-                <w:color w:val="000000" w:themeColor="text1"/>
-                <w:sz w:val="24"/>
-                <w:szCs w:val="24"/>
-                <w:u w:val="single"/>
-              </w:rPr>
-              <w:t xml:space="preserve">Las funciones del presidente podrán ser ampliadas a solicitud del Consejo de Administración.</w:t>
-            </w:r>
-          </w:p>
-        </w:tc>
-      </w:tr>
-      <w:tr>
-        <w:tc>
-          <w:tcPr>
-            <w:tcW w:w="4817" w:type="dxa"/>
-          </w:tcPr>
-          <w:p/>
-        </w:tc>
-        <w:tc>
-          <w:tcPr>
-            <w:tcW w:w="4817" w:type="dxa"/>
-          </w:tcPr>
-          <w:p>
-            <w:pPr>
-              <w:pStyle w:val="Textoindependiente2"/>
-              <w:tabs>
-                <w:tab w:val="left" w:pos="-2880"/>
-              </w:tabs>
-              <w:spacing w:after="120" w:line="276" w:lineRule="auto"/>
-              <w:jc w:val="both"/>
-              <w:rPr>
-                <w:rFonts w:eastAsia="Arial" w:cs="Arial"/>
-                <w:b w:val="0"/>
-                <w:i w:val="0"/>
-                <w:color w:val="000000" w:themeColor="text1"/>
-                <w:sz w:val="24"/>
-                <w:szCs w:val="24"/>
-              </w:rPr>
-            </w:pPr>
-            <w:r>
-              <w:rPr>
-                <w:rFonts w:eastAsia="Arial" w:cs="Arial"/>
-                <w:b w:val="0"/>
-                <w:i w:val="0"/>
-                <w:color w:val="000000" w:themeColor="text1"/>
-                <w:sz w:val="24"/>
-                <w:szCs w:val="24"/>
-                <w:u w:val="single"/>
-              </w:rPr>
-              <w:t xml:space="preserve">El Gerente de Oficialía de Cumplimiento será el secretario del Comité de PLDA/FT/FPADM, y tendrá al menos las siguientes funciones:</w:t>
-            </w:r>
-          </w:p>
-        </w:tc>
-      </w:tr>
-      <w:tr>
-        <w:tc>
-          <w:tcPr>
-            <w:tcW w:w="4817" w:type="dxa"/>
-          </w:tcPr>
-          <w:p/>
-        </w:tc>
-        <w:tc>
-          <w:tcPr>
-            <w:tcW w:w="4817" w:type="dxa"/>
-          </w:tcPr>
-          <w:p>
-            <w:pPr>
-              <w:pStyle w:val="Textoindependiente2"/>
-              <w:tabs>
-                <w:tab w:val="left" w:pos="-2880"/>
-              </w:tabs>
-              <w:spacing w:after="120" w:line="276" w:lineRule="auto"/>
-              <w:ind w:left="360" w:hanging="360"/>
-              <w:jc w:val="both"/>
-              <w:rPr>
-                <w:rFonts w:eastAsia="Arial" w:cs="Arial"/>
-                <w:b w:val="0"/>
-                <w:i w:val="0"/>
-                <w:color w:val="000000" w:themeColor="text1"/>
-                <w:sz w:val="24"/>
-                <w:szCs w:val="24"/>
-              </w:rPr>
-            </w:pPr>
-            <w:r>
-              <w:rPr>
-                <w:rFonts w:eastAsia="Arial" w:cs="Arial"/>
-                <w:b w:val="0"/>
-                <w:i w:val="0"/>
-                <w:color w:val="000000" w:themeColor="text1"/>
-                <w:sz w:val="24"/>
-                <w:szCs w:val="24"/>
-                <w:u w:val="none"/>
-              </w:rPr>
-              <w:t xml:space="preserve">a) </w:t>
-            </w:r>
-            <w:r>
-              <w:rPr>
-                <w:rFonts w:eastAsia="Arial" w:cs="Arial"/>
-                <w:b w:val="0"/>
-                <w:i w:val="0"/>
-                <w:color w:val="000000" w:themeColor="text1"/>
-                <w:sz w:val="24"/>
-                <w:szCs w:val="24"/>
-                <w:u w:val="single"/>
-              </w:rPr>
-              <w:t xml:space="preserve">Convocar a sesión de Comité de PLDA/FT/FPADM;</w:t>
-            </w:r>
-          </w:p>
-        </w:tc>
-      </w:tr>
-      <w:tr>
-        <w:tc>
-          <w:tcPr>
-            <w:tcW w:w="4817" w:type="dxa"/>
-          </w:tcPr>
-          <w:p/>
-        </w:tc>
-        <w:tc>
-          <w:tcPr>
-            <w:tcW w:w="4817" w:type="dxa"/>
-          </w:tcPr>
-          <w:p>
-            <w:pPr>
-              <w:pStyle w:val="Textoindependiente2"/>
-              <w:tabs>
-                <w:tab w:val="left" w:pos="-2880"/>
-              </w:tabs>
-              <w:spacing w:after="120" w:line="276" w:lineRule="auto"/>
-              <w:ind w:left="360" w:hanging="360"/>
-              <w:jc w:val="both"/>
-              <w:rPr>
-                <w:rFonts w:eastAsia="Arial" w:cs="Arial"/>
-                <w:b w:val="0"/>
-                <w:i w:val="0"/>
-                <w:color w:val="000000" w:themeColor="text1"/>
-                <w:sz w:val="24"/>
-                <w:szCs w:val="24"/>
-              </w:rPr>
-            </w:pPr>
-            <w:r>
-              <w:rPr>
-                <w:rFonts w:eastAsia="Arial" w:cs="Arial"/>
-                <w:b w:val="0"/>
-                <w:i w:val="0"/>
-                <w:color w:val="000000" w:themeColor="text1"/>
-                <w:sz w:val="24"/>
-                <w:szCs w:val="24"/>
-                <w:u w:val="none"/>
-              </w:rPr>
-              <w:t xml:space="preserve">b) </w:t>
-            </w:r>
-            <w:r>
-              <w:rPr>
-                <w:rFonts w:eastAsia="Arial" w:cs="Arial"/>
-                <w:b w:val="0"/>
-                <w:i w:val="0"/>
-                <w:color w:val="000000" w:themeColor="text1"/>
-                <w:sz w:val="24"/>
-                <w:szCs w:val="24"/>
-                <w:u w:val="single"/>
-              </w:rPr>
-              <w:t xml:space="preserve">Elaborar la agenda de cada sesión de Comité y respaldarla con la información y documentos que sean necesarios para desarrollarla;</w:t>
-            </w:r>
-          </w:p>
-        </w:tc>
-      </w:tr>
-      <w:tr>
-        <w:tc>
-          <w:tcPr>
-            <w:tcW w:w="4817" w:type="dxa"/>
-          </w:tcPr>
-          <w:p/>
-        </w:tc>
-        <w:tc>
-          <w:tcPr>
-            <w:tcW w:w="4817" w:type="dxa"/>
-          </w:tcPr>
-          <w:p>
-            <w:pPr>
-              <w:pStyle w:val="Textoindependiente2"/>
-              <w:tabs>
-                <w:tab w:val="left" w:pos="-2880"/>
-              </w:tabs>
-              <w:spacing w:after="120" w:line="276" w:lineRule="auto"/>
-              <w:ind w:left="360" w:hanging="360"/>
-              <w:jc w:val="both"/>
-              <w:rPr>
-                <w:rFonts w:eastAsia="Arial" w:cs="Arial"/>
-                <w:b w:val="0"/>
-                <w:i w:val="0"/>
-                <w:color w:val="000000" w:themeColor="text1"/>
-                <w:sz w:val="24"/>
-                <w:szCs w:val="24"/>
-              </w:rPr>
-            </w:pPr>
-            <w:r>
-              <w:rPr>
-                <w:rFonts w:eastAsia="Arial" w:cs="Arial"/>
-                <w:b w:val="0"/>
-                <w:i w:val="0"/>
-                <w:color w:val="000000" w:themeColor="text1"/>
-                <w:sz w:val="24"/>
-                <w:szCs w:val="24"/>
-                <w:u w:val="none"/>
-              </w:rPr>
-              <w:t xml:space="preserve">c) </w:t>
-            </w:r>
-            <w:r>
-              <w:rPr>
-                <w:rFonts w:eastAsia="Arial" w:cs="Arial"/>
-                <w:b w:val="0"/>
-                <w:i w:val="0"/>
-                <w:color w:val="000000" w:themeColor="text1"/>
-                <w:sz w:val="24"/>
-                <w:szCs w:val="24"/>
-                <w:u w:val="single"/>
-              </w:rPr>
-              <w:t xml:space="preserve">Verificar el quórum de asistencia a cada sesión;</w:t>
-            </w:r>
-          </w:p>
-        </w:tc>
-      </w:tr>
-      <w:tr>
-        <w:tc>
-          <w:tcPr>
-            <w:tcW w:w="4817" w:type="dxa"/>
-          </w:tcPr>
-          <w:p/>
-        </w:tc>
-        <w:tc>
-          <w:tcPr>
-            <w:tcW w:w="4817" w:type="dxa"/>
-          </w:tcPr>
-          <w:p>
-            <w:pPr>
-              <w:pStyle w:val="Textoindependiente2"/>
-              <w:tabs>
-                <w:tab w:val="left" w:pos="-2880"/>
-              </w:tabs>
-              <w:spacing w:after="120" w:line="276" w:lineRule="auto"/>
-              <w:ind w:left="360" w:hanging="360"/>
-              <w:jc w:val="both"/>
-              <w:rPr>
-                <w:rFonts w:eastAsia="Arial" w:cs="Arial"/>
-                <w:b w:val="0"/>
-                <w:i w:val="0"/>
-                <w:color w:val="000000" w:themeColor="text1"/>
-                <w:sz w:val="24"/>
-                <w:szCs w:val="24"/>
-              </w:rPr>
-            </w:pPr>
-            <w:r>
-              <w:rPr>
-                <w:rFonts w:eastAsia="Arial" w:cs="Arial"/>
-                <w:b w:val="0"/>
-                <w:i w:val="0"/>
-                <w:color w:val="000000" w:themeColor="text1"/>
-                <w:sz w:val="24"/>
-                <w:szCs w:val="24"/>
-                <w:u w:val="none"/>
-              </w:rPr>
-              <w:t xml:space="preserve">d) </w:t>
-            </w:r>
-            <w:r>
-              <w:rPr>
-                <w:rFonts w:eastAsia="Arial" w:cs="Arial"/>
-                <w:b w:val="0"/>
-                <w:i w:val="0"/>
-                <w:color w:val="000000" w:themeColor="text1"/>
-                <w:sz w:val="24"/>
-                <w:szCs w:val="24"/>
-                <w:u w:val="single"/>
-              </w:rPr>
-              <w:t xml:space="preserve">Documentar formalmente en las actas que el Comité de PLDA/FT/FPADM, lleve para tal fin, el desarrollo de las sesiones, seguimiento de los acuerdos girados, documentos anexos, así como resguardar el archivo digital y físico de las sesiones y de los documentos e información que respaldará la agenda vista en cada sesión.</w:t>
-            </w:r>
-          </w:p>
-        </w:tc>
-      </w:tr>
-      <w:tr>
-        <w:tc>
-          <w:tcPr>
-            <w:tcW w:w="4817" w:type="dxa"/>
-          </w:tcPr>
-          <w:p/>
-        </w:tc>
-        <w:tc>
-          <w:tcPr>
-            <w:tcW w:w="4817" w:type="dxa"/>
-          </w:tcPr>
-          <w:p>
-            <w:pPr>
-              <w:pStyle w:val="Textoindependiente2"/>
-              <w:tabs>
-                <w:tab w:val="left" w:pos="-2880"/>
-              </w:tabs>
-              <w:spacing w:after="120" w:line="276" w:lineRule="auto"/>
-              <w:ind w:left="360" w:hanging="360"/>
-              <w:jc w:val="both"/>
-              <w:rPr>
-                <w:rFonts w:eastAsia="Arial" w:cs="Arial"/>
-                <w:b w:val="0"/>
-                <w:i w:val="0"/>
-                <w:color w:val="000000" w:themeColor="text1"/>
-                <w:sz w:val="24"/>
-                <w:szCs w:val="24"/>
-              </w:rPr>
-            </w:pPr>
-            <w:r>
-              <w:rPr>
-                <w:rFonts w:eastAsia="Arial" w:cs="Arial"/>
-                <w:b w:val="0"/>
-                <w:i w:val="0"/>
-                <w:color w:val="000000" w:themeColor="text1"/>
-                <w:sz w:val="24"/>
-                <w:szCs w:val="24"/>
-                <w:u w:val="none"/>
-              </w:rPr>
-              <w:t xml:space="preserve">e) </w:t>
-            </w:r>
-            <w:r>
-              <w:rPr>
-                <w:rFonts w:eastAsia="Arial" w:cs="Arial"/>
-                <w:b w:val="0"/>
-                <w:i w:val="0"/>
-                <w:color w:val="000000" w:themeColor="text1"/>
-                <w:sz w:val="24"/>
-                <w:szCs w:val="24"/>
-                <w:u w:val="single"/>
-              </w:rPr>
-              <w:t xml:space="preserve">Imprimir las actas y gestionar las firmas correspondientes;</w:t>
-            </w:r>
-          </w:p>
-        </w:tc>
-      </w:tr>
-      <w:tr>
-        <w:tc>
-          <w:tcPr>
-            <w:tcW w:w="4817" w:type="dxa"/>
-          </w:tcPr>
-          <w:p/>
-        </w:tc>
-        <w:tc>
-          <w:tcPr>
-            <w:tcW w:w="4817" w:type="dxa"/>
-          </w:tcPr>
-          <w:p>
-            <w:pPr>
-              <w:pStyle w:val="Textoindependiente2"/>
-              <w:tabs>
-                <w:tab w:val="left" w:pos="-2880"/>
-              </w:tabs>
-              <w:spacing w:after="120" w:line="276" w:lineRule="auto"/>
-              <w:ind w:left="360" w:hanging="360"/>
-              <w:jc w:val="both"/>
-              <w:rPr>
-                <w:rFonts w:eastAsia="Arial" w:cs="Arial"/>
-                <w:b w:val="0"/>
-                <w:i w:val="0"/>
-                <w:color w:val="000000" w:themeColor="text1"/>
-                <w:sz w:val="24"/>
-                <w:szCs w:val="24"/>
-              </w:rPr>
-            </w:pPr>
-            <w:r>
-              <w:rPr>
-                <w:rFonts w:eastAsia="Arial" w:cs="Arial"/>
-                <w:b w:val="0"/>
-                <w:i w:val="0"/>
-                <w:color w:val="000000" w:themeColor="text1"/>
-                <w:sz w:val="24"/>
-                <w:szCs w:val="24"/>
-                <w:u w:val="none"/>
-              </w:rPr>
-              <w:t xml:space="preserve">f) </w:t>
-            </w:r>
-            <w:r>
-              <w:rPr>
-                <w:rFonts w:eastAsia="Arial" w:cs="Arial"/>
-                <w:b w:val="0"/>
-                <w:i w:val="0"/>
-                <w:color w:val="000000" w:themeColor="text1"/>
-                <w:sz w:val="24"/>
-                <w:szCs w:val="24"/>
-                <w:u w:val="single"/>
-              </w:rPr>
-              <w:t xml:space="preserve">Emitir certificaciones de puntos de acta.</w:t>
-            </w:r>
-          </w:p>
-        </w:tc>
-      </w:tr>
-      <w:tr>
-        <w:tc>
-          <w:tcPr>
-            <w:tcW w:w="4817" w:type="dxa"/>
-          </w:tcPr>
-          <w:p/>
-        </w:tc>
-        <w:tc>
-          <w:tcPr>
-            <w:tcW w:w="4817" w:type="dxa"/>
-          </w:tcPr>
-          <w:p>
-            <w:pPr>
-              <w:pStyle w:val="Textoindependiente2"/>
-              <w:tabs>
-                <w:tab w:val="left" w:pos="-2880"/>
-              </w:tabs>
-              <w:spacing w:after="120" w:line="276" w:lineRule="auto"/>
-              <w:jc w:val="both"/>
-              <w:rPr>
-                <w:rFonts w:eastAsia="Arial" w:cs="Arial"/>
-                <w:b w:val="0"/>
-                <w:i w:val="0"/>
-                <w:color w:val="000000" w:themeColor="text1"/>
-                <w:sz w:val="24"/>
-                <w:szCs w:val="24"/>
-              </w:rPr>
-            </w:pPr>
-            <w:r>
-              <w:rPr>
-                <w:rFonts w:eastAsia="Arial" w:cs="Arial"/>
-                <w:b w:val="0"/>
-                <w:i w:val="0"/>
-                <w:color w:val="000000" w:themeColor="text1"/>
-                <w:sz w:val="24"/>
-                <w:szCs w:val="24"/>
-                <w:u w:val="single"/>
-              </w:rPr>
-              <w:t xml:space="preserve">Cada miembro del Comité de PLDA/FT/FPADM, tendrá los siguientes deberes y obligaciones:</w:t>
-            </w:r>
-          </w:p>
-        </w:tc>
-      </w:tr>
-      <w:tr>
-        <w:tc>
-          <w:tcPr>
-            <w:tcW w:w="4817" w:type="dxa"/>
-          </w:tcPr>
-          <w:p/>
-        </w:tc>
-        <w:tc>
-          <w:tcPr>
-            <w:tcW w:w="4817" w:type="dxa"/>
-          </w:tcPr>
-          <w:p>
-            <w:pPr>
-              <w:pStyle w:val="Textoindependiente2"/>
-              <w:tabs>
-                <w:tab w:val="left" w:pos="-2880"/>
-              </w:tabs>
-              <w:spacing w:after="120" w:line="276" w:lineRule="auto"/>
-              <w:ind w:left="360" w:hanging="360"/>
-              <w:jc w:val="both"/>
-              <w:rPr>
-                <w:rFonts w:eastAsia="Arial" w:cs="Arial"/>
-                <w:b w:val="0"/>
-                <w:i w:val="0"/>
-                <w:color w:val="000000" w:themeColor="text1"/>
-                <w:sz w:val="24"/>
-                <w:szCs w:val="24"/>
-              </w:rPr>
-            </w:pPr>
-            <w:r>
-              <w:rPr>
-                <w:rFonts w:eastAsia="Arial" w:cs="Arial"/>
-                <w:b w:val="0"/>
-                <w:i w:val="0"/>
-                <w:color w:val="000000" w:themeColor="text1"/>
-                <w:sz w:val="24"/>
-                <w:szCs w:val="24"/>
-                <w:u w:val="none"/>
-              </w:rPr>
-              <w:t xml:space="preserve">a) </w:t>
-            </w:r>
-            <w:r>
-              <w:rPr>
-                <w:rFonts w:eastAsia="Arial" w:cs="Arial"/>
-                <w:b w:val="0"/>
-                <w:i w:val="0"/>
-                <w:color w:val="000000" w:themeColor="text1"/>
-                <w:sz w:val="24"/>
-                <w:szCs w:val="24"/>
-                <w:u w:val="single"/>
-              </w:rPr>
-              <w:t xml:space="preserve">Abstenerse de opinar sobre temas en lo que considere que existe conflicto de interés.</w:t>
-            </w:r>
-          </w:p>
-        </w:tc>
-      </w:tr>
-      <w:tr>
-        <w:tc>
-          <w:tcPr>
-            <w:tcW w:w="4817" w:type="dxa"/>
-          </w:tcPr>
-          <w:p/>
-        </w:tc>
-        <w:tc>
-          <w:tcPr>
-            <w:tcW w:w="4817" w:type="dxa"/>
-          </w:tcPr>
-          <w:p>
-            <w:pPr>
-              <w:pStyle w:val="Textoindependiente2"/>
-              <w:tabs>
-                <w:tab w:val="left" w:pos="-2880"/>
-              </w:tabs>
-              <w:spacing w:after="120" w:line="276" w:lineRule="auto"/>
-              <w:ind w:left="360" w:hanging="360"/>
-              <w:jc w:val="both"/>
-              <w:rPr>
-                <w:rFonts w:eastAsia="Arial" w:cs="Arial"/>
-                <w:b w:val="0"/>
-                <w:i w:val="0"/>
-                <w:color w:val="000000" w:themeColor="text1"/>
-                <w:sz w:val="24"/>
-                <w:szCs w:val="24"/>
-              </w:rPr>
-            </w:pPr>
-            <w:r>
-              <w:rPr>
-                <w:rFonts w:eastAsia="Arial" w:cs="Arial"/>
-                <w:b w:val="0"/>
-                <w:i w:val="0"/>
-                <w:color w:val="000000" w:themeColor="text1"/>
-                <w:sz w:val="24"/>
-                <w:szCs w:val="24"/>
-                <w:u w:val="none"/>
-              </w:rPr>
-              <w:t xml:space="preserve">b) </w:t>
-            </w:r>
-            <w:r>
-              <w:rPr>
-                <w:rFonts w:eastAsia="Arial" w:cs="Arial"/>
-                <w:b w:val="0"/>
-                <w:i w:val="0"/>
-                <w:color w:val="000000" w:themeColor="text1"/>
-                <w:sz w:val="24"/>
-                <w:szCs w:val="24"/>
-                <w:u w:val="single"/>
-              </w:rPr>
-              <w:t xml:space="preserve">Mantenerse debidamente informado respecto a las regulaciones vigentes que rigen los mercados financieros, bancarios y en materia de prevención de lavado de dinero y de activos, financiación del terrorismo y la financiación de la proliferación de armas de destrucción masiva.</w:t>
-            </w:r>
-          </w:p>
-        </w:tc>
-      </w:tr>
-      <w:tr>
-        <w:tc>
-          <w:tcPr>
-            <w:tcW w:w="4817" w:type="dxa"/>
-          </w:tcPr>
-          <w:p/>
-        </w:tc>
-        <w:tc>
-          <w:tcPr>
-            <w:tcW w:w="4817" w:type="dxa"/>
-          </w:tcPr>
-          <w:p>
-            <w:pPr>
-              <w:pStyle w:val="Textoindependiente2"/>
-              <w:tabs>
-                <w:tab w:val="left" w:pos="-2880"/>
-              </w:tabs>
-              <w:spacing w:after="120" w:line="276" w:lineRule="auto"/>
-              <w:ind w:left="360" w:hanging="360"/>
-              <w:jc w:val="both"/>
-              <w:rPr>
-                <w:rFonts w:eastAsia="Arial" w:cs="Arial"/>
-                <w:b w:val="0"/>
-                <w:i w:val="0"/>
-                <w:color w:val="000000" w:themeColor="text1"/>
-                <w:sz w:val="24"/>
-                <w:szCs w:val="24"/>
-              </w:rPr>
-            </w:pPr>
-            <w:r>
-              <w:rPr>
-                <w:rFonts w:eastAsia="Arial" w:cs="Arial"/>
-                <w:b w:val="0"/>
-                <w:i w:val="0"/>
-                <w:color w:val="000000" w:themeColor="text1"/>
-                <w:sz w:val="24"/>
-                <w:szCs w:val="24"/>
-                <w:u w:val="none"/>
-              </w:rPr>
-              <w:t xml:space="preserve">c) </w:t>
-            </w:r>
-            <w:r>
-              <w:rPr>
-                <w:rFonts w:eastAsia="Arial" w:cs="Arial"/>
-                <w:b w:val="0"/>
-                <w:i w:val="0"/>
-                <w:color w:val="000000" w:themeColor="text1"/>
-                <w:sz w:val="24"/>
-                <w:szCs w:val="24"/>
-                <w:u w:val="single"/>
-              </w:rPr>
-              <w:t xml:space="preserve">Abstenerse de utilizar la información que conociera en el ejercicio de sus funciones como miembro del Comité, para obtener beneficio personal o de terceros.</w:t>
-            </w:r>
-          </w:p>
-        </w:tc>
-      </w:tr>
-      <w:tr>
-        <w:tc>
-          <w:tcPr>
-            <w:tcW w:w="4817" w:type="dxa"/>
-          </w:tcPr>
-          <w:p/>
-        </w:tc>
-        <w:tc>
-          <w:tcPr>
-            <w:tcW w:w="4817" w:type="dxa"/>
-          </w:tcPr>
-          <w:p>
-            <w:pPr>
-              <w:pStyle w:val="Textoindependiente2"/>
-              <w:tabs>
-                <w:tab w:val="left" w:pos="-2880"/>
-              </w:tabs>
-              <w:spacing w:after="120" w:line="276" w:lineRule="auto"/>
-              <w:ind w:left="360" w:hanging="360"/>
-              <w:jc w:val="both"/>
-              <w:rPr>
-                <w:rFonts w:eastAsia="Arial" w:cs="Arial"/>
-                <w:b w:val="0"/>
-                <w:i w:val="0"/>
-                <w:color w:val="000000" w:themeColor="text1"/>
-                <w:sz w:val="24"/>
-                <w:szCs w:val="24"/>
-              </w:rPr>
-            </w:pPr>
-            <w:r>
-              <w:rPr>
-                <w:rFonts w:eastAsia="Arial" w:cs="Arial"/>
-                <w:b w:val="0"/>
-                <w:i w:val="0"/>
-                <w:color w:val="000000" w:themeColor="text1"/>
-                <w:sz w:val="24"/>
-                <w:szCs w:val="24"/>
-                <w:u w:val="none"/>
-              </w:rPr>
-              <w:t xml:space="preserve">d) </w:t>
-            </w:r>
-            <w:r>
-              <w:rPr>
-                <w:rFonts w:eastAsia="Arial" w:cs="Arial"/>
-                <w:b w:val="0"/>
-                <w:i w:val="0"/>
-                <w:color w:val="000000" w:themeColor="text1"/>
-                <w:sz w:val="24"/>
-                <w:szCs w:val="24"/>
-                <w:u w:val="single"/>
-              </w:rPr>
-              <w:t xml:space="preserve">Velar por el estricto cumplimiento de los procedimientos establecidos en este reglamento.</w:t>
-            </w:r>
-          </w:p>
-        </w:tc>
-      </w:tr>
-      <w:tr>
-        <w:tc>
-          <w:tcPr>
-            <w:tcW w:w="4817" w:type="dxa"/>
-          </w:tcPr>
-          <w:p/>
-        </w:tc>
-        <w:tc>
-          <w:tcPr>
-            <w:tcW w:w="4817" w:type="dxa"/>
-          </w:tcPr>
-          <w:p>
-            <w:pPr>
-              <w:pStyle w:val="Textoindependiente2"/>
-              <w:tabs>
-                <w:tab w:val="left" w:pos="-2880"/>
-              </w:tabs>
-              <w:spacing w:after="120" w:line="276" w:lineRule="auto"/>
-              <w:ind w:left="360" w:hanging="360"/>
-              <w:jc w:val="both"/>
-              <w:rPr>
-                <w:rFonts w:eastAsia="Arial" w:cs="Arial"/>
-                <w:b w:val="0"/>
-                <w:i w:val="0"/>
-                <w:color w:val="000000" w:themeColor="text1"/>
-                <w:sz w:val="24"/>
-                <w:szCs w:val="24"/>
-              </w:rPr>
-            </w:pPr>
-            <w:r>
-              <w:rPr>
-                <w:rFonts w:eastAsia="Arial" w:cs="Arial"/>
-                <w:b w:val="0"/>
-                <w:i w:val="0"/>
-                <w:color w:val="000000" w:themeColor="text1"/>
-                <w:sz w:val="24"/>
-                <w:szCs w:val="24"/>
-                <w:u w:val="none"/>
-              </w:rPr>
-              <w:t xml:space="preserve">e) </w:t>
-            </w:r>
-            <w:r>
-              <w:rPr>
-                <w:rFonts w:eastAsia="Arial" w:cs="Arial"/>
-                <w:b w:val="0"/>
-                <w:i w:val="0"/>
-                <w:color w:val="000000" w:themeColor="text1"/>
-                <w:sz w:val="24"/>
-                <w:szCs w:val="24"/>
-                <w:u w:val="single"/>
-              </w:rPr>
-              <w:t xml:space="preserve">Emitir sus puntos de vista, sugerencias y hacer las advertencias necesarias en cada caso, pudiendo solicitar que éstos queden asentados en las actas, para dar cumplimiento a las responsabilidades que le impone el marco normativo legal en prevención de LDA/FT/FPADM.</w:t>
+              <w:t xml:space="preserve">El presidente del Comité de PLDA/FT/FPADM tendrá las siguientes funciones:</w:t>
             </w:r>
           </w:p>
         </w:tc>
@@ -25452,12 +24787,21 @@
             <w:pPr>
               <w:pStyle w:val="Default"/>
               <w:spacing w:line="276" w:lineRule="auto"/>
-              <w:jc w:val="both"/>
-              <w:rPr>
-                <w:rFonts w:ascii="Arial" w:hAnsi="Arial" w:cs="Arial"/>
-                <w:color w:val="000000" w:themeColor="text1"/>
-              </w:rPr>
-            </w:pPr>
+              <w:ind w:left="360" w:hanging="360"/>
+              <w:jc w:val="both"/>
+              <w:rPr>
+                <w:rFonts w:ascii="Arial" w:hAnsi="Arial" w:cs="Arial"/>
+                <w:color w:val="000000" w:themeColor="text1"/>
+              </w:rPr>
+            </w:pPr>
+            <w:r>
+              <w:rPr>
+                <w:rFonts w:ascii="Arial" w:hAnsi="Arial" w:cs="Arial"/>
+                <w:color w:val="000000" w:themeColor="text1"/>
+                <w:u w:val="none"/>
+              </w:rPr>
+              <w:t xml:space="preserve">a) </w:t>
+            </w:r>
             <w:r>
               <w:rPr>
                 <w:rFonts w:ascii="Arial" w:hAnsi="Arial" w:cs="Arial"/>
@@ -25468,6 +24812,20 @@
               <w:t xml:space="preserve">El Comité de Gestión sesionará al menos una vez al mes y extraordinariamente cuando las circunstancias lo exijan.</w:t>
             </w:r>
           </w:p>
+        </w:tc>
+        <w:tc>
+          <w:tcPr>
+            <w:tcW w:w="4817" w:type="dxa"/>
+          </w:tcPr>
+          <w:p/>
+        </w:tc>
+      </w:tr>
+      <w:tr>
+        <w:tc>
+          <w:tcPr>
+            <w:tcW w:w="4817" w:type="dxa"/>
+          </w:tcPr>
+          <w:p/>
         </w:tc>
         <w:tc>
           <w:tcPr>

</xml_diff>